<commit_message>
feat(workspace): implement workspace sync with Clerk organizations
- add Inngest function for organization.created to create workspace
- add idempotent upsert logic for workspace creation
- add workspace owner as ADMIN member in WorkspaceMember table
- implement organization.updated event to sync workspace metadata
- implement organization.deleted event to remove workspace
- add organizationMembership.created event to sync workspace members
- ensure retry-safe operations using step.run and upsert
</commit_message>
<xml_diff>
--- a/notes.docx
+++ b/notes.docx
@@ -196,7 +196,6 @@
           <w:szCs w:val="27"/>
         </w:rPr>
       </w:pPr>
-      <w:proofErr w:type="gramStart"/>
       <w:r>
         <w:rPr>
           <w:rFonts w:ascii="Times New Roman" w:eastAsia="Times New Roman" w:hAnsi="Times New Roman" w:cs="Times New Roman"/>
@@ -235,18 +234,7 @@
           <w:sz w:val="27"/>
           <w:szCs w:val="27"/>
         </w:rPr>
-        <w:t>Without</w:t>
-      </w:r>
-      <w:proofErr w:type="gramEnd"/>
-      <w:r>
-        <w:rPr>
-          <w:rFonts w:ascii="Cambria" w:eastAsia="Times New Roman" w:hAnsi="Cambria" w:cs="Times New Roman"/>
-          <w:b/>
-          <w:bCs/>
-          <w:sz w:val="27"/>
-          <w:szCs w:val="27"/>
-        </w:rPr>
-        <w:t xml:space="preserve"> ORM (Raw SQL)</w:t>
+        <w:t>Without ORM (Raw SQL)</w:t>
       </w:r>
     </w:p>
     <w:p>
@@ -539,19 +527,11 @@
         </w:rPr>
         <w:t xml:space="preserve"> </w:t>
       </w:r>
-      <w:proofErr w:type="gramStart"/>
-      <w:r>
-        <w:rPr>
-          <w:rFonts w:ascii="Cambria" w:hAnsi="Cambria"/>
-        </w:rPr>
-        <w:t>With</w:t>
-      </w:r>
-      <w:proofErr w:type="gramEnd"/>
-      <w:r>
-        <w:rPr>
-          <w:rFonts w:ascii="Cambria" w:hAnsi="Cambria"/>
-        </w:rPr>
-        <w:t xml:space="preserve"> ORM</w:t>
+      <w:r>
+        <w:rPr>
+          <w:rFonts w:ascii="Cambria" w:hAnsi="Cambria"/>
+        </w:rPr>
+        <w:t>With ORM</w:t>
       </w:r>
     </w:p>
     <w:p>
@@ -565,7 +545,6 @@
         </w:rPr>
       </w:pPr>
       <w:proofErr w:type="spellStart"/>
-      <w:proofErr w:type="gramStart"/>
       <w:r>
         <w:rPr>
           <w:rStyle w:val="hljs-title"/>
@@ -601,17 +580,7 @@
           <w:color w:val="0070C0"/>
           <w:sz w:val="22"/>
         </w:rPr>
-        <w:t>(</w:t>
-      </w:r>
-      <w:proofErr w:type="gramEnd"/>
-      <w:r>
-        <w:rPr>
-          <w:rStyle w:val="HTMLCode"/>
-          <w:rFonts w:ascii="Cambria" w:hAnsi="Cambria"/>
-          <w:color w:val="0070C0"/>
-          <w:sz w:val="22"/>
-        </w:rPr>
-        <w:t xml:space="preserve">{ </w:t>
+        <w:t xml:space="preserve">({ </w:t>
       </w:r>
       <w:r>
         <w:rPr>
@@ -1204,20 +1173,8 @@
           <w:sz w:val="24"/>
           <w:szCs w:val="24"/>
         </w:rPr>
-        <w:t xml:space="preserve"> uses ODM (Mongoose</w:t>
-      </w:r>
-      <w:proofErr w:type="gramStart"/>
-      <w:r>
-        <w:rPr>
-          <w:rFonts w:ascii="Cambria" w:eastAsia="Times New Roman" w:hAnsi="Cambria" w:cs="Times New Roman"/>
-          <w:b/>
-          <w:bCs/>
-          <w:sz w:val="24"/>
-          <w:szCs w:val="24"/>
-        </w:rPr>
-        <w:t>)</w:t>
-      </w:r>
-      <w:proofErr w:type="gramEnd"/>
+        <w:t xml:space="preserve"> uses ODM (Mongoose)</w:t>
+      </w:r>
       <w:r>
         <w:rPr>
           <w:rFonts w:ascii="Cambria" w:eastAsia="Times New Roman" w:hAnsi="Cambria" w:cs="Times New Roman"/>
@@ -2377,7 +2334,6 @@
           <w:szCs w:val="24"/>
         </w:rPr>
       </w:pPr>
-      <w:proofErr w:type="gramStart"/>
       <w:r>
         <w:rPr>
           <w:rFonts w:ascii="Cambria" w:eastAsia="Times New Roman" w:hAnsi="Cambria" w:cs="Times New Roman"/>
@@ -2386,7 +2342,6 @@
         </w:rPr>
         <w:t>Auto-generated JS/TS client used in backend code.</w:t>
       </w:r>
-      <w:proofErr w:type="gramEnd"/>
     </w:p>
     <w:p>
       <w:pPr>
@@ -2432,7 +2387,6 @@
           <w:color w:val="0070C0"/>
         </w:rPr>
       </w:pPr>
-      <w:proofErr w:type="gramStart"/>
       <w:r>
         <w:rPr>
           <w:rFonts w:ascii="Cambria" w:eastAsia="Times New Roman" w:hAnsi="Cambria" w:cs="Courier New"/>
@@ -2441,7 +2395,6 @@
         </w:rPr>
         <w:t>const</w:t>
       </w:r>
-      <w:proofErr w:type="gramEnd"/>
       <w:r>
         <w:rPr>
           <w:rFonts w:ascii="Cambria" w:eastAsia="Times New Roman" w:hAnsi="Cambria" w:cs="Courier New"/>
@@ -2537,7 +2490,6 @@
         </w:rPr>
         <w:t xml:space="preserve">  </w:t>
       </w:r>
-      <w:proofErr w:type="gramStart"/>
       <w:r>
         <w:rPr>
           <w:rFonts w:ascii="Cambria" w:eastAsia="Times New Roman" w:hAnsi="Cambria" w:cs="Courier New"/>
@@ -2546,7 +2498,6 @@
         </w:rPr>
         <w:t>where</w:t>
       </w:r>
-      <w:proofErr w:type="gramEnd"/>
       <w:r>
         <w:rPr>
           <w:rFonts w:ascii="Cambria" w:eastAsia="Times New Roman" w:hAnsi="Cambria" w:cs="Courier New"/>
@@ -2711,7 +2662,6 @@
         </w:rPr>
       </w:pPr>
       <w:proofErr w:type="spellStart"/>
-      <w:proofErr w:type="gramStart"/>
       <w:r>
         <w:rPr>
           <w:rFonts w:ascii="Cambria" w:eastAsia="Times New Roman" w:hAnsi="Cambria" w:cs="Courier New"/>
@@ -2728,7 +2678,6 @@
         <w:t>px</w:t>
       </w:r>
       <w:proofErr w:type="spellEnd"/>
-      <w:proofErr w:type="gramEnd"/>
       <w:r>
         <w:rPr>
           <w:rFonts w:ascii="Cambria" w:eastAsia="Times New Roman" w:hAnsi="Cambria" w:cs="Courier New"/>
@@ -3379,7 +3328,6 @@
           <w:sz w:val="22"/>
         </w:rPr>
       </w:pPr>
-      <w:proofErr w:type="gramStart"/>
       <w:r>
         <w:rPr>
           <w:rStyle w:val="hljs-keyword"/>
@@ -3389,7 +3337,6 @@
         </w:rPr>
         <w:t>await</w:t>
       </w:r>
-      <w:proofErr w:type="gramEnd"/>
       <w:r>
         <w:rPr>
           <w:rStyle w:val="HTMLCode"/>
@@ -3466,7 +3413,6 @@
         </w:rPr>
         <w:t xml:space="preserve">  </w:t>
       </w:r>
-      <w:proofErr w:type="gramStart"/>
       <w:r>
         <w:rPr>
           <w:rStyle w:val="hljs-attr"/>
@@ -3476,7 +3422,6 @@
         </w:rPr>
         <w:t>data</w:t>
       </w:r>
-      <w:proofErr w:type="gramEnd"/>
       <w:r>
         <w:rPr>
           <w:rStyle w:val="HTMLCode"/>
@@ -3612,7 +3557,6 @@
           <w:sz w:val="22"/>
         </w:rPr>
       </w:pPr>
-      <w:proofErr w:type="gramStart"/>
       <w:r>
         <w:rPr>
           <w:rStyle w:val="hljs-keyword"/>
@@ -3622,7 +3566,6 @@
         </w:rPr>
         <w:t>await</w:t>
       </w:r>
-      <w:proofErr w:type="gramEnd"/>
       <w:r>
         <w:rPr>
           <w:rStyle w:val="HTMLCode"/>
@@ -3706,7 +3649,6 @@
           <w:sz w:val="22"/>
         </w:rPr>
       </w:pPr>
-      <w:proofErr w:type="gramStart"/>
       <w:r>
         <w:rPr>
           <w:rStyle w:val="hljs-keyword"/>
@@ -3716,7 +3658,6 @@
         </w:rPr>
         <w:t>await</w:t>
       </w:r>
-      <w:proofErr w:type="gramEnd"/>
       <w:r>
         <w:rPr>
           <w:rStyle w:val="HTMLCode"/>
@@ -3793,7 +3734,6 @@
         </w:rPr>
         <w:t xml:space="preserve">  </w:t>
       </w:r>
-      <w:proofErr w:type="gramStart"/>
       <w:r>
         <w:rPr>
           <w:rStyle w:val="hljs-attr"/>
@@ -3803,7 +3743,6 @@
         </w:rPr>
         <w:t>where</w:t>
       </w:r>
-      <w:proofErr w:type="gramEnd"/>
       <w:r>
         <w:rPr>
           <w:rStyle w:val="HTMLCode"/>
@@ -3869,7 +3808,6 @@
         </w:rPr>
         <w:t xml:space="preserve">  </w:t>
       </w:r>
-      <w:proofErr w:type="gramStart"/>
       <w:r>
         <w:rPr>
           <w:rStyle w:val="hljs-attr"/>
@@ -3879,7 +3817,6 @@
         </w:rPr>
         <w:t>data</w:t>
       </w:r>
-      <w:proofErr w:type="gramEnd"/>
       <w:r>
         <w:rPr>
           <w:rStyle w:val="HTMLCode"/>
@@ -3970,7 +3907,6 @@
           <w:sz w:val="22"/>
         </w:rPr>
       </w:pPr>
-      <w:proofErr w:type="gramStart"/>
       <w:r>
         <w:rPr>
           <w:rStyle w:val="hljs-keyword"/>
@@ -3980,7 +3916,6 @@
         </w:rPr>
         <w:t>await</w:t>
       </w:r>
-      <w:proofErr w:type="gramEnd"/>
       <w:r>
         <w:rPr>
           <w:rStyle w:val="HTMLCode"/>
@@ -4057,7 +3992,6 @@
         </w:rPr>
         <w:t xml:space="preserve">  </w:t>
       </w:r>
-      <w:proofErr w:type="gramStart"/>
       <w:r>
         <w:rPr>
           <w:rStyle w:val="hljs-attr"/>
@@ -4067,7 +4001,6 @@
         </w:rPr>
         <w:t>where</w:t>
       </w:r>
-      <w:proofErr w:type="gramEnd"/>
       <w:r>
         <w:rPr>
           <w:rStyle w:val="HTMLCode"/>
@@ -4896,16 +4829,8 @@
         <w:rPr>
           <w:rFonts w:ascii="Cambria" w:hAnsi="Cambria"/>
         </w:rPr>
-        <w:t xml:space="preserve"> In simple words</w:t>
-      </w:r>
-      <w:proofErr w:type="gramStart"/>
-      <w:r>
-        <w:rPr>
-          <w:rFonts w:ascii="Cambria" w:hAnsi="Cambria"/>
-        </w:rPr>
-        <w:t>:</w:t>
-      </w:r>
-      <w:proofErr w:type="gramEnd"/>
+        <w:t xml:space="preserve"> In simple words:</w:t>
+      </w:r>
       <w:r>
         <w:rPr>
           <w:rFonts w:ascii="Cambria" w:hAnsi="Cambria"/>
@@ -4963,21 +4888,7 @@
         <w:rPr>
           <w:rFonts w:ascii="Cambria" w:hAnsi="Cambria"/>
         </w:rPr>
-        <w:t xml:space="preserve"> </w:t>
-      </w:r>
-      <w:proofErr w:type="gramStart"/>
-      <w:r>
-        <w:rPr>
-          <w:rFonts w:ascii="Cambria" w:hAnsi="Cambria"/>
-        </w:rPr>
-        <w:t>Without</w:t>
-      </w:r>
-      <w:proofErr w:type="gramEnd"/>
-      <w:r>
-        <w:rPr>
-          <w:rFonts w:ascii="Cambria" w:hAnsi="Cambria"/>
-        </w:rPr>
-        <w:t xml:space="preserve"> Clerk (Manual Auth)</w:t>
+        <w:t xml:space="preserve"> Without Clerk (Manual Auth)</w:t>
       </w:r>
     </w:p>
     <w:p>
@@ -5186,7 +5097,6 @@
         </w:rPr>
         <w:br/>
       </w:r>
-      <w:proofErr w:type="gramStart"/>
       <w:r>
         <w:rPr>
           <w:color w:val="FF0000"/>
@@ -5204,14 +5114,7 @@
         <w:rPr>
           <w:rFonts w:ascii="Cambria" w:hAnsi="Cambria"/>
         </w:rPr>
-        <w:t>Security</w:t>
-      </w:r>
-      <w:proofErr w:type="gramEnd"/>
-      <w:r>
-        <w:rPr>
-          <w:rFonts w:ascii="Cambria" w:hAnsi="Cambria"/>
-        </w:rPr>
-        <w:t xml:space="preserve"> risks</w:t>
+        <w:t>Security risks</w:t>
       </w:r>
     </w:p>
     <w:p>
@@ -5236,7 +5139,6 @@
           <w:rFonts w:ascii="Cambria" w:hAnsi="Cambria"/>
         </w:rPr>
       </w:pPr>
-      <w:proofErr w:type="gramStart"/>
       <w:r>
         <w:t>✅</w:t>
       </w:r>
@@ -5244,14 +5146,7 @@
         <w:rPr>
           <w:rFonts w:ascii="Cambria" w:hAnsi="Cambria"/>
         </w:rPr>
-        <w:t xml:space="preserve">  With</w:t>
-      </w:r>
-      <w:proofErr w:type="gramEnd"/>
-      <w:r>
-        <w:rPr>
-          <w:rFonts w:ascii="Cambria" w:hAnsi="Cambria"/>
-        </w:rPr>
-        <w:t xml:space="preserve"> Clerk</w:t>
+        <w:t xml:space="preserve">  With Clerk</w:t>
       </w:r>
     </w:p>
     <w:p>
@@ -7675,7 +7570,6 @@
           <w:rFonts w:ascii="Cambria" w:hAnsi="Cambria"/>
         </w:rPr>
       </w:pPr>
-      <w:proofErr w:type="gramStart"/>
       <w:r>
         <w:t>✅</w:t>
       </w:r>
@@ -7683,14 +7577,7 @@
         <w:rPr>
           <w:rFonts w:ascii="Cambria" w:hAnsi="Cambria"/>
         </w:rPr>
-        <w:t xml:space="preserve">  Use</w:t>
-      </w:r>
-      <w:proofErr w:type="gramEnd"/>
-      <w:r>
-        <w:rPr>
-          <w:rFonts w:ascii="Cambria" w:hAnsi="Cambria"/>
-        </w:rPr>
-        <w:t xml:space="preserve"> Clerk when:</w:t>
+        <w:t xml:space="preserve">  Use Clerk when:</w:t>
       </w:r>
     </w:p>
     <w:p>
@@ -7802,7 +7689,6 @@
           <w:rFonts w:ascii="Cambria" w:hAnsi="Cambria"/>
         </w:rPr>
       </w:pPr>
-      <w:proofErr w:type="gramStart"/>
       <w:r>
         <w:t>❌</w:t>
       </w:r>
@@ -7810,14 +7696,7 @@
         <w:rPr>
           <w:rFonts w:ascii="Cambria" w:hAnsi="Cambria"/>
         </w:rPr>
-        <w:t xml:space="preserve">  Avoid</w:t>
-      </w:r>
-      <w:proofErr w:type="gramEnd"/>
-      <w:r>
-        <w:rPr>
-          <w:rFonts w:ascii="Cambria" w:hAnsi="Cambria"/>
-        </w:rPr>
-        <w:t xml:space="preserve"> Clerk when:</w:t>
+        <w:t xml:space="preserve">  Avoid Clerk when:</w:t>
       </w:r>
     </w:p>
     <w:p>
@@ -8120,19 +7999,11 @@
           <w:color w:val="0070C0"/>
         </w:rPr>
       </w:pPr>
-      <w:proofErr w:type="gramStart"/>
-      <w:r>
-        <w:rPr>
-          <w:rFonts w:ascii="Cambria" w:hAnsi="Cambria"/>
-        </w:rPr>
-        <w:t>this</w:t>
-      </w:r>
-      <w:proofErr w:type="gramEnd"/>
-      <w:r>
-        <w:rPr>
-          <w:rFonts w:ascii="Cambria" w:hAnsi="Cambria"/>
-        </w:rPr>
-        <w:t xml:space="preserve"> entire app uses authentication</w:t>
+      <w:r>
+        <w:rPr>
+          <w:rFonts w:ascii="Cambria" w:hAnsi="Cambria"/>
+        </w:rPr>
+        <w:t>this entire app uses authentication</w:t>
       </w:r>
     </w:p>
     <w:p>
@@ -8231,14 +8102,12 @@
           <w:rFonts w:ascii="Cambria" w:hAnsi="Cambria"/>
         </w:rPr>
       </w:pPr>
-      <w:proofErr w:type="gramStart"/>
       <w:r>
         <w:rPr>
           <w:rFonts w:ascii="Cambria" w:hAnsi="Cambria"/>
         </w:rPr>
         <w:t>A live network link between your backend app and the database.</w:t>
       </w:r>
-      <w:proofErr w:type="gramEnd"/>
     </w:p>
     <w:p>
       <w:pPr>
@@ -8890,21 +8759,7 @@
         <w:rPr>
           <w:rFonts w:ascii="Cambria" w:hAnsi="Cambria"/>
         </w:rPr>
-        <w:t xml:space="preserve"> “</w:t>
-      </w:r>
-      <w:proofErr w:type="gramStart"/>
-      <w:r>
-        <w:rPr>
-          <w:rFonts w:ascii="Cambria" w:hAnsi="Cambria"/>
-        </w:rPr>
-        <w:t>server</w:t>
-      </w:r>
-      <w:proofErr w:type="gramEnd"/>
-      <w:r>
-        <w:rPr>
-          <w:rFonts w:ascii="Cambria" w:hAnsi="Cambria"/>
-        </w:rPr>
-        <w:t xml:space="preserve"> stays alive, so DB connections are reused.”</w:t>
+        <w:t xml:space="preserve"> “server stays alive, so DB connections are reused.”</w:t>
       </w:r>
     </w:p>
     <w:p>
@@ -9947,29 +9802,7 @@
           <w:sz w:val="36"/>
           <w:szCs w:val="36"/>
         </w:rPr>
-        <w:t xml:space="preserve">Connection String — </w:t>
-      </w:r>
-      <w:proofErr w:type="gramStart"/>
-      <w:r>
-        <w:rPr>
-          <w:rFonts w:ascii="Cambria" w:eastAsia="Times New Roman" w:hAnsi="Cambria" w:cs="Times New Roman"/>
-          <w:b/>
-          <w:bCs/>
-          <w:sz w:val="36"/>
-          <w:szCs w:val="36"/>
-        </w:rPr>
-        <w:t>Why</w:t>
-      </w:r>
-      <w:proofErr w:type="gramEnd"/>
-      <w:r>
-        <w:rPr>
-          <w:rFonts w:ascii="Cambria" w:eastAsia="Times New Roman" w:hAnsi="Cambria" w:cs="Times New Roman"/>
-          <w:b/>
-          <w:bCs/>
-          <w:sz w:val="36"/>
-          <w:szCs w:val="36"/>
-        </w:rPr>
-        <w:t xml:space="preserve"> it Matters So Much</w:t>
+        <w:t>Connection String — Why it Matters So Much</w:t>
       </w:r>
     </w:p>
     <w:p>
@@ -11060,7 +10893,6 @@
           <w:szCs w:val="27"/>
         </w:rPr>
       </w:pPr>
-      <w:proofErr w:type="gramStart"/>
       <w:r>
         <w:rPr>
           <w:rFonts w:ascii="Times New Roman" w:eastAsia="Times New Roman" w:hAnsi="Times New Roman" w:cs="Times New Roman"/>
@@ -11079,18 +10911,7 @@
           <w:sz w:val="27"/>
           <w:szCs w:val="27"/>
         </w:rPr>
-        <w:t xml:space="preserve">  BAD</w:t>
-      </w:r>
-      <w:proofErr w:type="gramEnd"/>
-      <w:r>
-        <w:rPr>
-          <w:rFonts w:ascii="Cambria" w:eastAsia="Times New Roman" w:hAnsi="Cambria" w:cs="Times New Roman"/>
-          <w:b/>
-          <w:bCs/>
-          <w:sz w:val="27"/>
-          <w:szCs w:val="27"/>
-        </w:rPr>
-        <w:t xml:space="preserve"> (</w:t>
+        <w:t xml:space="preserve">  BAD (</w:t>
       </w:r>
       <w:proofErr w:type="spellStart"/>
       <w:r>
@@ -11141,7 +10962,6 @@
           <w:color w:val="0070C0"/>
         </w:rPr>
       </w:pPr>
-      <w:proofErr w:type="gramStart"/>
       <w:r>
         <w:rPr>
           <w:rFonts w:ascii="Cambria" w:eastAsia="Times New Roman" w:hAnsi="Cambria" w:cs="Courier New"/>
@@ -11150,7 +10970,6 @@
         </w:rPr>
         <w:t>const</w:t>
       </w:r>
-      <w:proofErr w:type="gramEnd"/>
       <w:r>
         <w:rPr>
           <w:rFonts w:ascii="Cambria" w:eastAsia="Times New Roman" w:hAnsi="Cambria" w:cs="Courier New"/>
@@ -11219,7 +11038,6 @@
           <w:szCs w:val="27"/>
         </w:rPr>
       </w:pPr>
-      <w:proofErr w:type="gramStart"/>
       <w:r>
         <w:rPr>
           <w:rFonts w:ascii="Times New Roman" w:eastAsia="Times New Roman" w:hAnsi="Times New Roman" w:cs="Times New Roman"/>
@@ -11238,18 +11056,7 @@
           <w:sz w:val="27"/>
           <w:szCs w:val="27"/>
         </w:rPr>
-        <w:t xml:space="preserve">  GOOD</w:t>
-      </w:r>
-      <w:proofErr w:type="gramEnd"/>
-      <w:r>
-        <w:rPr>
-          <w:rFonts w:ascii="Cambria" w:eastAsia="Times New Roman" w:hAnsi="Cambria" w:cs="Times New Roman"/>
-          <w:b/>
-          <w:bCs/>
-          <w:sz w:val="27"/>
-          <w:szCs w:val="27"/>
-        </w:rPr>
-        <w:t xml:space="preserve"> (</w:t>
+        <w:t xml:space="preserve">  GOOD (</w:t>
       </w:r>
       <w:proofErr w:type="spellStart"/>
       <w:r>
@@ -11300,7 +11107,6 @@
           <w:color w:val="0070C0"/>
         </w:rPr>
       </w:pPr>
-      <w:proofErr w:type="gramStart"/>
       <w:r>
         <w:rPr>
           <w:rFonts w:ascii="Cambria" w:eastAsia="Times New Roman" w:hAnsi="Cambria" w:cs="Courier New"/>
@@ -11309,7 +11115,6 @@
         </w:rPr>
         <w:t>const</w:t>
       </w:r>
-      <w:proofErr w:type="gramEnd"/>
       <w:r>
         <w:rPr>
           <w:rFonts w:ascii="Cambria" w:eastAsia="Times New Roman" w:hAnsi="Cambria" w:cs="Courier New"/>
@@ -12695,19 +12500,11 @@
           <w:rFonts w:ascii="Cambria" w:hAnsi="Cambria"/>
         </w:rPr>
       </w:pPr>
-      <w:proofErr w:type="gramStart"/>
-      <w:r>
-        <w:rPr>
-          <w:rFonts w:ascii="Cambria" w:hAnsi="Cambria"/>
-        </w:rPr>
-        <w:t>insight</w:t>
-      </w:r>
-      <w:proofErr w:type="gramEnd"/>
-      <w:r>
-        <w:rPr>
-          <w:rFonts w:ascii="Cambria" w:hAnsi="Cambria"/>
-        </w:rPr>
-        <w:t>:</w:t>
+      <w:r>
+        <w:rPr>
+          <w:rFonts w:ascii="Cambria" w:hAnsi="Cambria"/>
+        </w:rPr>
+        <w:t>insight:</w:t>
       </w:r>
     </w:p>
     <w:p>
@@ -13687,19 +13484,8 @@
           <w:sz w:val="24"/>
           <w:szCs w:val="24"/>
         </w:rPr>
-        <w:t>Summary</w:t>
-      </w:r>
-      <w:proofErr w:type="gramStart"/>
-      <w:r>
-        <w:rPr>
-          <w:rFonts w:ascii="Cambria" w:eastAsia="Times New Roman" w:hAnsi="Cambria" w:cs="Times New Roman"/>
-          <w:b/>
-          <w:sz w:val="24"/>
-          <w:szCs w:val="24"/>
-        </w:rPr>
-        <w:t>:</w:t>
-      </w:r>
-      <w:proofErr w:type="gramEnd"/>
+        <w:t>Summary:</w:t>
+      </w:r>
       <w:r>
         <w:rPr>
           <w:rFonts w:ascii="Cambria" w:eastAsia="Times New Roman" w:hAnsi="Cambria" w:cs="Times New Roman"/>
@@ -13832,7 +13618,6 @@
         <w:t xml:space="preserve">What is </w:t>
       </w:r>
       <w:proofErr w:type="spellStart"/>
-      <w:proofErr w:type="gramStart"/>
       <w:r>
         <w:rPr>
           <w:rFonts w:ascii="Cambria" w:eastAsia="Times New Roman" w:hAnsi="Cambria" w:cs="Courier New"/>
@@ -13865,7 +13650,6 @@
         </w:rPr>
         <w:t>?</w:t>
       </w:r>
-      <w:proofErr w:type="gramEnd"/>
     </w:p>
     <w:p>
       <w:pPr>
@@ -13877,7 +13661,6 @@
         </w:rPr>
       </w:pPr>
       <w:proofErr w:type="spellStart"/>
-      <w:proofErr w:type="gramStart"/>
       <w:r>
         <w:rPr>
           <w:rFonts w:ascii="Cambria" w:eastAsia="Times New Roman" w:hAnsi="Cambria" w:cs="Courier New"/>
@@ -13886,7 +13669,6 @@
         <w:t>schema.prisma</w:t>
       </w:r>
       <w:proofErr w:type="spellEnd"/>
-      <w:proofErr w:type="gramEnd"/>
       <w:r>
         <w:rPr>
           <w:rFonts w:ascii="Cambria" w:eastAsia="Times New Roman" w:hAnsi="Cambria" w:cs="Times New Roman"/>
@@ -14037,17 +13819,8 @@
           <w:rFonts w:ascii="Cambria" w:eastAsia="Times New Roman" w:hAnsi="Cambria" w:cs="Times New Roman"/>
           <w:szCs w:val="24"/>
         </w:rPr>
-        <w:t xml:space="preserve"> between</w:t>
-      </w:r>
-      <w:proofErr w:type="gramStart"/>
-      <w:r>
-        <w:rPr>
-          <w:rFonts w:ascii="Cambria" w:eastAsia="Times New Roman" w:hAnsi="Cambria" w:cs="Times New Roman"/>
-          <w:szCs w:val="24"/>
-        </w:rPr>
-        <w:t>:</w:t>
-      </w:r>
-      <w:proofErr w:type="gramEnd"/>
+        <w:t xml:space="preserve"> between:</w:t>
+      </w:r>
       <w:r>
         <w:rPr>
           <w:rFonts w:ascii="Cambria" w:eastAsia="Times New Roman" w:hAnsi="Cambria" w:cs="Times New Roman"/>
@@ -14531,9 +14304,19 @@
           <w:sz w:val="36"/>
           <w:szCs w:val="36"/>
         </w:rPr>
-        <w:t xml:space="preserve">What Problems </w:t>
-      </w:r>
-      <w:proofErr w:type="gramStart"/>
+        <w:t xml:space="preserve">What Problems Does </w:t>
+      </w:r>
+      <w:proofErr w:type="spellStart"/>
+      <w:r>
+        <w:rPr>
+          <w:rFonts w:ascii="Cambria" w:eastAsia="Times New Roman" w:hAnsi="Cambria" w:cs="Courier New"/>
+          <w:b/>
+          <w:bCs/>
+          <w:sz w:val="20"/>
+        </w:rPr>
+        <w:t>schema.prisma</w:t>
+      </w:r>
+      <w:proofErr w:type="spellEnd"/>
       <w:r>
         <w:rPr>
           <w:rFonts w:ascii="Cambria" w:eastAsia="Times New Roman" w:hAnsi="Cambria" w:cs="Times New Roman"/>
@@ -14542,38 +14325,6 @@
           <w:sz w:val="36"/>
           <w:szCs w:val="36"/>
         </w:rPr>
-        <w:t>Does</w:t>
-      </w:r>
-      <w:proofErr w:type="gramEnd"/>
-      <w:r>
-        <w:rPr>
-          <w:rFonts w:ascii="Cambria" w:eastAsia="Times New Roman" w:hAnsi="Cambria" w:cs="Times New Roman"/>
-          <w:b/>
-          <w:bCs/>
-          <w:sz w:val="36"/>
-          <w:szCs w:val="36"/>
-        </w:rPr>
-        <w:t xml:space="preserve"> </w:t>
-      </w:r>
-      <w:proofErr w:type="spellStart"/>
-      <w:r>
-        <w:rPr>
-          <w:rFonts w:ascii="Cambria" w:eastAsia="Times New Roman" w:hAnsi="Cambria" w:cs="Courier New"/>
-          <w:b/>
-          <w:bCs/>
-          <w:sz w:val="20"/>
-        </w:rPr>
-        <w:t>schema.prisma</w:t>
-      </w:r>
-      <w:proofErr w:type="spellEnd"/>
-      <w:r>
-        <w:rPr>
-          <w:rFonts w:ascii="Cambria" w:eastAsia="Times New Roman" w:hAnsi="Cambria" w:cs="Times New Roman"/>
-          <w:b/>
-          <w:bCs/>
-          <w:sz w:val="36"/>
-          <w:szCs w:val="36"/>
-        </w:rPr>
         <w:t xml:space="preserve"> Solve?</w:t>
       </w:r>
     </w:p>
@@ -14589,7 +14340,6 @@
           <w:szCs w:val="27"/>
         </w:rPr>
       </w:pPr>
-      <w:proofErr w:type="gramStart"/>
       <w:r>
         <w:rPr>
           <w:rFonts w:ascii="Times New Roman" w:eastAsia="Times New Roman" w:hAnsi="Times New Roman" w:cs="Times New Roman"/>
@@ -14608,18 +14358,7 @@
           <w:sz w:val="27"/>
           <w:szCs w:val="27"/>
         </w:rPr>
-        <w:t xml:space="preserve">  Without</w:t>
-      </w:r>
-      <w:proofErr w:type="gramEnd"/>
-      <w:r>
-        <w:rPr>
-          <w:rFonts w:ascii="Cambria" w:eastAsia="Times New Roman" w:hAnsi="Cambria" w:cs="Times New Roman"/>
-          <w:b/>
-          <w:bCs/>
-          <w:sz w:val="27"/>
-          <w:szCs w:val="27"/>
-        </w:rPr>
-        <w:t xml:space="preserve"> a Schema File</w:t>
+        <w:t xml:space="preserve">  Without a Schema File</w:t>
       </w:r>
     </w:p>
     <w:p>
@@ -14745,7 +14484,6 @@
           <w:szCs w:val="27"/>
         </w:rPr>
       </w:pPr>
-      <w:proofErr w:type="gramStart"/>
       <w:r>
         <w:rPr>
           <w:rFonts w:ascii="Times New Roman" w:eastAsia="Times New Roman" w:hAnsi="Times New Roman" w:cs="Times New Roman"/>
@@ -14764,18 +14502,7 @@
           <w:sz w:val="27"/>
           <w:szCs w:val="27"/>
         </w:rPr>
-        <w:t xml:space="preserve">  With</w:t>
-      </w:r>
-      <w:proofErr w:type="gramEnd"/>
-      <w:r>
-        <w:rPr>
-          <w:rFonts w:ascii="Cambria" w:eastAsia="Times New Roman" w:hAnsi="Cambria" w:cs="Times New Roman"/>
-          <w:b/>
-          <w:bCs/>
-          <w:sz w:val="27"/>
-          <w:szCs w:val="27"/>
-        </w:rPr>
-        <w:t xml:space="preserve"> </w:t>
+        <w:t xml:space="preserve">  With </w:t>
       </w:r>
       <w:proofErr w:type="spellStart"/>
       <w:r>
@@ -15008,7 +14735,6 @@
         </w:rPr>
       </w:pPr>
       <w:proofErr w:type="spellStart"/>
-      <w:proofErr w:type="gramStart"/>
       <w:r>
         <w:rPr>
           <w:rFonts w:ascii="Cambria" w:eastAsia="Times New Roman" w:hAnsi="Cambria" w:cs="Times New Roman"/>
@@ -15019,7 +14745,6 @@
         <w:t>datasource</w:t>
       </w:r>
       <w:proofErr w:type="spellEnd"/>
-      <w:proofErr w:type="gramEnd"/>
       <w:r>
         <w:rPr>
           <w:rFonts w:ascii="Cambria" w:eastAsia="Times New Roman" w:hAnsi="Cambria" w:cs="Times New Roman"/>
@@ -15047,9 +14772,9 @@
           <w:color w:val="0070C0"/>
           <w:szCs w:val="24"/>
         </w:rPr>
-        <w:t xml:space="preserve">  </w:t>
-      </w:r>
-      <w:proofErr w:type="gramStart"/>
+        <w:t xml:space="preserve">  provider = "</w:t>
+      </w:r>
+      <w:proofErr w:type="spellStart"/>
       <w:r>
         <w:rPr>
           <w:rFonts w:ascii="Cambria" w:eastAsia="Times New Roman" w:hAnsi="Cambria" w:cs="Times New Roman"/>
@@ -15057,9 +14782,9 @@
           <w:color w:val="0070C0"/>
           <w:szCs w:val="24"/>
         </w:rPr>
-        <w:t>provider</w:t>
-      </w:r>
-      <w:proofErr w:type="gramEnd"/>
+        <w:t>postgresql</w:t>
+      </w:r>
+      <w:proofErr w:type="spellEnd"/>
       <w:r>
         <w:rPr>
           <w:rFonts w:ascii="Cambria" w:eastAsia="Times New Roman" w:hAnsi="Cambria" w:cs="Times New Roman"/>
@@ -15067,19 +14792,19 @@
           <w:color w:val="0070C0"/>
           <w:szCs w:val="24"/>
         </w:rPr>
-        <w:t xml:space="preserve"> = "</w:t>
-      </w:r>
-      <w:proofErr w:type="spellStart"/>
-      <w:r>
+        <w:t>"</w:t>
+      </w:r>
+    </w:p>
+    <w:p>
+      <w:pPr>
+        <w:spacing w:before="100" w:beforeAutospacing="1" w:after="100" w:afterAutospacing="1" w:line="240" w:lineRule="auto"/>
         <w:rPr>
           <w:rFonts w:ascii="Cambria" w:eastAsia="Times New Roman" w:hAnsi="Cambria" w:cs="Times New Roman"/>
           <w:bCs/>
           <w:color w:val="0070C0"/>
           <w:szCs w:val="24"/>
         </w:rPr>
-        <w:t>postgresql</w:t>
-      </w:r>
-      <w:proofErr w:type="spellEnd"/>
+      </w:pPr>
       <w:r>
         <w:rPr>
           <w:rFonts w:ascii="Cambria" w:eastAsia="Times New Roman" w:hAnsi="Cambria" w:cs="Times New Roman"/>
@@ -15087,41 +14812,19 @@
           <w:color w:val="0070C0"/>
           <w:szCs w:val="24"/>
         </w:rPr>
-        <w:t>"</w:t>
-      </w:r>
-    </w:p>
-    <w:p>
-      <w:pPr>
-        <w:spacing w:before="100" w:beforeAutospacing="1" w:after="100" w:afterAutospacing="1" w:line="240" w:lineRule="auto"/>
+        <w:t xml:space="preserve">  </w:t>
+      </w:r>
+      <w:proofErr w:type="spellStart"/>
+      <w:r>
         <w:rPr>
           <w:rFonts w:ascii="Cambria" w:eastAsia="Times New Roman" w:hAnsi="Cambria" w:cs="Times New Roman"/>
           <w:bCs/>
           <w:color w:val="0070C0"/>
           <w:szCs w:val="24"/>
         </w:rPr>
-      </w:pPr>
-      <w:r>
-        <w:rPr>
-          <w:rFonts w:ascii="Cambria" w:eastAsia="Times New Roman" w:hAnsi="Cambria" w:cs="Times New Roman"/>
-          <w:bCs/>
-          <w:color w:val="0070C0"/>
-          <w:szCs w:val="24"/>
-        </w:rPr>
-        <w:t xml:space="preserve">  </w:t>
-      </w:r>
-      <w:proofErr w:type="spellStart"/>
-      <w:proofErr w:type="gramStart"/>
-      <w:r>
-        <w:rPr>
-          <w:rFonts w:ascii="Cambria" w:eastAsia="Times New Roman" w:hAnsi="Cambria" w:cs="Times New Roman"/>
-          <w:bCs/>
-          <w:color w:val="0070C0"/>
-          <w:szCs w:val="24"/>
-        </w:rPr>
         <w:t>url</w:t>
       </w:r>
       <w:proofErr w:type="spellEnd"/>
-      <w:proofErr w:type="gramEnd"/>
       <w:r>
         <w:rPr>
           <w:rFonts w:ascii="Cambria" w:eastAsia="Times New Roman" w:hAnsi="Cambria" w:cs="Times New Roman"/>
@@ -15209,19 +14912,11 @@
           <w:rFonts w:ascii="Cambria" w:hAnsi="Cambria"/>
         </w:rPr>
       </w:pPr>
-      <w:proofErr w:type="gramStart"/>
-      <w:r>
-        <w:rPr>
-          <w:rFonts w:ascii="Cambria" w:hAnsi="Cambria"/>
-        </w:rPr>
-        <w:t>2.Generator</w:t>
-      </w:r>
-      <w:proofErr w:type="gramEnd"/>
-      <w:r>
-        <w:rPr>
-          <w:rFonts w:ascii="Cambria" w:hAnsi="Cambria"/>
-        </w:rPr>
-        <w:t xml:space="preserve"> (Client Creation)</w:t>
+      <w:r>
+        <w:rPr>
+          <w:rFonts w:ascii="Cambria" w:hAnsi="Cambria"/>
+        </w:rPr>
+        <w:t>2.Generator (Client Creation)</w:t>
       </w:r>
     </w:p>
     <w:p>
@@ -15234,7 +14929,6 @@
           <w:sz w:val="22"/>
         </w:rPr>
       </w:pPr>
-      <w:proofErr w:type="gramStart"/>
       <w:r>
         <w:rPr>
           <w:rStyle w:val="HTMLCode"/>
@@ -15242,29 +14936,29 @@
           <w:color w:val="0070C0"/>
           <w:sz w:val="22"/>
         </w:rPr>
-        <w:t>generator</w:t>
-      </w:r>
-      <w:proofErr w:type="gramEnd"/>
-      <w:r>
+        <w:t>generator client {</w:t>
+      </w:r>
+    </w:p>
+    <w:p>
+      <w:pPr>
+        <w:pStyle w:val="HTMLPreformatted"/>
         <w:rPr>
           <w:rStyle w:val="HTMLCode"/>
           <w:rFonts w:ascii="Cambria" w:hAnsi="Cambria"/>
           <w:color w:val="0070C0"/>
           <w:sz w:val="22"/>
         </w:rPr>
-        <w:t xml:space="preserve"> client {</w:t>
-      </w:r>
-    </w:p>
-    <w:p>
-      <w:pPr>
-        <w:pStyle w:val="HTMLPreformatted"/>
+      </w:pPr>
+      <w:r>
         <w:rPr>
           <w:rStyle w:val="HTMLCode"/>
           <w:rFonts w:ascii="Cambria" w:hAnsi="Cambria"/>
           <w:color w:val="0070C0"/>
           <w:sz w:val="22"/>
         </w:rPr>
-      </w:pPr>
+        <w:t xml:space="preserve">  provider = "</w:t>
+      </w:r>
+      <w:proofErr w:type="spellStart"/>
       <w:r>
         <w:rPr>
           <w:rStyle w:val="HTMLCode"/>
@@ -15272,9 +14966,9 @@
           <w:color w:val="0070C0"/>
           <w:sz w:val="22"/>
         </w:rPr>
-        <w:t xml:space="preserve">  </w:t>
-      </w:r>
-      <w:proofErr w:type="gramStart"/>
+        <w:t>prisma</w:t>
+      </w:r>
+      <w:proofErr w:type="spellEnd"/>
       <w:r>
         <w:rPr>
           <w:rStyle w:val="HTMLCode"/>
@@ -15282,9 +14976,9 @@
           <w:color w:val="0070C0"/>
           <w:sz w:val="22"/>
         </w:rPr>
-        <w:t>provider</w:t>
-      </w:r>
-      <w:proofErr w:type="gramEnd"/>
+        <w:t>-client-</w:t>
+      </w:r>
+      <w:proofErr w:type="spellStart"/>
       <w:r>
         <w:rPr>
           <w:rStyle w:val="HTMLCode"/>
@@ -15292,9 +14986,9 @@
           <w:color w:val="0070C0"/>
           <w:sz w:val="22"/>
         </w:rPr>
-        <w:t xml:space="preserve"> = "</w:t>
-      </w:r>
-      <w:proofErr w:type="spellStart"/>
+        <w:t>js</w:t>
+      </w:r>
+      <w:proofErr w:type="spellEnd"/>
       <w:r>
         <w:rPr>
           <w:rStyle w:val="HTMLCode"/>
@@ -15302,19 +14996,19 @@
           <w:color w:val="0070C0"/>
           <w:sz w:val="22"/>
         </w:rPr>
-        <w:t>prisma</w:t>
-      </w:r>
-      <w:proofErr w:type="spellEnd"/>
-      <w:r>
+        <w:t>"</w:t>
+      </w:r>
+    </w:p>
+    <w:p>
+      <w:pPr>
+        <w:pStyle w:val="HTMLPreformatted"/>
         <w:rPr>
           <w:rStyle w:val="HTMLCode"/>
           <w:rFonts w:ascii="Cambria" w:hAnsi="Cambria"/>
           <w:color w:val="0070C0"/>
           <w:sz w:val="22"/>
         </w:rPr>
-        <w:t>-client-</w:t>
-      </w:r>
-      <w:proofErr w:type="spellStart"/>
+      </w:pPr>
       <w:r>
         <w:rPr>
           <w:rStyle w:val="HTMLCode"/>
@@ -15322,122 +15016,121 @@
           <w:color w:val="0070C0"/>
           <w:sz w:val="22"/>
         </w:rPr>
-        <w:t>js</w:t>
+        <w:t>}</w:t>
+      </w:r>
+    </w:p>
+    <w:p>
+      <w:pPr>
+        <w:pStyle w:val="NormalWeb"/>
+        <w:rPr>
+          <w:rFonts w:ascii="Cambria" w:hAnsi="Cambria"/>
+        </w:rPr>
+      </w:pPr>
+      <w:r>
+        <w:rPr>
+          <w:rFonts w:ascii="Cambria" w:hAnsi="Cambria"/>
+        </w:rPr>
+        <w:t xml:space="preserve">Tells </w:t>
+      </w:r>
+      <w:proofErr w:type="spellStart"/>
+      <w:r>
+        <w:rPr>
+          <w:rFonts w:ascii="Cambria" w:hAnsi="Cambria"/>
+        </w:rPr>
+        <w:t>Prisma</w:t>
       </w:r>
       <w:proofErr w:type="spellEnd"/>
       <w:r>
+        <w:rPr>
+          <w:rFonts w:ascii="Cambria" w:hAnsi="Cambria"/>
+        </w:rPr>
+        <w:t>:</w:t>
+      </w:r>
+    </w:p>
+    <w:p>
+      <w:pPr>
+        <w:pStyle w:val="NormalWeb"/>
+        <w:rPr>
+          <w:rFonts w:ascii="Cambria" w:hAnsi="Cambria"/>
+        </w:rPr>
+      </w:pPr>
+      <w:r>
+        <w:rPr>
+          <w:rFonts w:ascii="Cambria" w:hAnsi="Cambria"/>
+        </w:rPr>
+        <w:t>“Generate a JS/TS client for my app”</w:t>
+      </w:r>
+    </w:p>
+    <w:p>
+      <w:pPr>
+        <w:pStyle w:val="Heading3"/>
+        <w:rPr>
+          <w:rFonts w:ascii="Cambria" w:hAnsi="Cambria"/>
+        </w:rPr>
+      </w:pPr>
+    </w:p>
+    <w:p>
+      <w:pPr>
+        <w:pStyle w:val="Heading3"/>
+        <w:rPr>
+          <w:rFonts w:ascii="Cambria" w:hAnsi="Cambria"/>
+        </w:rPr>
+      </w:pPr>
+    </w:p>
+    <w:p>
+      <w:pPr>
+        <w:pStyle w:val="Heading3"/>
+        <w:rPr>
+          <w:rFonts w:ascii="Cambria" w:hAnsi="Cambria"/>
+        </w:rPr>
+      </w:pPr>
+      <w:r>
+        <w:rPr>
+          <w:rFonts w:ascii="Cambria" w:hAnsi="Cambria"/>
+        </w:rPr>
+        <w:t>3. Models (Tables)</w:t>
+      </w:r>
+    </w:p>
+    <w:p>
+      <w:pPr>
+        <w:pStyle w:val="HTMLPreformatted"/>
         <w:rPr>
           <w:rStyle w:val="HTMLCode"/>
           <w:rFonts w:ascii="Cambria" w:hAnsi="Cambria"/>
           <w:color w:val="0070C0"/>
           <w:sz w:val="22"/>
         </w:rPr>
-        <w:t>"</w:t>
-      </w:r>
-    </w:p>
-    <w:p>
-      <w:pPr>
-        <w:pStyle w:val="HTMLPreformatted"/>
+      </w:pPr>
+      <w:r>
         <w:rPr>
           <w:rStyle w:val="HTMLCode"/>
           <w:rFonts w:ascii="Cambria" w:hAnsi="Cambria"/>
           <w:color w:val="0070C0"/>
           <w:sz w:val="22"/>
         </w:rPr>
-      </w:pPr>
-      <w:r>
+        <w:t>model User {</w:t>
+      </w:r>
+    </w:p>
+    <w:p>
+      <w:pPr>
+        <w:pStyle w:val="HTMLPreformatted"/>
         <w:rPr>
           <w:rStyle w:val="HTMLCode"/>
           <w:rFonts w:ascii="Cambria" w:hAnsi="Cambria"/>
           <w:color w:val="0070C0"/>
           <w:sz w:val="22"/>
         </w:rPr>
-        <w:t>}</w:t>
-      </w:r>
-    </w:p>
-    <w:p>
-      <w:pPr>
-        <w:pStyle w:val="NormalWeb"/>
-        <w:rPr>
-          <w:rFonts w:ascii="Cambria" w:hAnsi="Cambria"/>
-        </w:rPr>
-      </w:pPr>
-      <w:r>
-        <w:rPr>
-          <w:rFonts w:ascii="Cambria" w:hAnsi="Cambria"/>
-        </w:rPr>
-        <w:t xml:space="preserve">Tells </w:t>
-      </w:r>
-      <w:proofErr w:type="spellStart"/>
-      <w:r>
-        <w:rPr>
-          <w:rFonts w:ascii="Cambria" w:hAnsi="Cambria"/>
-        </w:rPr>
-        <w:t>Prisma</w:t>
-      </w:r>
-      <w:proofErr w:type="spellEnd"/>
-      <w:r>
-        <w:rPr>
-          <w:rFonts w:ascii="Cambria" w:hAnsi="Cambria"/>
-        </w:rPr>
-        <w:t>:</w:t>
-      </w:r>
-    </w:p>
-    <w:p>
-      <w:pPr>
-        <w:pStyle w:val="NormalWeb"/>
-        <w:rPr>
-          <w:rFonts w:ascii="Cambria" w:hAnsi="Cambria"/>
-        </w:rPr>
-      </w:pPr>
-      <w:r>
-        <w:rPr>
-          <w:rFonts w:ascii="Cambria" w:hAnsi="Cambria"/>
-        </w:rPr>
-        <w:t>“Generate a JS/TS client for my app”</w:t>
-      </w:r>
-    </w:p>
-    <w:p>
-      <w:pPr>
-        <w:pStyle w:val="Heading3"/>
-        <w:rPr>
-          <w:rFonts w:ascii="Cambria" w:hAnsi="Cambria"/>
-        </w:rPr>
-      </w:pPr>
-    </w:p>
-    <w:p>
-      <w:pPr>
-        <w:pStyle w:val="Heading3"/>
-        <w:rPr>
-          <w:rFonts w:ascii="Cambria" w:hAnsi="Cambria"/>
-        </w:rPr>
-      </w:pPr>
-    </w:p>
-    <w:p>
-      <w:pPr>
-        <w:pStyle w:val="Heading3"/>
-        <w:rPr>
-          <w:rFonts w:ascii="Cambria" w:hAnsi="Cambria"/>
-        </w:rPr>
-      </w:pPr>
-      <w:r>
-        <w:rPr>
-          <w:rFonts w:ascii="Cambria" w:hAnsi="Cambria"/>
-        </w:rPr>
-        <w:t>3. Models (Tables)</w:t>
-      </w:r>
-    </w:p>
-    <w:p>
-      <w:pPr>
-        <w:pStyle w:val="HTMLPreformatted"/>
+      </w:pPr>
+      <w:r>
         <w:rPr>
           <w:rStyle w:val="HTMLCode"/>
           <w:rFonts w:ascii="Cambria" w:hAnsi="Cambria"/>
           <w:color w:val="0070C0"/>
           <w:sz w:val="22"/>
         </w:rPr>
-      </w:pPr>
-      <w:proofErr w:type="gramStart"/>
+        <w:t xml:space="preserve">  id    </w:t>
+      </w:r>
+      <w:proofErr w:type="spellStart"/>
       <w:r>
         <w:rPr>
           <w:rStyle w:val="HTMLCode"/>
@@ -15445,9 +15138,9 @@
           <w:color w:val="0070C0"/>
           <w:sz w:val="22"/>
         </w:rPr>
-        <w:t>model</w:t>
-      </w:r>
-      <w:proofErr w:type="gramEnd"/>
+        <w:t>Int</w:t>
+      </w:r>
+      <w:proofErr w:type="spellEnd"/>
       <w:r>
         <w:rPr>
           <w:rStyle w:val="HTMLCode"/>
@@ -15455,19 +15148,19 @@
           <w:color w:val="0070C0"/>
           <w:sz w:val="22"/>
         </w:rPr>
-        <w:t xml:space="preserve"> User {</w:t>
-      </w:r>
-    </w:p>
-    <w:p>
-      <w:pPr>
-        <w:pStyle w:val="HTMLPreformatted"/>
+        <w:t xml:space="preserve">    @id @default(</w:t>
+      </w:r>
+      <w:proofErr w:type="spellStart"/>
+      <w:r>
         <w:rPr>
           <w:rStyle w:val="HTMLCode"/>
           <w:rFonts w:ascii="Cambria" w:hAnsi="Cambria"/>
           <w:color w:val="0070C0"/>
           <w:sz w:val="22"/>
         </w:rPr>
-      </w:pPr>
+        <w:t>autoincrement</w:t>
+      </w:r>
+      <w:proofErr w:type="spellEnd"/>
       <w:r>
         <w:rPr>
           <w:rStyle w:val="HTMLCode"/>
@@ -15475,19 +15168,19 @@
           <w:color w:val="0070C0"/>
           <w:sz w:val="22"/>
         </w:rPr>
-        <w:t xml:space="preserve">  </w:t>
-      </w:r>
-      <w:proofErr w:type="gramStart"/>
-      <w:r>
+        <w:t>())</w:t>
+      </w:r>
+    </w:p>
+    <w:p>
+      <w:pPr>
+        <w:pStyle w:val="HTMLPreformatted"/>
         <w:rPr>
           <w:rStyle w:val="HTMLCode"/>
           <w:rFonts w:ascii="Cambria" w:hAnsi="Cambria"/>
           <w:color w:val="0070C0"/>
           <w:sz w:val="22"/>
         </w:rPr>
-        <w:t>id</w:t>
-      </w:r>
-      <w:proofErr w:type="gramEnd"/>
+      </w:pPr>
       <w:r>
         <w:rPr>
           <w:rStyle w:val="HTMLCode"/>
@@ -15495,87 +15188,7 @@
           <w:color w:val="0070C0"/>
           <w:sz w:val="22"/>
         </w:rPr>
-        <w:t xml:space="preserve">    </w:t>
-      </w:r>
-      <w:proofErr w:type="spellStart"/>
-      <w:r>
-        <w:rPr>
-          <w:rStyle w:val="HTMLCode"/>
-          <w:rFonts w:ascii="Cambria" w:hAnsi="Cambria"/>
-          <w:color w:val="0070C0"/>
-          <w:sz w:val="22"/>
-        </w:rPr>
-        <w:t>Int</w:t>
-      </w:r>
-      <w:proofErr w:type="spellEnd"/>
-      <w:r>
-        <w:rPr>
-          <w:rStyle w:val="HTMLCode"/>
-          <w:rFonts w:ascii="Cambria" w:hAnsi="Cambria"/>
-          <w:color w:val="0070C0"/>
-          <w:sz w:val="22"/>
-        </w:rPr>
-        <w:t xml:space="preserve">    @id @default(</w:t>
-      </w:r>
-      <w:proofErr w:type="spellStart"/>
-      <w:r>
-        <w:rPr>
-          <w:rStyle w:val="HTMLCode"/>
-          <w:rFonts w:ascii="Cambria" w:hAnsi="Cambria"/>
-          <w:color w:val="0070C0"/>
-          <w:sz w:val="22"/>
-        </w:rPr>
-        <w:t>autoincrement</w:t>
-      </w:r>
-      <w:proofErr w:type="spellEnd"/>
-      <w:r>
-        <w:rPr>
-          <w:rStyle w:val="HTMLCode"/>
-          <w:rFonts w:ascii="Cambria" w:hAnsi="Cambria"/>
-          <w:color w:val="0070C0"/>
-          <w:sz w:val="22"/>
-        </w:rPr>
-        <w:t>())</w:t>
-      </w:r>
-    </w:p>
-    <w:p>
-      <w:pPr>
-        <w:pStyle w:val="HTMLPreformatted"/>
-        <w:rPr>
-          <w:rStyle w:val="HTMLCode"/>
-          <w:rFonts w:ascii="Cambria" w:hAnsi="Cambria"/>
-          <w:color w:val="0070C0"/>
-          <w:sz w:val="22"/>
-        </w:rPr>
-      </w:pPr>
-      <w:r>
-        <w:rPr>
-          <w:rStyle w:val="HTMLCode"/>
-          <w:rFonts w:ascii="Cambria" w:hAnsi="Cambria"/>
-          <w:color w:val="0070C0"/>
-          <w:sz w:val="22"/>
-        </w:rPr>
-        <w:t xml:space="preserve">  </w:t>
-      </w:r>
-      <w:proofErr w:type="gramStart"/>
-      <w:r>
-        <w:rPr>
-          <w:rStyle w:val="HTMLCode"/>
-          <w:rFonts w:ascii="Cambria" w:hAnsi="Cambria"/>
-          <w:color w:val="0070C0"/>
-          <w:sz w:val="22"/>
-        </w:rPr>
-        <w:t>email</w:t>
-      </w:r>
-      <w:proofErr w:type="gramEnd"/>
-      <w:r>
-        <w:rPr>
-          <w:rStyle w:val="HTMLCode"/>
-          <w:rFonts w:ascii="Cambria" w:hAnsi="Cambria"/>
-          <w:color w:val="0070C0"/>
-          <w:sz w:val="22"/>
-        </w:rPr>
-        <w:t xml:space="preserve"> String @unique</w:t>
+        <w:t xml:space="preserve">  email String @unique</w:t>
       </w:r>
     </w:p>
     <w:p>
@@ -16216,21 +15829,12 @@
           <w:color w:val="0070C0"/>
         </w:rPr>
       </w:pPr>
-      <w:proofErr w:type="gramStart"/>
       <w:r>
         <w:rPr>
           <w:rFonts w:ascii="Cambria" w:eastAsia="Times New Roman" w:hAnsi="Cambria" w:cs="Courier New"/>
           <w:color w:val="0070C0"/>
         </w:rPr>
-        <w:t>model</w:t>
-      </w:r>
-      <w:proofErr w:type="gramEnd"/>
-      <w:r>
-        <w:rPr>
-          <w:rFonts w:ascii="Cambria" w:eastAsia="Times New Roman" w:hAnsi="Cambria" w:cs="Courier New"/>
-          <w:color w:val="0070C0"/>
-        </w:rPr>
-        <w:t xml:space="preserve"> User {</w:t>
+        <w:t>model User {</w:t>
       </w:r>
     </w:p>
     <w:p>
@@ -16264,23 +15868,7 @@
           <w:rFonts w:ascii="Cambria" w:eastAsia="Times New Roman" w:hAnsi="Cambria" w:cs="Courier New"/>
           <w:color w:val="0070C0"/>
         </w:rPr>
-        <w:t xml:space="preserve">  </w:t>
-      </w:r>
-      <w:proofErr w:type="gramStart"/>
-      <w:r>
-        <w:rPr>
-          <w:rFonts w:ascii="Cambria" w:eastAsia="Times New Roman" w:hAnsi="Cambria" w:cs="Courier New"/>
-          <w:color w:val="0070C0"/>
-        </w:rPr>
-        <w:t>id</w:t>
-      </w:r>
-      <w:proofErr w:type="gramEnd"/>
-      <w:r>
-        <w:rPr>
-          <w:rFonts w:ascii="Cambria" w:eastAsia="Times New Roman" w:hAnsi="Cambria" w:cs="Courier New"/>
-          <w:color w:val="0070C0"/>
-        </w:rPr>
-        <w:t xml:space="preserve"> </w:t>
+        <w:t xml:space="preserve">  id </w:t>
       </w:r>
       <w:proofErr w:type="spellStart"/>
       <w:r>
@@ -16475,7 +16063,6 @@
           <w:color w:val="0070C0"/>
         </w:rPr>
       </w:pPr>
-      <w:proofErr w:type="gramStart"/>
       <w:r>
         <w:rPr>
           <w:rFonts w:ascii="Cambria" w:eastAsia="Times New Roman" w:hAnsi="Cambria" w:cs="Courier New"/>
@@ -16484,7 +16071,6 @@
         </w:rPr>
         <w:t>const</w:t>
       </w:r>
-      <w:proofErr w:type="gramEnd"/>
       <w:r>
         <w:rPr>
           <w:rFonts w:ascii="Cambria" w:eastAsia="Times New Roman" w:hAnsi="Cambria" w:cs="Courier New"/>
@@ -16580,7 +16166,6 @@
         </w:rPr>
         <w:t xml:space="preserve">  </w:t>
       </w:r>
-      <w:proofErr w:type="gramStart"/>
       <w:r>
         <w:rPr>
           <w:rFonts w:ascii="Cambria" w:eastAsia="Times New Roman" w:hAnsi="Cambria" w:cs="Courier New"/>
@@ -16589,7 +16174,6 @@
         </w:rPr>
         <w:t>email</w:t>
       </w:r>
-      <w:proofErr w:type="gramEnd"/>
       <w:r>
         <w:rPr>
           <w:rFonts w:ascii="Cambria" w:eastAsia="Times New Roman" w:hAnsi="Cambria" w:cs="Courier New"/>
@@ -16769,7 +16353,6 @@
           <w:color w:val="0070C0"/>
         </w:rPr>
       </w:pPr>
-      <w:proofErr w:type="gramStart"/>
       <w:r>
         <w:rPr>
           <w:rFonts w:ascii="Cambria" w:eastAsia="Times New Roman" w:hAnsi="Cambria" w:cs="Courier New"/>
@@ -16785,7 +16368,6 @@
         </w:rPr>
         <w:t>()</w:t>
       </w:r>
-      <w:proofErr w:type="gramEnd"/>
     </w:p>
     <w:p>
       <w:pPr>
@@ -16813,7 +16395,6 @@
           <w:color w:val="0070C0"/>
         </w:rPr>
       </w:pPr>
-      <w:proofErr w:type="gramStart"/>
       <w:r>
         <w:rPr>
           <w:rFonts w:ascii="Cambria" w:eastAsia="Times New Roman" w:hAnsi="Cambria" w:cs="Courier New"/>
@@ -16822,7 +16403,6 @@
         </w:rPr>
         <w:t>class</w:t>
       </w:r>
-      <w:proofErr w:type="gramEnd"/>
       <w:r>
         <w:rPr>
           <w:rFonts w:ascii="Cambria" w:eastAsia="Times New Roman" w:hAnsi="Cambria" w:cs="Courier New"/>
@@ -16879,7 +16459,6 @@
         </w:rPr>
         <w:t xml:space="preserve">  </w:t>
       </w:r>
-      <w:proofErr w:type="gramStart"/>
       <w:r>
         <w:rPr>
           <w:rFonts w:ascii="Cambria" w:eastAsia="Times New Roman" w:hAnsi="Cambria" w:cs="Courier New"/>
@@ -16895,7 +16474,6 @@
         </w:rPr>
         <w:t>()</w:t>
       </w:r>
-      <w:proofErr w:type="gramEnd"/>
     </w:p>
     <w:p>
       <w:pPr>
@@ -16930,7 +16508,6 @@
         </w:rPr>
         <w:t xml:space="preserve">  </w:t>
       </w:r>
-      <w:proofErr w:type="gramStart"/>
       <w:r>
         <w:rPr>
           <w:rFonts w:ascii="Cambria" w:eastAsia="Times New Roman" w:hAnsi="Cambria" w:cs="Courier New"/>
@@ -16939,7 +16516,6 @@
         </w:rPr>
         <w:t>email</w:t>
       </w:r>
-      <w:proofErr w:type="gramEnd"/>
       <w:r>
         <w:rPr>
           <w:rFonts w:ascii="Cambria" w:eastAsia="Times New Roman" w:hAnsi="Cambria" w:cs="Courier New"/>
@@ -17103,7 +16679,6 @@
           <w:color w:val="0070C0"/>
         </w:rPr>
       </w:pPr>
-      <w:proofErr w:type="gramStart"/>
       <w:r>
         <w:rPr>
           <w:rFonts w:ascii="Cambria" w:eastAsia="Times New Roman" w:hAnsi="Cambria" w:cs="Courier New"/>
@@ -17112,7 +16687,6 @@
         </w:rPr>
         <w:t>const</w:t>
       </w:r>
-      <w:proofErr w:type="gramEnd"/>
       <w:r>
         <w:rPr>
           <w:rFonts w:ascii="Cambria" w:eastAsia="Times New Roman" w:hAnsi="Cambria" w:cs="Courier New"/>
@@ -17209,7 +16783,6 @@
         </w:rPr>
         <w:t xml:space="preserve">  </w:t>
       </w:r>
-      <w:proofErr w:type="gramStart"/>
       <w:r>
         <w:rPr>
           <w:rFonts w:ascii="Cambria" w:eastAsia="Times New Roman" w:hAnsi="Cambria" w:cs="Courier New"/>
@@ -17218,7 +16791,6 @@
         </w:rPr>
         <w:t>email</w:t>
       </w:r>
-      <w:proofErr w:type="gramEnd"/>
       <w:r>
         <w:rPr>
           <w:rFonts w:ascii="Cambria" w:eastAsia="Times New Roman" w:hAnsi="Cambria" w:cs="Courier New"/>
@@ -17344,19 +16916,8 @@
           <w:sz w:val="24"/>
           <w:szCs w:val="24"/>
         </w:rPr>
-        <w:t>Summary</w:t>
-      </w:r>
-      <w:proofErr w:type="gramStart"/>
-      <w:r>
-        <w:rPr>
-          <w:rFonts w:ascii="Cambria" w:eastAsia="Times New Roman" w:hAnsi="Cambria" w:cs="Times New Roman"/>
-          <w:b/>
-          <w:sz w:val="24"/>
-          <w:szCs w:val="24"/>
-        </w:rPr>
-        <w:t>:</w:t>
-      </w:r>
-      <w:proofErr w:type="gramEnd"/>
+        <w:t>Summary:</w:t>
+      </w:r>
       <w:r>
         <w:rPr>
           <w:rFonts w:ascii="Cambria" w:eastAsia="Times New Roman" w:hAnsi="Cambria" w:cs="Times New Roman"/>
@@ -17839,21 +17400,12 @@
           <w:rFonts w:ascii="Cambria" w:hAnsi="Cambria"/>
         </w:rPr>
       </w:pPr>
-      <w:proofErr w:type="gramStart"/>
-      <w:r>
-        <w:rPr>
-          <w:rStyle w:val="HTMLCode"/>
-          <w:rFonts w:ascii="Cambria" w:hAnsi="Cambria"/>
-        </w:rPr>
-        <w:t>events</w:t>
-      </w:r>
-      <w:proofErr w:type="gramEnd"/>
-      <w:r>
-        <w:rPr>
-          <w:rStyle w:val="HTMLCode"/>
-          <w:rFonts w:ascii="Cambria" w:hAnsi="Cambria"/>
-        </w:rPr>
-        <w:t>/</w:t>
+      <w:r>
+        <w:rPr>
+          <w:rStyle w:val="HTMLCode"/>
+          <w:rFonts w:ascii="Cambria" w:hAnsi="Cambria"/>
+        </w:rPr>
+        <w:t>events/</w:t>
       </w:r>
     </w:p>
     <w:p>
@@ -18013,7 +17565,6 @@
           <w:rFonts w:ascii="Cambria" w:hAnsi="Cambria"/>
         </w:rPr>
       </w:pPr>
-      <w:proofErr w:type="gramStart"/>
       <w:r>
         <w:rPr>
           <w:rStyle w:val="HTMLCode"/>
@@ -18021,7 +17572,6 @@
         </w:rPr>
         <w:t>events/index.js</w:t>
       </w:r>
-      <w:proofErr w:type="gramEnd"/>
     </w:p>
     <w:p>
       <w:pPr>
@@ -18110,21 +17660,12 @@
           <w:rFonts w:ascii="Cambria" w:hAnsi="Cambria"/>
         </w:rPr>
       </w:pPr>
-      <w:proofErr w:type="gramStart"/>
-      <w:r>
-        <w:rPr>
-          <w:rStyle w:val="HTMLCode"/>
-          <w:rFonts w:ascii="Cambria" w:hAnsi="Cambria"/>
-        </w:rPr>
-        <w:t>export</w:t>
-      </w:r>
-      <w:proofErr w:type="gramEnd"/>
-      <w:r>
-        <w:rPr>
-          <w:rStyle w:val="HTMLCode"/>
-          <w:rFonts w:ascii="Cambria" w:hAnsi="Cambria"/>
-        </w:rPr>
-        <w:t xml:space="preserve"> const </w:t>
+      <w:r>
+        <w:rPr>
+          <w:rStyle w:val="HTMLCode"/>
+          <w:rFonts w:ascii="Cambria" w:hAnsi="Cambria"/>
+        </w:rPr>
+        <w:t xml:space="preserve">export const </w:t>
       </w:r>
       <w:proofErr w:type="spellStart"/>
       <w:r>
@@ -18151,21 +17692,12 @@
           <w:rFonts w:ascii="Cambria" w:hAnsi="Cambria"/>
         </w:rPr>
       </w:pPr>
-      <w:proofErr w:type="gramStart"/>
-      <w:r>
-        <w:rPr>
-          <w:rStyle w:val="HTMLCode"/>
-          <w:rFonts w:ascii="Cambria" w:hAnsi="Cambria"/>
-        </w:rPr>
-        <w:t>export</w:t>
-      </w:r>
-      <w:proofErr w:type="gramEnd"/>
-      <w:r>
-        <w:rPr>
-          <w:rStyle w:val="HTMLCode"/>
-          <w:rFonts w:ascii="Cambria" w:hAnsi="Cambria"/>
-        </w:rPr>
-        <w:t xml:space="preserve"> const </w:t>
+      <w:r>
+        <w:rPr>
+          <w:rStyle w:val="HTMLCode"/>
+          <w:rFonts w:ascii="Cambria" w:hAnsi="Cambria"/>
+        </w:rPr>
+        <w:t xml:space="preserve">export const </w:t>
       </w:r>
       <w:proofErr w:type="spellStart"/>
       <w:r>
@@ -18206,21 +17738,12 @@
           <w:rFonts w:ascii="Cambria" w:hAnsi="Cambria"/>
         </w:rPr>
       </w:pPr>
-      <w:proofErr w:type="gramStart"/>
-      <w:r>
-        <w:rPr>
-          <w:rStyle w:val="HTMLCode"/>
-          <w:rFonts w:ascii="Cambria" w:hAnsi="Cambria"/>
-        </w:rPr>
-        <w:t>export</w:t>
-      </w:r>
-      <w:proofErr w:type="gramEnd"/>
-      <w:r>
-        <w:rPr>
-          <w:rStyle w:val="HTMLCode"/>
-          <w:rFonts w:ascii="Cambria" w:hAnsi="Cambria"/>
-        </w:rPr>
-        <w:t xml:space="preserve"> const </w:t>
+      <w:r>
+        <w:rPr>
+          <w:rStyle w:val="HTMLCode"/>
+          <w:rFonts w:ascii="Cambria" w:hAnsi="Cambria"/>
+        </w:rPr>
+        <w:t xml:space="preserve">export const </w:t>
       </w:r>
       <w:proofErr w:type="spellStart"/>
       <w:r>
@@ -18247,21 +17770,12 @@
           <w:rFonts w:ascii="Cambria" w:hAnsi="Cambria"/>
         </w:rPr>
       </w:pPr>
-      <w:proofErr w:type="gramStart"/>
-      <w:r>
-        <w:rPr>
-          <w:rStyle w:val="HTMLCode"/>
-          <w:rFonts w:ascii="Cambria" w:hAnsi="Cambria"/>
-        </w:rPr>
-        <w:t>export</w:t>
-      </w:r>
-      <w:proofErr w:type="gramEnd"/>
-      <w:r>
-        <w:rPr>
-          <w:rStyle w:val="HTMLCode"/>
-          <w:rFonts w:ascii="Cambria" w:hAnsi="Cambria"/>
-        </w:rPr>
-        <w:t xml:space="preserve"> const </w:t>
+      <w:r>
+        <w:rPr>
+          <w:rStyle w:val="HTMLCode"/>
+          <w:rFonts w:ascii="Cambria" w:hAnsi="Cambria"/>
+        </w:rPr>
+        <w:t xml:space="preserve">export const </w:t>
       </w:r>
       <w:proofErr w:type="spellStart"/>
       <w:r>
@@ -18331,21 +17845,12 @@
           <w:rFonts w:ascii="Cambria" w:hAnsi="Cambria"/>
         </w:rPr>
       </w:pPr>
-      <w:proofErr w:type="gramStart"/>
-      <w:r>
-        <w:rPr>
-          <w:rStyle w:val="HTMLCode"/>
-          <w:rFonts w:ascii="Cambria" w:hAnsi="Cambria"/>
-        </w:rPr>
-        <w:t>import</w:t>
-      </w:r>
-      <w:proofErr w:type="gramEnd"/>
-      <w:r>
-        <w:rPr>
-          <w:rStyle w:val="HTMLCode"/>
-          <w:rFonts w:ascii="Cambria" w:hAnsi="Cambria"/>
-        </w:rPr>
-        <w:t xml:space="preserve"> { </w:t>
+      <w:r>
+        <w:rPr>
+          <w:rStyle w:val="HTMLCode"/>
+          <w:rFonts w:ascii="Cambria" w:hAnsi="Cambria"/>
+        </w:rPr>
+        <w:t xml:space="preserve">import { </w:t>
       </w:r>
       <w:proofErr w:type="spellStart"/>
       <w:r>
@@ -18388,21 +17893,12 @@
           <w:rFonts w:ascii="Cambria" w:hAnsi="Cambria"/>
         </w:rPr>
       </w:pPr>
-      <w:proofErr w:type="gramStart"/>
-      <w:r>
-        <w:rPr>
-          <w:rStyle w:val="HTMLCode"/>
-          <w:rFonts w:ascii="Cambria" w:hAnsi="Cambria"/>
-        </w:rPr>
-        <w:t>import</w:t>
-      </w:r>
-      <w:proofErr w:type="gramEnd"/>
-      <w:r>
-        <w:rPr>
-          <w:rStyle w:val="HTMLCode"/>
-          <w:rFonts w:ascii="Cambria" w:hAnsi="Cambria"/>
-        </w:rPr>
-        <w:t xml:space="preserve"> { </w:t>
+      <w:r>
+        <w:rPr>
+          <w:rStyle w:val="HTMLCode"/>
+          <w:rFonts w:ascii="Cambria" w:hAnsi="Cambria"/>
+        </w:rPr>
+        <w:t xml:space="preserve">import { </w:t>
       </w:r>
       <w:proofErr w:type="spellStart"/>
       <w:r>
@@ -18454,21 +17950,12 @@
           <w:rFonts w:ascii="Cambria" w:hAnsi="Cambria"/>
         </w:rPr>
       </w:pPr>
-      <w:proofErr w:type="gramStart"/>
-      <w:r>
-        <w:rPr>
-          <w:rStyle w:val="HTMLCode"/>
-          <w:rFonts w:ascii="Cambria" w:hAnsi="Cambria"/>
-        </w:rPr>
-        <w:t>export</w:t>
-      </w:r>
-      <w:proofErr w:type="gramEnd"/>
-      <w:r>
-        <w:rPr>
-          <w:rStyle w:val="HTMLCode"/>
-          <w:rFonts w:ascii="Cambria" w:hAnsi="Cambria"/>
-        </w:rPr>
-        <w:t xml:space="preserve"> const functions = [</w:t>
+      <w:r>
+        <w:rPr>
+          <w:rStyle w:val="HTMLCode"/>
+          <w:rFonts w:ascii="Cambria" w:hAnsi="Cambria"/>
+        </w:rPr>
+        <w:t>export const functions = [</w:t>
       </w:r>
     </w:p>
     <w:p>
@@ -18487,7 +17974,6 @@
         <w:t xml:space="preserve">  </w:t>
       </w:r>
       <w:proofErr w:type="spellStart"/>
-      <w:proofErr w:type="gramStart"/>
       <w:r>
         <w:rPr>
           <w:rStyle w:val="HTMLCode"/>
@@ -18496,7 +17982,6 @@
         <w:t>userCreated</w:t>
       </w:r>
       <w:proofErr w:type="spellEnd"/>
-      <w:proofErr w:type="gramEnd"/>
       <w:r>
         <w:rPr>
           <w:rStyle w:val="HTMLCode"/>
@@ -18521,7 +18006,6 @@
         <w:t xml:space="preserve">  </w:t>
       </w:r>
       <w:proofErr w:type="spellStart"/>
-      <w:proofErr w:type="gramStart"/>
       <w:r>
         <w:rPr>
           <w:rStyle w:val="HTMLCode"/>
@@ -18530,7 +18014,6 @@
         <w:t>userUpdated</w:t>
       </w:r>
       <w:proofErr w:type="spellEnd"/>
-      <w:proofErr w:type="gramEnd"/>
       <w:r>
         <w:rPr>
           <w:rStyle w:val="HTMLCode"/>
@@ -18555,7 +18038,6 @@
         <w:t xml:space="preserve">  </w:t>
       </w:r>
       <w:proofErr w:type="spellStart"/>
-      <w:proofErr w:type="gramStart"/>
       <w:r>
         <w:rPr>
           <w:rStyle w:val="HTMLCode"/>
@@ -18564,7 +18046,6 @@
         <w:t>taskCreated</w:t>
       </w:r>
       <w:proofErr w:type="spellEnd"/>
-      <w:proofErr w:type="gramEnd"/>
       <w:r>
         <w:rPr>
           <w:rStyle w:val="HTMLCode"/>
@@ -18589,7 +18070,6 @@
         <w:t xml:space="preserve">  </w:t>
       </w:r>
       <w:proofErr w:type="spellStart"/>
-      <w:proofErr w:type="gramStart"/>
       <w:r>
         <w:rPr>
           <w:rStyle w:val="HTMLCode"/>
@@ -18598,7 +18078,6 @@
         <w:t>taskAssigned</w:t>
       </w:r>
       <w:proofErr w:type="spellEnd"/>
-      <w:proofErr w:type="gramEnd"/>
     </w:p>
     <w:p>
       <w:pPr>
@@ -18667,7 +18146,6 @@
           <w:rFonts w:ascii="Cambria" w:hAnsi="Cambria"/>
         </w:rPr>
       </w:pPr>
-      <w:proofErr w:type="gramStart"/>
       <w:r>
         <w:rPr>
           <w:rStyle w:val="HTMLCode"/>
@@ -18675,7 +18153,6 @@
         </w:rPr>
         <w:t>serve({</w:t>
       </w:r>
-      <w:proofErr w:type="gramEnd"/>
     </w:p>
     <w:p>
       <w:pPr>
@@ -18690,23 +18167,7 @@
           <w:rStyle w:val="HTMLCode"/>
           <w:rFonts w:ascii="Cambria" w:hAnsi="Cambria"/>
         </w:rPr>
-        <w:t xml:space="preserve">   </w:t>
-      </w:r>
-      <w:proofErr w:type="gramStart"/>
-      <w:r>
-        <w:rPr>
-          <w:rStyle w:val="HTMLCode"/>
-          <w:rFonts w:ascii="Cambria" w:hAnsi="Cambria"/>
-        </w:rPr>
-        <w:t>client</w:t>
-      </w:r>
-      <w:proofErr w:type="gramEnd"/>
-      <w:r>
-        <w:rPr>
-          <w:rStyle w:val="HTMLCode"/>
-          <w:rFonts w:ascii="Cambria" w:hAnsi="Cambria"/>
-        </w:rPr>
-        <w:t xml:space="preserve">: </w:t>
+        <w:t xml:space="preserve">   client: </w:t>
       </w:r>
       <w:proofErr w:type="spellStart"/>
       <w:r>
@@ -18738,17 +18199,8 @@
           <w:rStyle w:val="HTMLCode"/>
           <w:rFonts w:ascii="Cambria" w:hAnsi="Cambria"/>
         </w:rPr>
-        <w:t xml:space="preserve">   </w:t>
-      </w:r>
-      <w:proofErr w:type="gramStart"/>
-      <w:r>
-        <w:rPr>
-          <w:rStyle w:val="HTMLCode"/>
-          <w:rFonts w:ascii="Cambria" w:hAnsi="Cambria"/>
-        </w:rPr>
-        <w:t>functions</w:t>
-      </w:r>
-      <w:proofErr w:type="gramEnd"/>
+        <w:t xml:space="preserve">   functions</w:t>
+      </w:r>
     </w:p>
     <w:p>
       <w:pPr>
@@ -18854,21 +18306,12 @@
           <w:rFonts w:ascii="Cambria" w:hAnsi="Cambria"/>
         </w:rPr>
       </w:pPr>
-      <w:proofErr w:type="gramStart"/>
-      <w:r>
-        <w:rPr>
-          <w:rStyle w:val="HTMLCode"/>
-          <w:rFonts w:ascii="Cambria" w:hAnsi="Cambria"/>
-        </w:rPr>
-        <w:t>import</w:t>
-      </w:r>
-      <w:proofErr w:type="gramEnd"/>
-      <w:r>
-        <w:rPr>
-          <w:rStyle w:val="HTMLCode"/>
-          <w:rFonts w:ascii="Cambria" w:hAnsi="Cambria"/>
-        </w:rPr>
-        <w:t xml:space="preserve"> </w:t>
+      <w:r>
+        <w:rPr>
+          <w:rStyle w:val="HTMLCode"/>
+          <w:rFonts w:ascii="Cambria" w:hAnsi="Cambria"/>
+        </w:rPr>
+        <w:t xml:space="preserve">import </w:t>
       </w:r>
       <w:proofErr w:type="spellStart"/>
       <w:r>
@@ -18895,21 +18338,12 @@
           <w:rFonts w:ascii="Cambria" w:hAnsi="Cambria"/>
         </w:rPr>
       </w:pPr>
-      <w:proofErr w:type="gramStart"/>
-      <w:r>
-        <w:rPr>
-          <w:rStyle w:val="HTMLCode"/>
-          <w:rFonts w:ascii="Cambria" w:hAnsi="Cambria"/>
-        </w:rPr>
-        <w:t>import</w:t>
-      </w:r>
-      <w:proofErr w:type="gramEnd"/>
-      <w:r>
-        <w:rPr>
-          <w:rStyle w:val="HTMLCode"/>
-          <w:rFonts w:ascii="Cambria" w:hAnsi="Cambria"/>
-        </w:rPr>
-        <w:t xml:space="preserve"> </w:t>
+      <w:r>
+        <w:rPr>
+          <w:rStyle w:val="HTMLCode"/>
+          <w:rFonts w:ascii="Cambria" w:hAnsi="Cambria"/>
+        </w:rPr>
+        <w:t xml:space="preserve">import </w:t>
       </w:r>
       <w:proofErr w:type="spellStart"/>
       <w:r>
@@ -18936,21 +18370,12 @@
           <w:rFonts w:ascii="Cambria" w:hAnsi="Cambria"/>
         </w:rPr>
       </w:pPr>
-      <w:proofErr w:type="gramStart"/>
-      <w:r>
-        <w:rPr>
-          <w:rStyle w:val="HTMLCode"/>
-          <w:rFonts w:ascii="Cambria" w:hAnsi="Cambria"/>
-        </w:rPr>
-        <w:t>import</w:t>
-      </w:r>
-      <w:proofErr w:type="gramEnd"/>
-      <w:r>
-        <w:rPr>
-          <w:rStyle w:val="HTMLCode"/>
-          <w:rFonts w:ascii="Cambria" w:hAnsi="Cambria"/>
-        </w:rPr>
-        <w:t xml:space="preserve"> </w:t>
+      <w:r>
+        <w:rPr>
+          <w:rStyle w:val="HTMLCode"/>
+          <w:rFonts w:ascii="Cambria" w:hAnsi="Cambria"/>
+        </w:rPr>
+        <w:t xml:space="preserve">import </w:t>
       </w:r>
       <w:proofErr w:type="spellStart"/>
       <w:r>
@@ -18977,21 +18402,12 @@
           <w:rFonts w:ascii="Cambria" w:hAnsi="Cambria"/>
         </w:rPr>
       </w:pPr>
-      <w:proofErr w:type="gramStart"/>
-      <w:r>
-        <w:rPr>
-          <w:rStyle w:val="HTMLCode"/>
-          <w:rFonts w:ascii="Cambria" w:hAnsi="Cambria"/>
-        </w:rPr>
-        <w:t>import</w:t>
-      </w:r>
-      <w:proofErr w:type="gramEnd"/>
-      <w:r>
-        <w:rPr>
-          <w:rStyle w:val="HTMLCode"/>
-          <w:rFonts w:ascii="Cambria" w:hAnsi="Cambria"/>
-        </w:rPr>
-        <w:t xml:space="preserve"> </w:t>
+      <w:r>
+        <w:rPr>
+          <w:rStyle w:val="HTMLCode"/>
+          <w:rFonts w:ascii="Cambria" w:hAnsi="Cambria"/>
+        </w:rPr>
+        <w:t xml:space="preserve">import </w:t>
       </w:r>
       <w:proofErr w:type="spellStart"/>
       <w:r>
@@ -19018,21 +18434,12 @@
           <w:rFonts w:ascii="Cambria" w:hAnsi="Cambria"/>
         </w:rPr>
       </w:pPr>
-      <w:proofErr w:type="gramStart"/>
-      <w:r>
-        <w:rPr>
-          <w:rStyle w:val="HTMLCode"/>
-          <w:rFonts w:ascii="Cambria" w:hAnsi="Cambria"/>
-        </w:rPr>
-        <w:t>import</w:t>
-      </w:r>
-      <w:proofErr w:type="gramEnd"/>
-      <w:r>
-        <w:rPr>
-          <w:rStyle w:val="HTMLCode"/>
-          <w:rFonts w:ascii="Cambria" w:hAnsi="Cambria"/>
-        </w:rPr>
-        <w:t xml:space="preserve"> </w:t>
+      <w:r>
+        <w:rPr>
+          <w:rStyle w:val="HTMLCode"/>
+          <w:rFonts w:ascii="Cambria" w:hAnsi="Cambria"/>
+        </w:rPr>
+        <w:t xml:space="preserve">import </w:t>
       </w:r>
       <w:proofErr w:type="spellStart"/>
       <w:r>
@@ -19073,21 +18480,12 @@
           <w:rFonts w:ascii="Cambria" w:hAnsi="Cambria"/>
         </w:rPr>
       </w:pPr>
-      <w:proofErr w:type="gramStart"/>
-      <w:r>
-        <w:rPr>
-          <w:rStyle w:val="HTMLCode"/>
-          <w:rFonts w:ascii="Cambria" w:hAnsi="Cambria"/>
-        </w:rPr>
-        <w:t>import</w:t>
-      </w:r>
-      <w:proofErr w:type="gramEnd"/>
-      <w:r>
-        <w:rPr>
-          <w:rStyle w:val="HTMLCode"/>
-          <w:rFonts w:ascii="Cambria" w:hAnsi="Cambria"/>
-        </w:rPr>
-        <w:t xml:space="preserve"> { functions } from "./events"</w:t>
+      <w:r>
+        <w:rPr>
+          <w:rStyle w:val="HTMLCode"/>
+          <w:rFonts w:ascii="Cambria" w:hAnsi="Cambria"/>
+        </w:rPr>
+        <w:t>import { functions } from "./events"</w:t>
       </w:r>
     </w:p>
     <w:p>
@@ -19169,21 +18567,12 @@
           <w:rFonts w:ascii="Cambria" w:hAnsi="Cambria"/>
         </w:rPr>
       </w:pPr>
-      <w:proofErr w:type="gramStart"/>
-      <w:r>
-        <w:rPr>
-          <w:rStyle w:val="HTMLCode"/>
-          <w:rFonts w:ascii="Cambria" w:hAnsi="Cambria"/>
-        </w:rPr>
-        <w:t>events</w:t>
-      </w:r>
-      <w:proofErr w:type="gramEnd"/>
-      <w:r>
-        <w:rPr>
-          <w:rStyle w:val="HTMLCode"/>
-          <w:rFonts w:ascii="Cambria" w:hAnsi="Cambria"/>
-        </w:rPr>
-        <w:t>/</w:t>
+      <w:r>
+        <w:rPr>
+          <w:rStyle w:val="HTMLCode"/>
+          <w:rFonts w:ascii="Cambria" w:hAnsi="Cambria"/>
+        </w:rPr>
+        <w:t>events/</w:t>
       </w:r>
     </w:p>
     <w:p>
@@ -19717,21 +19106,12 @@
           <w:rFonts w:ascii="Cambria" w:hAnsi="Cambria"/>
         </w:rPr>
       </w:pPr>
-      <w:proofErr w:type="gramStart"/>
-      <w:r>
-        <w:rPr>
-          <w:rStyle w:val="HTMLCode"/>
-          <w:rFonts w:ascii="Cambria" w:hAnsi="Cambria"/>
-        </w:rPr>
-        <w:t>routes</w:t>
-      </w:r>
-      <w:proofErr w:type="gramEnd"/>
-      <w:r>
-        <w:rPr>
-          <w:rStyle w:val="HTMLCode"/>
-          <w:rFonts w:ascii="Cambria" w:hAnsi="Cambria"/>
-        </w:rPr>
-        <w:t>/</w:t>
+      <w:r>
+        <w:rPr>
+          <w:rStyle w:val="HTMLCode"/>
+          <w:rFonts w:ascii="Cambria" w:hAnsi="Cambria"/>
+        </w:rPr>
+        <w:t>routes/</w:t>
       </w:r>
     </w:p>
     <w:p>
@@ -19831,7 +19211,6 @@
           <w:rFonts w:ascii="Cambria" w:hAnsi="Cambria"/>
         </w:rPr>
       </w:pPr>
-      <w:proofErr w:type="gramStart"/>
       <w:r>
         <w:rPr>
           <w:rStyle w:val="HTMLCode"/>
@@ -19839,7 +19218,6 @@
         </w:rPr>
         <w:t>routes/index.js</w:t>
       </w:r>
-      <w:proofErr w:type="gramEnd"/>
     </w:p>
     <w:p>
       <w:pPr>
@@ -19849,21 +19227,12 @@
           <w:rFonts w:ascii="Cambria" w:hAnsi="Cambria"/>
         </w:rPr>
       </w:pPr>
-      <w:proofErr w:type="gramStart"/>
-      <w:r>
-        <w:rPr>
-          <w:rStyle w:val="HTMLCode"/>
-          <w:rFonts w:ascii="Cambria" w:hAnsi="Cambria"/>
-        </w:rPr>
-        <w:t>export</w:t>
-      </w:r>
-      <w:proofErr w:type="gramEnd"/>
-      <w:r>
-        <w:rPr>
-          <w:rStyle w:val="HTMLCode"/>
-          <w:rFonts w:ascii="Cambria" w:hAnsi="Cambria"/>
-        </w:rPr>
-        <w:t xml:space="preserve"> default [</w:t>
+      <w:r>
+        <w:rPr>
+          <w:rStyle w:val="HTMLCode"/>
+          <w:rFonts w:ascii="Cambria" w:hAnsi="Cambria"/>
+        </w:rPr>
+        <w:t>export default [</w:t>
       </w:r>
     </w:p>
     <w:p>
@@ -19882,7 +19251,6 @@
         <w:t xml:space="preserve">   </w:t>
       </w:r>
       <w:proofErr w:type="spellStart"/>
-      <w:proofErr w:type="gramStart"/>
       <w:r>
         <w:rPr>
           <w:rStyle w:val="HTMLCode"/>
@@ -19891,7 +19259,6 @@
         <w:t>authRoutes</w:t>
       </w:r>
       <w:proofErr w:type="spellEnd"/>
-      <w:proofErr w:type="gramEnd"/>
       <w:r>
         <w:rPr>
           <w:rStyle w:val="HTMLCode"/>
@@ -19916,7 +19283,6 @@
         <w:t xml:space="preserve">   </w:t>
       </w:r>
       <w:proofErr w:type="spellStart"/>
-      <w:proofErr w:type="gramStart"/>
       <w:r>
         <w:rPr>
           <w:rStyle w:val="HTMLCode"/>
@@ -19925,7 +19291,6 @@
         <w:t>userRoutes</w:t>
       </w:r>
       <w:proofErr w:type="spellEnd"/>
-      <w:proofErr w:type="gramEnd"/>
       <w:r>
         <w:rPr>
           <w:rStyle w:val="HTMLCode"/>
@@ -19950,7 +19315,6 @@
         <w:t xml:space="preserve">   </w:t>
       </w:r>
       <w:proofErr w:type="spellStart"/>
-      <w:proofErr w:type="gramStart"/>
       <w:r>
         <w:rPr>
           <w:rStyle w:val="HTMLCode"/>
@@ -19959,7 +19323,6 @@
         <w:t>projectRoutes</w:t>
       </w:r>
       <w:proofErr w:type="spellEnd"/>
-      <w:proofErr w:type="gramEnd"/>
     </w:p>
     <w:p>
       <w:pPr>
@@ -20022,21 +19385,12 @@
           <w:rFonts w:ascii="Cambria" w:hAnsi="Cambria"/>
         </w:rPr>
       </w:pPr>
-      <w:proofErr w:type="gramStart"/>
-      <w:r>
-        <w:rPr>
-          <w:rStyle w:val="HTMLCode"/>
-          <w:rFonts w:ascii="Cambria" w:hAnsi="Cambria"/>
-        </w:rPr>
-        <w:t>reducers</w:t>
-      </w:r>
-      <w:proofErr w:type="gramEnd"/>
-      <w:r>
-        <w:rPr>
-          <w:rStyle w:val="HTMLCode"/>
-          <w:rFonts w:ascii="Cambria" w:hAnsi="Cambria"/>
-        </w:rPr>
-        <w:t>/</w:t>
+      <w:r>
+        <w:rPr>
+          <w:rStyle w:val="HTMLCode"/>
+          <w:rFonts w:ascii="Cambria" w:hAnsi="Cambria"/>
+        </w:rPr>
+        <w:t>reducers/</w:t>
       </w:r>
     </w:p>
     <w:p>
@@ -20110,7 +19464,6 @@
         </w:rPr>
       </w:pPr>
       <w:proofErr w:type="spellStart"/>
-      <w:proofErr w:type="gramStart"/>
       <w:r>
         <w:rPr>
           <w:rStyle w:val="HTMLCode"/>
@@ -20126,7 +19479,6 @@
         </w:rPr>
         <w:t>({</w:t>
       </w:r>
-      <w:proofErr w:type="gramEnd"/>
     </w:p>
     <w:p>
       <w:pPr>
@@ -20141,23 +19493,7 @@
           <w:rStyle w:val="HTMLCode"/>
           <w:rFonts w:ascii="Cambria" w:hAnsi="Cambria"/>
         </w:rPr>
-        <w:t xml:space="preserve">   </w:t>
-      </w:r>
-      <w:proofErr w:type="gramStart"/>
-      <w:r>
-        <w:rPr>
-          <w:rStyle w:val="HTMLCode"/>
-          <w:rFonts w:ascii="Cambria" w:hAnsi="Cambria"/>
-        </w:rPr>
-        <w:t>user</w:t>
-      </w:r>
-      <w:proofErr w:type="gramEnd"/>
-      <w:r>
-        <w:rPr>
-          <w:rStyle w:val="HTMLCode"/>
-          <w:rFonts w:ascii="Cambria" w:hAnsi="Cambria"/>
-        </w:rPr>
-        <w:t>,</w:t>
+        <w:t xml:space="preserve">   user,</w:t>
       </w:r>
     </w:p>
     <w:p>
@@ -20173,23 +19509,7 @@
           <w:rStyle w:val="HTMLCode"/>
           <w:rFonts w:ascii="Cambria" w:hAnsi="Cambria"/>
         </w:rPr>
-        <w:t xml:space="preserve">   </w:t>
-      </w:r>
-      <w:proofErr w:type="gramStart"/>
-      <w:r>
-        <w:rPr>
-          <w:rStyle w:val="HTMLCode"/>
-          <w:rFonts w:ascii="Cambria" w:hAnsi="Cambria"/>
-        </w:rPr>
-        <w:t>auth</w:t>
-      </w:r>
-      <w:proofErr w:type="gramEnd"/>
-      <w:r>
-        <w:rPr>
-          <w:rStyle w:val="HTMLCode"/>
-          <w:rFonts w:ascii="Cambria" w:hAnsi="Cambria"/>
-        </w:rPr>
-        <w:t>,</w:t>
+        <w:t xml:space="preserve">   auth,</w:t>
       </w:r>
     </w:p>
     <w:p>
@@ -20205,17 +19525,8 @@
           <w:rStyle w:val="HTMLCode"/>
           <w:rFonts w:ascii="Cambria" w:hAnsi="Cambria"/>
         </w:rPr>
-        <w:t xml:space="preserve">   </w:t>
-      </w:r>
-      <w:proofErr w:type="gramStart"/>
-      <w:r>
-        <w:rPr>
-          <w:rStyle w:val="HTMLCode"/>
-          <w:rFonts w:ascii="Cambria" w:hAnsi="Cambria"/>
-        </w:rPr>
-        <w:t>task</w:t>
-      </w:r>
-      <w:proofErr w:type="gramEnd"/>
+        <w:t xml:space="preserve">   task</w:t>
+      </w:r>
     </w:p>
     <w:p>
       <w:pPr>
@@ -20359,19 +19670,11 @@
           <w:rFonts w:ascii="Cambria" w:hAnsi="Cambria"/>
         </w:rPr>
       </w:pPr>
-      <w:proofErr w:type="gramStart"/>
-      <w:r>
-        <w:rPr>
-          <w:rFonts w:ascii="Cambria" w:hAnsi="Cambria"/>
-        </w:rPr>
-        <w:t>often</w:t>
-      </w:r>
-      <w:proofErr w:type="gramEnd"/>
-      <w:r>
-        <w:rPr>
-          <w:rFonts w:ascii="Cambria" w:hAnsi="Cambria"/>
-        </w:rPr>
-        <w:t xml:space="preserve"> use registry-based function loading to manage event handlers.</w:t>
+      <w:r>
+        <w:rPr>
+          <w:rFonts w:ascii="Cambria" w:hAnsi="Cambria"/>
+        </w:rPr>
+        <w:t>often use registry-based function loading to manage event handlers.</w:t>
       </w:r>
     </w:p>
     <w:p>
@@ -20544,14 +19847,12 @@
           <w:rFonts w:ascii="Cambria" w:hAnsi="Cambria"/>
         </w:rPr>
       </w:pPr>
-      <w:proofErr w:type="gramStart"/>
       <w:r>
         <w:rPr>
           <w:rFonts w:ascii="Cambria" w:hAnsi="Cambria"/>
         </w:rPr>
         <w:t>For very small projects with only a few modules.</w:t>
       </w:r>
-      <w:proofErr w:type="gramEnd"/>
     </w:p>
     <w:p>
       <w:pPr>
@@ -20766,7 +20067,6 @@
         </w:rPr>
       </w:pPr>
       <w:proofErr w:type="spellStart"/>
-      <w:proofErr w:type="gramStart"/>
       <w:r>
         <w:rPr>
           <w:rStyle w:val="HTMLCode"/>
@@ -20775,7 +20075,6 @@
         <w:t>inngest</w:t>
       </w:r>
       <w:proofErr w:type="spellEnd"/>
-      <w:proofErr w:type="gramEnd"/>
       <w:r>
         <w:rPr>
           <w:rStyle w:val="HTMLCode"/>
@@ -20854,21 +20153,12 @@
           <w:rFonts w:ascii="Cambria" w:hAnsi="Cambria"/>
         </w:rPr>
       </w:pPr>
-      <w:proofErr w:type="gramStart"/>
-      <w:r>
-        <w:rPr>
-          <w:rStyle w:val="HTMLCode"/>
-          <w:rFonts w:ascii="Cambria" w:hAnsi="Cambria"/>
-        </w:rPr>
-        <w:t>client.js  →</w:t>
-      </w:r>
-      <w:proofErr w:type="gramEnd"/>
-      <w:r>
-        <w:rPr>
-          <w:rStyle w:val="HTMLCode"/>
-          <w:rFonts w:ascii="Cambria" w:hAnsi="Cambria"/>
-        </w:rPr>
-        <w:t xml:space="preserve"> creates the </w:t>
+      <w:r>
+        <w:rPr>
+          <w:rStyle w:val="HTMLCode"/>
+          <w:rFonts w:ascii="Cambria" w:hAnsi="Cambria"/>
+        </w:rPr>
+        <w:t xml:space="preserve">client.js  → creates the </w:t>
       </w:r>
       <w:proofErr w:type="spellStart"/>
       <w:r>
@@ -20927,21 +20217,12 @@
           <w:rFonts w:ascii="Cambria" w:hAnsi="Cambria"/>
         </w:rPr>
       </w:pPr>
-      <w:proofErr w:type="gramStart"/>
-      <w:r>
-        <w:rPr>
-          <w:rStyle w:val="HTMLCode"/>
-          <w:rFonts w:ascii="Cambria" w:hAnsi="Cambria"/>
-        </w:rPr>
-        <w:t>server.js  →</w:t>
-      </w:r>
-      <w:proofErr w:type="gramEnd"/>
-      <w:r>
-        <w:rPr>
-          <w:rStyle w:val="HTMLCode"/>
-          <w:rFonts w:ascii="Cambria" w:hAnsi="Cambria"/>
-        </w:rPr>
-        <w:t xml:space="preserve"> starts the server and registers the functions</w:t>
+      <w:r>
+        <w:rPr>
+          <w:rStyle w:val="HTMLCode"/>
+          <w:rFonts w:ascii="Cambria" w:hAnsi="Cambria"/>
+        </w:rPr>
+        <w:t>server.js  → starts the server and registers the functions</w:t>
       </w:r>
     </w:p>
     <w:p>
@@ -21135,6 +20416,1795 @@
           <w:rFonts w:ascii="Cambria" w:hAnsi="Cambria"/>
         </w:rPr>
       </w:pPr>
+    </w:p>
+    <w:p>
+      <w:pPr>
+        <w:rPr>
+          <w:rFonts w:ascii="Cambria" w:hAnsi="Cambria"/>
+        </w:rPr>
+      </w:pPr>
+    </w:p>
+    <w:p>
+      <w:pPr>
+        <w:rPr>
+          <w:rFonts w:ascii="Cambria" w:hAnsi="Cambria"/>
+        </w:rPr>
+      </w:pPr>
+    </w:p>
+    <w:p>
+      <w:pPr>
+        <w:rPr>
+          <w:rFonts w:ascii="Cambria" w:hAnsi="Cambria"/>
+        </w:rPr>
+      </w:pPr>
+    </w:p>
+    <w:p>
+      <w:pPr>
+        <w:rPr>
+          <w:rFonts w:ascii="Cambria" w:hAnsi="Cambria"/>
+        </w:rPr>
+      </w:pPr>
+    </w:p>
+    <w:p>
+      <w:pPr>
+        <w:rPr>
+          <w:rFonts w:ascii="Cambria" w:hAnsi="Cambria"/>
+        </w:rPr>
+      </w:pPr>
+    </w:p>
+    <w:p>
+      <w:pPr>
+        <w:rPr>
+          <w:rFonts w:ascii="Cambria" w:hAnsi="Cambria"/>
+        </w:rPr>
+      </w:pPr>
+    </w:p>
+    <w:p>
+      <w:pPr>
+        <w:rPr>
+          <w:rFonts w:ascii="Cambria" w:hAnsi="Cambria"/>
+        </w:rPr>
+      </w:pPr>
+    </w:p>
+    <w:p>
+      <w:pPr>
+        <w:rPr>
+          <w:rFonts w:ascii="Cambria" w:hAnsi="Cambria"/>
+        </w:rPr>
+      </w:pPr>
+    </w:p>
+    <w:p>
+      <w:pPr>
+        <w:rPr>
+          <w:rFonts w:ascii="Cambria" w:hAnsi="Cambria"/>
+        </w:rPr>
+      </w:pPr>
+    </w:p>
+    <w:p>
+      <w:pPr>
+        <w:rPr>
+          <w:rFonts w:ascii="Cambria" w:hAnsi="Cambria"/>
+        </w:rPr>
+      </w:pPr>
+    </w:p>
+    <w:p>
+      <w:pPr>
+        <w:rPr>
+          <w:rFonts w:ascii="Cambria" w:hAnsi="Cambria"/>
+        </w:rPr>
+      </w:pPr>
+    </w:p>
+    <w:p>
+      <w:pPr>
+        <w:rPr>
+          <w:rFonts w:ascii="Cambria" w:hAnsi="Cambria"/>
+        </w:rPr>
+      </w:pPr>
+    </w:p>
+    <w:p>
+      <w:pPr>
+        <w:rPr>
+          <w:rFonts w:ascii="Cambria" w:hAnsi="Cambria"/>
+        </w:rPr>
+      </w:pPr>
+    </w:p>
+    <w:p>
+      <w:pPr>
+        <w:rPr>
+          <w:rFonts w:ascii="Cambria" w:hAnsi="Cambria"/>
+        </w:rPr>
+      </w:pPr>
+    </w:p>
+    <w:p>
+      <w:pPr>
+        <w:rPr>
+          <w:rFonts w:ascii="Cambria" w:hAnsi="Cambria"/>
+        </w:rPr>
+      </w:pPr>
+    </w:p>
+    <w:p>
+      <w:pPr>
+        <w:rPr>
+          <w:rFonts w:ascii="Cambria" w:hAnsi="Cambria"/>
+        </w:rPr>
+      </w:pPr>
+    </w:p>
+    <w:p>
+      <w:pPr>
+        <w:rPr>
+          <w:rFonts w:ascii="Cambria" w:hAnsi="Cambria"/>
+        </w:rPr>
+      </w:pPr>
+    </w:p>
+    <w:p>
+      <w:pPr>
+        <w:rPr>
+          <w:rFonts w:ascii="Cambria" w:hAnsi="Cambria"/>
+        </w:rPr>
+      </w:pPr>
+    </w:p>
+    <w:p>
+      <w:pPr>
+        <w:rPr>
+          <w:rFonts w:ascii="Cambria" w:hAnsi="Cambria"/>
+        </w:rPr>
+      </w:pPr>
+    </w:p>
+    <w:p>
+      <w:pPr>
+        <w:rPr>
+          <w:rFonts w:ascii="Cambria" w:hAnsi="Cambria"/>
+        </w:rPr>
+      </w:pPr>
+    </w:p>
+    <w:p>
+      <w:pPr>
+        <w:rPr>
+          <w:rFonts w:ascii="Cambria" w:hAnsi="Cambria"/>
+        </w:rPr>
+      </w:pPr>
+    </w:p>
+    <w:p>
+      <w:pPr>
+        <w:rPr>
+          <w:rFonts w:ascii="Cambria" w:hAnsi="Cambria"/>
+        </w:rPr>
+      </w:pPr>
+    </w:p>
+    <w:p>
+      <w:pPr>
+        <w:rPr>
+          <w:rFonts w:ascii="Cambria" w:hAnsi="Cambria"/>
+        </w:rPr>
+      </w:pPr>
+    </w:p>
+    <w:p>
+      <w:pPr>
+        <w:rPr>
+          <w:rFonts w:ascii="Cambria" w:hAnsi="Cambria"/>
+        </w:rPr>
+      </w:pPr>
+    </w:p>
+    <w:p>
+      <w:pPr>
+        <w:rPr>
+          <w:rFonts w:ascii="Cambria" w:hAnsi="Cambria"/>
+        </w:rPr>
+      </w:pPr>
+    </w:p>
+    <w:p>
+      <w:pPr>
+        <w:pStyle w:val="Heading1"/>
+      </w:pPr>
+      <w:r>
+        <w:t>1</w:t>
+      </w:r>
+      <w:r>
+        <w:rPr>
+          <w:rFonts w:ascii="Cambria" w:hAnsi="Cambria" w:cs="Cambria"/>
+        </w:rPr>
+        <w:t>️</w:t>
+      </w:r>
+      <w:r>
+        <w:rPr>
+          <w:rFonts w:ascii="Tahoma" w:hAnsi="Tahoma" w:cs="Tahoma"/>
+        </w:rPr>
+        <w:t>⃣</w:t>
+      </w:r>
+      <w:r>
+        <w:t xml:space="preserve"> What workflow actually happened (end-to-end)</w:t>
+      </w:r>
+    </w:p>
+    <w:p>
+      <w:pPr>
+        <w:pStyle w:val="NormalWeb"/>
+      </w:pPr>
+      <w:r>
+        <w:t xml:space="preserve">Your current architecture is </w:t>
+      </w:r>
+      <w:r>
+        <w:rPr>
+          <w:rStyle w:val="Strong"/>
+        </w:rPr>
+        <w:t>event-driven</w:t>
+      </w:r>
+      <w:r>
+        <w:t>. The pipeline that ran is:</w:t>
+      </w:r>
+    </w:p>
+    <w:p>
+      <w:pPr>
+        <w:pStyle w:val="HTMLPreformatted"/>
+      </w:pPr>
+      <w:r>
+        <w:t>User signs up (Google / Clerk)</w:t>
+      </w:r>
+      <w:r>
+        <w:br/>
+        <w:t xml:space="preserve">        ↓</w:t>
+      </w:r>
+      <w:r>
+        <w:br/>
+        <w:t>Clerk creates the user</w:t>
+      </w:r>
+      <w:r>
+        <w:br/>
+        <w:t xml:space="preserve">        ↓</w:t>
+      </w:r>
+      <w:r>
+        <w:br/>
+        <w:t xml:space="preserve">Clerk fires event: </w:t>
+      </w:r>
+      <w:proofErr w:type="spellStart"/>
+      <w:r>
+        <w:t>user.created</w:t>
+      </w:r>
+      <w:proofErr w:type="spellEnd"/>
+      <w:r>
+        <w:br/>
+        <w:t xml:space="preserve">        ↓</w:t>
+      </w:r>
+      <w:r>
+        <w:br/>
+        <w:t xml:space="preserve">Clerk </w:t>
+      </w:r>
+      <w:proofErr w:type="spellStart"/>
+      <w:r>
+        <w:t>Webhook</w:t>
+      </w:r>
+      <w:proofErr w:type="spellEnd"/>
+      <w:r>
+        <w:t xml:space="preserve"> sends POST request</w:t>
+      </w:r>
+      <w:r>
+        <w:br/>
+        <w:t xml:space="preserve">        ↓</w:t>
+      </w:r>
+      <w:r>
+        <w:br/>
+        <w:t>https://&lt;ngrok-url&gt;/api/webhooks/clerk</w:t>
+      </w:r>
+      <w:r>
+        <w:br/>
+        <w:t xml:space="preserve">        ↓</w:t>
+      </w:r>
+      <w:r>
+        <w:br/>
+        <w:t xml:space="preserve">Express </w:t>
+      </w:r>
+      <w:proofErr w:type="spellStart"/>
+      <w:r>
+        <w:t>webhook</w:t>
+      </w:r>
+      <w:proofErr w:type="spellEnd"/>
+      <w:r>
+        <w:t xml:space="preserve"> adapter receives it</w:t>
+      </w:r>
+      <w:r>
+        <w:br/>
+        <w:t xml:space="preserve">        ↓</w:t>
+      </w:r>
+      <w:r>
+        <w:br/>
+      </w:r>
+      <w:proofErr w:type="spellStart"/>
+      <w:r>
+        <w:t>inngest.send</w:t>
+      </w:r>
+      <w:proofErr w:type="spellEnd"/>
+      <w:r>
+        <w:t>({ name: "clerk/</w:t>
+      </w:r>
+      <w:proofErr w:type="spellStart"/>
+      <w:r>
+        <w:t>user.created</w:t>
+      </w:r>
+      <w:proofErr w:type="spellEnd"/>
+      <w:r>
+        <w:t>" })</w:t>
+      </w:r>
+      <w:r>
+        <w:br/>
+        <w:t xml:space="preserve">        ↓</w:t>
+      </w:r>
+      <w:r>
+        <w:br/>
+      </w:r>
+      <w:proofErr w:type="spellStart"/>
+      <w:r>
+        <w:t>Inngest</w:t>
+      </w:r>
+      <w:proofErr w:type="spellEnd"/>
+      <w:r>
+        <w:t xml:space="preserve"> Dev Server receives event</w:t>
+      </w:r>
+      <w:r>
+        <w:br/>
+        <w:t xml:space="preserve">        ↓</w:t>
+      </w:r>
+      <w:r>
+        <w:br/>
+      </w:r>
+      <w:proofErr w:type="spellStart"/>
+      <w:r>
+        <w:t>userCreation</w:t>
+      </w:r>
+      <w:proofErr w:type="spellEnd"/>
+      <w:r>
+        <w:t xml:space="preserve"> function runs</w:t>
+      </w:r>
+      <w:r>
+        <w:br/>
+        <w:t xml:space="preserve">        ↓</w:t>
+      </w:r>
+      <w:r>
+        <w:br/>
+      </w:r>
+      <w:proofErr w:type="spellStart"/>
+      <w:r>
+        <w:t>Prisma</w:t>
+      </w:r>
+      <w:proofErr w:type="spellEnd"/>
+      <w:r>
+        <w:t xml:space="preserve"> inserts user</w:t>
+      </w:r>
+      <w:r>
+        <w:br/>
+        <w:t xml:space="preserve">        ↓</w:t>
+      </w:r>
+      <w:r>
+        <w:br/>
+        <w:t>Neon database updated</w:t>
+      </w:r>
+    </w:p>
+    <w:p>
+      <w:pPr>
+        <w:pStyle w:val="Heading1"/>
+      </w:pPr>
+      <w:r>
+        <w:rPr>
+          <w:rFonts w:ascii="Cambria" w:hAnsi="Cambria"/>
+        </w:rPr>
+        <w:br/>
+      </w:r>
+      <w:r>
+        <w:rPr>
+          <w:rFonts w:ascii="Cambria" w:hAnsi="Cambria"/>
+        </w:rPr>
+        <w:br/>
+      </w:r>
+      <w:r>
+        <w:rPr>
+          <w:rFonts w:ascii="Cambria" w:hAnsi="Cambria"/>
+        </w:rPr>
+        <w:br/>
+      </w:r>
+      <w:r>
+        <w:rPr>
+          <w:rFonts w:ascii="Cambria" w:hAnsi="Cambria"/>
+        </w:rPr>
+        <w:br/>
+      </w:r>
+      <w:r>
+        <w:rPr>
+          <w:rFonts w:ascii="Cambria" w:hAnsi="Cambria"/>
+        </w:rPr>
+        <w:br/>
+      </w:r>
+      <w:r>
+        <w:t>What actually happened in your current setup</w:t>
+      </w:r>
+    </w:p>
+    <w:p>
+      <w:pPr>
+        <w:pStyle w:val="NormalWeb"/>
+      </w:pPr>
+      <w:r>
+        <w:t>Right now your system flow is exactly this:</w:t>
+      </w:r>
+    </w:p>
+    <w:p>
+      <w:pPr>
+        <w:pStyle w:val="HTMLPreformatted"/>
+      </w:pPr>
+      <w:r>
+        <w:t>Clerk</w:t>
+      </w:r>
+      <w:r>
+        <w:br/>
+        <w:t xml:space="preserve">   ↓</w:t>
+      </w:r>
+      <w:r>
+        <w:br/>
+      </w:r>
+      <w:proofErr w:type="spellStart"/>
+      <w:r>
+        <w:t>Webhook</w:t>
+      </w:r>
+      <w:proofErr w:type="spellEnd"/>
+      <w:r>
+        <w:br/>
+        <w:t xml:space="preserve">   ↓</w:t>
+      </w:r>
+      <w:r>
+        <w:br/>
+      </w:r>
+      <w:proofErr w:type="spellStart"/>
+      <w:r>
+        <w:t>ngrok</w:t>
+      </w:r>
+      <w:proofErr w:type="spellEnd"/>
+      <w:r>
+        <w:t xml:space="preserve"> public URL</w:t>
+      </w:r>
+      <w:r>
+        <w:br/>
+        <w:t xml:space="preserve">   ↓</w:t>
+      </w:r>
+      <w:r>
+        <w:br/>
+        <w:t>localhost:5000/</w:t>
+      </w:r>
+      <w:proofErr w:type="spellStart"/>
+      <w:r>
+        <w:t>api</w:t>
+      </w:r>
+      <w:proofErr w:type="spellEnd"/>
+      <w:r>
+        <w:t>/</w:t>
+      </w:r>
+      <w:proofErr w:type="spellStart"/>
+      <w:r>
+        <w:t>webhooks</w:t>
+      </w:r>
+      <w:proofErr w:type="spellEnd"/>
+      <w:r>
+        <w:t>/clerk</w:t>
+      </w:r>
+      <w:r>
+        <w:br/>
+        <w:t xml:space="preserve">   ↓</w:t>
+      </w:r>
+      <w:r>
+        <w:br/>
+        <w:t xml:space="preserve">Express </w:t>
+      </w:r>
+      <w:proofErr w:type="spellStart"/>
+      <w:r>
+        <w:t>webhook</w:t>
+      </w:r>
+      <w:proofErr w:type="spellEnd"/>
+      <w:r>
+        <w:t xml:space="preserve"> adapter</w:t>
+      </w:r>
+      <w:r>
+        <w:br/>
+        <w:t xml:space="preserve">   ↓</w:t>
+      </w:r>
+      <w:r>
+        <w:br/>
+      </w:r>
+      <w:proofErr w:type="spellStart"/>
+      <w:r>
+        <w:t>inngest.send</w:t>
+      </w:r>
+      <w:proofErr w:type="spellEnd"/>
+      <w:r>
+        <w:t>()</w:t>
+      </w:r>
+      <w:r>
+        <w:br/>
+        <w:t xml:space="preserve">   ↓</w:t>
+      </w:r>
+      <w:r>
+        <w:br/>
+      </w:r>
+      <w:proofErr w:type="spellStart"/>
+      <w:r>
+        <w:t>Inngest</w:t>
+      </w:r>
+      <w:proofErr w:type="spellEnd"/>
+      <w:r>
+        <w:t xml:space="preserve"> Dev Server</w:t>
+      </w:r>
+      <w:r>
+        <w:br/>
+        <w:t xml:space="preserve">   ↓</w:t>
+      </w:r>
+      <w:r>
+        <w:br/>
+      </w:r>
+      <w:proofErr w:type="spellStart"/>
+      <w:r>
+        <w:t>userCreation</w:t>
+      </w:r>
+      <w:proofErr w:type="spellEnd"/>
+      <w:r>
+        <w:t>() function</w:t>
+      </w:r>
+      <w:r>
+        <w:br/>
+        <w:t xml:space="preserve">   ↓</w:t>
+      </w:r>
+      <w:r>
+        <w:br/>
+      </w:r>
+      <w:proofErr w:type="spellStart"/>
+      <w:r>
+        <w:t>Prisma</w:t>
+      </w:r>
+      <w:proofErr w:type="spellEnd"/>
+      <w:r>
+        <w:br/>
+        <w:t xml:space="preserve">   ↓</w:t>
+      </w:r>
+      <w:r>
+        <w:br/>
+        <w:t>Neon Database</w:t>
+      </w:r>
+    </w:p>
+    <w:p>
+      <w:pPr>
+        <w:pStyle w:val="NormalWeb"/>
+      </w:pPr>
+      <w:r>
+        <w:lastRenderedPageBreak/>
+        <w:t>From your screenshot we can confirm:</w:t>
+      </w:r>
+    </w:p>
+    <w:p>
+      <w:pPr>
+        <w:pStyle w:val="NormalWeb"/>
+      </w:pPr>
+      <w:r>
+        <w:rPr>
+          <w:rFonts w:ascii="MS Mincho" w:eastAsia="MS Mincho" w:hAnsi="MS Mincho" w:cs="MS Mincho" w:hint="eastAsia"/>
+        </w:rPr>
+        <w:t>✔</w:t>
+      </w:r>
+      <w:r>
+        <w:t xml:space="preserve"> Clerk → </w:t>
+      </w:r>
+      <w:proofErr w:type="spellStart"/>
+      <w:r>
+        <w:t>webhook</w:t>
+      </w:r>
+      <w:proofErr w:type="spellEnd"/>
+      <w:r>
+        <w:t xml:space="preserve"> triggered</w:t>
+      </w:r>
+      <w:r>
+        <w:br/>
+      </w:r>
+      <w:r>
+        <w:rPr>
+          <w:rFonts w:ascii="MS Mincho" w:eastAsia="MS Mincho" w:hAnsi="MS Mincho" w:cs="MS Mincho" w:hint="eastAsia"/>
+        </w:rPr>
+        <w:t>✔</w:t>
+      </w:r>
+      <w:r>
+        <w:t xml:space="preserve"> </w:t>
+      </w:r>
+      <w:proofErr w:type="spellStart"/>
+      <w:r>
+        <w:t>ngrok</w:t>
+      </w:r>
+      <w:proofErr w:type="spellEnd"/>
+      <w:r>
+        <w:t xml:space="preserve"> → request received</w:t>
+      </w:r>
+      <w:r>
+        <w:br/>
+      </w:r>
+      <w:r>
+        <w:rPr>
+          <w:rFonts w:ascii="MS Mincho" w:eastAsia="MS Mincho" w:hAnsi="MS Mincho" w:cs="MS Mincho" w:hint="eastAsia"/>
+        </w:rPr>
+        <w:t>✔</w:t>
+      </w:r>
+      <w:r>
+        <w:t xml:space="preserve"> </w:t>
+      </w:r>
+      <w:proofErr w:type="spellStart"/>
+      <w:r>
+        <w:t>Inngest</w:t>
+      </w:r>
+      <w:proofErr w:type="spellEnd"/>
+      <w:r>
+        <w:t xml:space="preserve"> → synced app</w:t>
+      </w:r>
+      <w:r>
+        <w:br/>
+      </w:r>
+      <w:r>
+        <w:rPr>
+          <w:rFonts w:ascii="MS Mincho" w:eastAsia="MS Mincho" w:hAnsi="MS Mincho" w:cs="MS Mincho" w:hint="eastAsia"/>
+        </w:rPr>
+        <w:t>✔</w:t>
+      </w:r>
+      <w:r>
+        <w:t xml:space="preserve"> function executed</w:t>
+      </w:r>
+      <w:r>
+        <w:br/>
+      </w:r>
+      <w:r>
+        <w:rPr>
+          <w:rFonts w:ascii="MS Mincho" w:eastAsia="MS Mincho" w:hAnsi="MS Mincho" w:cs="MS Mincho" w:hint="eastAsia"/>
+        </w:rPr>
+        <w:t>✔</w:t>
+      </w:r>
+      <w:r>
+        <w:t xml:space="preserve"> database saved user</w:t>
+      </w:r>
+    </w:p>
+    <w:p>
+      <w:pPr>
+        <w:pStyle w:val="Heading1"/>
+      </w:pPr>
+      <w:r>
+        <w:t xml:space="preserve">So </w:t>
+      </w:r>
+      <w:r>
+        <w:rPr>
+          <w:rStyle w:val="Strong"/>
+        </w:rPr>
+        <w:t>your backend pipeline is fully working</w:t>
+      </w:r>
+      <w:r>
+        <w:t>.</w:t>
+      </w:r>
+      <w:r>
+        <w:br/>
+      </w:r>
+      <w:r>
+        <w:br/>
+      </w:r>
+      <w:r>
+        <w:br/>
+      </w:r>
+      <w:r>
+        <w:br/>
+        <w:t xml:space="preserve">Why </w:t>
+      </w:r>
+      <w:proofErr w:type="spellStart"/>
+      <w:r>
+        <w:t>ngrok</w:t>
+      </w:r>
+      <w:proofErr w:type="spellEnd"/>
+      <w:r>
+        <w:t xml:space="preserve"> was needed</w:t>
+      </w:r>
+    </w:p>
+    <w:p>
+      <w:pPr>
+        <w:pStyle w:val="NormalWeb"/>
+      </w:pPr>
+      <w:r>
+        <w:t>Clerk servers are on the internet.</w:t>
+      </w:r>
+    </w:p>
+    <w:p>
+      <w:pPr>
+        <w:pStyle w:val="NormalWeb"/>
+      </w:pPr>
+      <w:r>
+        <w:t>But your backend was running locally:</w:t>
+      </w:r>
+    </w:p>
+    <w:p>
+      <w:pPr>
+        <w:pStyle w:val="HTMLPreformatted"/>
+      </w:pPr>
+      <w:r>
+        <w:t>http://localhost:5000</w:t>
+      </w:r>
+    </w:p>
+    <w:p>
+      <w:pPr>
+        <w:pStyle w:val="NormalWeb"/>
+      </w:pPr>
+      <w:r>
+        <w:t xml:space="preserve">Clerk cannot access </w:t>
+      </w:r>
+      <w:proofErr w:type="spellStart"/>
+      <w:r>
+        <w:t>localhost</w:t>
+      </w:r>
+      <w:proofErr w:type="spellEnd"/>
+      <w:r>
+        <w:t>.</w:t>
+      </w:r>
+    </w:p>
+    <w:p>
+      <w:pPr>
+        <w:pStyle w:val="NormalWeb"/>
+      </w:pPr>
+      <w:r>
+        <w:t xml:space="preserve">So we used </w:t>
+      </w:r>
+      <w:proofErr w:type="spellStart"/>
+      <w:r>
+        <w:rPr>
+          <w:rStyle w:val="Strong"/>
+        </w:rPr>
+        <w:t>ngrok</w:t>
+      </w:r>
+      <w:proofErr w:type="spellEnd"/>
+      <w:r>
+        <w:rPr>
+          <w:rStyle w:val="Strong"/>
+        </w:rPr>
+        <w:t xml:space="preserve"> as a tunnel</w:t>
+      </w:r>
+      <w:r>
+        <w:t>:</w:t>
+      </w:r>
+    </w:p>
+    <w:p>
+      <w:pPr>
+        <w:pStyle w:val="HTMLPreformatted"/>
+      </w:pPr>
+      <w:r>
+        <w:t xml:space="preserve">Internet → </w:t>
+      </w:r>
+      <w:proofErr w:type="spellStart"/>
+      <w:r>
+        <w:t>ngrok</w:t>
+      </w:r>
+      <w:proofErr w:type="spellEnd"/>
+      <w:r>
+        <w:t xml:space="preserve"> → </w:t>
+      </w:r>
+      <w:proofErr w:type="spellStart"/>
+      <w:r>
+        <w:t>localhost</w:t>
+      </w:r>
+      <w:proofErr w:type="spellEnd"/>
+    </w:p>
+    <w:p>
+      <w:pPr>
+        <w:pStyle w:val="NormalWeb"/>
+      </w:pPr>
+      <w:r>
+        <w:t xml:space="preserve">That’s why the </w:t>
+      </w:r>
+      <w:proofErr w:type="spellStart"/>
+      <w:r>
+        <w:t>webhook</w:t>
+      </w:r>
+      <w:proofErr w:type="spellEnd"/>
+      <w:r>
+        <w:t xml:space="preserve"> worked.</w:t>
+      </w:r>
+    </w:p>
+    <w:p>
+      <w:pPr>
+        <w:pStyle w:val="Heading1"/>
+      </w:pPr>
+      <w:r>
+        <w:br/>
+      </w:r>
+      <w:r>
+        <w:br/>
+      </w:r>
+      <w:r>
+        <w:br/>
+        <w:t xml:space="preserve">What changes after deployment to </w:t>
+      </w:r>
+      <w:proofErr w:type="spellStart"/>
+      <w:r>
+        <w:t>Vercel</w:t>
+      </w:r>
+      <w:proofErr w:type="spellEnd"/>
+    </w:p>
+    <w:p>
+      <w:pPr>
+        <w:pStyle w:val="NormalWeb"/>
+      </w:pPr>
+      <w:r>
+        <w:t xml:space="preserve">When you deploy backend to </w:t>
+      </w:r>
+      <w:proofErr w:type="spellStart"/>
+      <w:r>
+        <w:t>Vercel</w:t>
+      </w:r>
+      <w:proofErr w:type="spellEnd"/>
+      <w:r>
+        <w:t xml:space="preserve">, your server will have a </w:t>
+      </w:r>
+      <w:r>
+        <w:rPr>
+          <w:rStyle w:val="Strong"/>
+        </w:rPr>
+        <w:t>real public URL</w:t>
+      </w:r>
+      <w:r>
+        <w:t>.</w:t>
+      </w:r>
+    </w:p>
+    <w:p>
+      <w:pPr>
+        <w:pStyle w:val="NormalWeb"/>
+      </w:pPr>
+      <w:r>
+        <w:t>Example:</w:t>
+      </w:r>
+    </w:p>
+    <w:p>
+      <w:pPr>
+        <w:pStyle w:val="HTMLPreformatted"/>
+      </w:pPr>
+      <w:r>
+        <w:t>https://project-management-backend.vercel.app</w:t>
+      </w:r>
+    </w:p>
+    <w:p>
+      <w:pPr>
+        <w:pStyle w:val="NormalWeb"/>
+      </w:pPr>
+      <w:r>
+        <w:t xml:space="preserve">Now Clerk can call it </w:t>
+      </w:r>
+      <w:r>
+        <w:rPr>
+          <w:rStyle w:val="Strong"/>
+        </w:rPr>
+        <w:t>directly</w:t>
+      </w:r>
+      <w:r>
+        <w:t>.</w:t>
+      </w:r>
+    </w:p>
+    <w:p>
+      <w:pPr>
+        <w:pStyle w:val="NormalWeb"/>
+      </w:pPr>
+      <w:r>
+        <w:t>So the flow becomes:</w:t>
+      </w:r>
+    </w:p>
+    <w:p>
+      <w:pPr>
+        <w:pStyle w:val="HTMLPreformatted"/>
+      </w:pPr>
+      <w:r>
+        <w:t>Clerk</w:t>
+      </w:r>
+      <w:r>
+        <w:br/>
+        <w:t xml:space="preserve">   ↓</w:t>
+      </w:r>
+      <w:r>
+        <w:br/>
+      </w:r>
+      <w:proofErr w:type="spellStart"/>
+      <w:r>
+        <w:t>Webhook</w:t>
+      </w:r>
+      <w:proofErr w:type="spellEnd"/>
+      <w:r>
+        <w:br/>
+        <w:t xml:space="preserve">   ↓</w:t>
+      </w:r>
+      <w:r>
+        <w:br/>
+        <w:t>https://your-backend.vercel.app/api/webhooks/clerk</w:t>
+      </w:r>
+      <w:r>
+        <w:br/>
+        <w:t xml:space="preserve">   ↓</w:t>
+      </w:r>
+      <w:r>
+        <w:br/>
+      </w:r>
+      <w:r>
+        <w:lastRenderedPageBreak/>
+        <w:t>Express /</w:t>
+      </w:r>
+      <w:proofErr w:type="spellStart"/>
+      <w:r>
+        <w:t>api</w:t>
+      </w:r>
+      <w:proofErr w:type="spellEnd"/>
+      <w:r>
+        <w:t>/</w:t>
+      </w:r>
+      <w:proofErr w:type="spellStart"/>
+      <w:r>
+        <w:t>webhooks</w:t>
+      </w:r>
+      <w:proofErr w:type="spellEnd"/>
+      <w:r>
+        <w:t>/clerk</w:t>
+      </w:r>
+      <w:r>
+        <w:br/>
+        <w:t xml:space="preserve">   ↓</w:t>
+      </w:r>
+      <w:r>
+        <w:br/>
+      </w:r>
+      <w:proofErr w:type="spellStart"/>
+      <w:r>
+        <w:t>Inngest</w:t>
+      </w:r>
+      <w:proofErr w:type="spellEnd"/>
+      <w:r>
+        <w:br/>
+        <w:t xml:space="preserve">   ↓</w:t>
+      </w:r>
+      <w:r>
+        <w:br/>
+      </w:r>
+      <w:proofErr w:type="spellStart"/>
+      <w:r>
+        <w:t>Prisma</w:t>
+      </w:r>
+      <w:proofErr w:type="spellEnd"/>
+      <w:r>
+        <w:br/>
+        <w:t xml:space="preserve">   ↓</w:t>
+      </w:r>
+      <w:r>
+        <w:br/>
+        <w:t>Neon</w:t>
+      </w:r>
+    </w:p>
+    <w:p>
+      <w:pPr>
+        <w:pStyle w:val="NormalWeb"/>
+      </w:pPr>
+      <w:r>
+        <w:t xml:space="preserve">So </w:t>
+      </w:r>
+      <w:proofErr w:type="spellStart"/>
+      <w:r>
+        <w:rPr>
+          <w:rStyle w:val="Strong"/>
+        </w:rPr>
+        <w:t>ngrok</w:t>
+      </w:r>
+      <w:proofErr w:type="spellEnd"/>
+      <w:r>
+        <w:rPr>
+          <w:rStyle w:val="Strong"/>
+        </w:rPr>
+        <w:t xml:space="preserve"> is no longer needed</w:t>
+      </w:r>
+      <w:r>
+        <w:t>.</w:t>
+      </w:r>
+    </w:p>
+    <w:p>
+      <w:pPr>
+        <w:pStyle w:val="Heading1"/>
+      </w:pPr>
+      <w:r>
+        <w:br/>
+      </w:r>
+      <w:r>
+        <w:br/>
+      </w:r>
+      <w:r>
+        <w:br/>
+        <w:t xml:space="preserve">Where exactly you change the </w:t>
+      </w:r>
+      <w:proofErr w:type="spellStart"/>
+      <w:r>
+        <w:t>webhook</w:t>
+      </w:r>
+      <w:proofErr w:type="spellEnd"/>
+      <w:r>
+        <w:t xml:space="preserve"> URL</w:t>
+      </w:r>
+    </w:p>
+    <w:p>
+      <w:pPr>
+        <w:pStyle w:val="NormalWeb"/>
+      </w:pPr>
+      <w:r>
+        <w:t>Go to:</w:t>
+      </w:r>
+    </w:p>
+    <w:p>
+      <w:pPr>
+        <w:pStyle w:val="HTMLPreformatted"/>
+      </w:pPr>
+      <w:r>
+        <w:t>Clerk Dashboard</w:t>
+      </w:r>
+      <w:r>
+        <w:br/>
+        <w:t xml:space="preserve"> → </w:t>
+      </w:r>
+      <w:proofErr w:type="spellStart"/>
+      <w:r>
+        <w:t>Webhooks</w:t>
+      </w:r>
+      <w:proofErr w:type="spellEnd"/>
+    </w:p>
+    <w:p>
+      <w:pPr>
+        <w:pStyle w:val="NormalWeb"/>
+      </w:pPr>
+      <w:r>
+        <w:t>You currently have:</w:t>
+      </w:r>
+    </w:p>
+    <w:p>
+      <w:pPr>
+        <w:pStyle w:val="HTMLPreformatted"/>
+      </w:pPr>
+      <w:r>
+        <w:t>https://janna-blastoporic-dylan.ngrok-free.dev/api/webhooks/clerk</w:t>
+      </w:r>
+    </w:p>
+    <w:p>
+      <w:pPr>
+        <w:pStyle w:val="NormalWeb"/>
+      </w:pPr>
+      <w:r>
+        <w:t>After deployment change it to:</w:t>
+      </w:r>
+    </w:p>
+    <w:p>
+      <w:pPr>
+        <w:pStyle w:val="HTMLPreformatted"/>
+      </w:pPr>
+      <w:r>
+        <w:t>https://your-backend.vercel.app/api/webhooks/clerk</w:t>
+      </w:r>
+    </w:p>
+    <w:p>
+      <w:pPr>
+        <w:pStyle w:val="NormalWeb"/>
+      </w:pPr>
+      <w:r>
+        <w:t xml:space="preserve">That is the </w:t>
+      </w:r>
+      <w:r>
+        <w:rPr>
+          <w:rStyle w:val="Strong"/>
+        </w:rPr>
+        <w:t>only change required</w:t>
+      </w:r>
+      <w:r>
+        <w:t>.</w:t>
+      </w:r>
+    </w:p>
+    <w:p>
+      <w:pPr>
+        <w:pStyle w:val="NormalWeb"/>
+      </w:pPr>
+      <w:r>
+        <w:t xml:space="preserve">Your backend code </w:t>
+      </w:r>
+      <w:r>
+        <w:rPr>
+          <w:rStyle w:val="Strong"/>
+        </w:rPr>
+        <w:t>does not change</w:t>
+      </w:r>
+      <w:r>
+        <w:t>.</w:t>
+      </w:r>
+    </w:p>
+    <w:p>
+      <w:pPr>
+        <w:pStyle w:val="Heading1"/>
+      </w:pPr>
+      <w:r>
+        <w:br/>
+      </w:r>
+      <w:r>
+        <w:br/>
+      </w:r>
+      <w:r>
+        <w:br/>
+        <w:t xml:space="preserve">What changes in </w:t>
+      </w:r>
+      <w:proofErr w:type="spellStart"/>
+      <w:r>
+        <w:t>Inngest</w:t>
+      </w:r>
+      <w:proofErr w:type="spellEnd"/>
+      <w:r>
+        <w:t xml:space="preserve"> after deployment</w:t>
+      </w:r>
+    </w:p>
+    <w:p>
+      <w:pPr>
+        <w:pStyle w:val="NormalWeb"/>
+      </w:pPr>
+      <w:r>
+        <w:t xml:space="preserve">Right now </w:t>
+      </w:r>
+      <w:proofErr w:type="spellStart"/>
+      <w:r>
+        <w:t>Inngest</w:t>
+      </w:r>
+      <w:proofErr w:type="spellEnd"/>
+      <w:r>
+        <w:t xml:space="preserve"> synced your </w:t>
+      </w:r>
+      <w:r>
+        <w:rPr>
+          <w:rStyle w:val="Strong"/>
+        </w:rPr>
+        <w:t>local server</w:t>
+      </w:r>
+      <w:r>
+        <w:t>:</w:t>
+      </w:r>
+    </w:p>
+    <w:p>
+      <w:pPr>
+        <w:pStyle w:val="HTMLPreformatted"/>
+      </w:pPr>
+      <w:r>
+        <w:t>http://localhost:5000/api/inngest</w:t>
+      </w:r>
+    </w:p>
+    <w:p>
+      <w:pPr>
+        <w:pStyle w:val="NormalWeb"/>
+      </w:pPr>
+      <w:r>
+        <w:t>You saw that in your screenshot:</w:t>
+      </w:r>
+    </w:p>
+    <w:p>
+      <w:pPr>
+        <w:pStyle w:val="HTMLPreformatted"/>
+      </w:pPr>
+      <w:r>
+        <w:t>project-management</w:t>
+      </w:r>
+      <w:r>
+        <w:br/>
+        <w:t>http://localhost:5000/api/inngest</w:t>
+      </w:r>
+    </w:p>
+    <w:p>
+      <w:pPr>
+        <w:pStyle w:val="NormalWeb"/>
+      </w:pPr>
+      <w:r>
+        <w:t>After deployment you must run:</w:t>
+      </w:r>
+    </w:p>
+    <w:p>
+      <w:pPr>
+        <w:pStyle w:val="HTMLPreformatted"/>
+      </w:pPr>
+      <w:proofErr w:type="spellStart"/>
+      <w:r>
+        <w:t>npx</w:t>
+      </w:r>
+      <w:proofErr w:type="spellEnd"/>
+      <w:r>
+        <w:t xml:space="preserve"> </w:t>
+      </w:r>
+      <w:proofErr w:type="spellStart"/>
+      <w:r>
+        <w:t>inngest-cli</w:t>
+      </w:r>
+      <w:proofErr w:type="spellEnd"/>
+      <w:r>
+        <w:t xml:space="preserve"> dev -u https://your-backend.vercel.app/api/inngest</w:t>
+      </w:r>
+    </w:p>
+    <w:p>
+      <w:pPr>
+        <w:pStyle w:val="NormalWeb"/>
+      </w:pPr>
+      <w:r>
+        <w:t xml:space="preserve">Then </w:t>
+      </w:r>
+      <w:proofErr w:type="spellStart"/>
+      <w:r>
+        <w:t>Inngest</w:t>
+      </w:r>
+      <w:proofErr w:type="spellEnd"/>
+      <w:r>
+        <w:t xml:space="preserve"> will sync the </w:t>
+      </w:r>
+      <w:r>
+        <w:rPr>
+          <w:rStyle w:val="Strong"/>
+        </w:rPr>
+        <w:t>production endpoint</w:t>
+      </w:r>
+      <w:r>
+        <w:t>.</w:t>
+      </w:r>
+    </w:p>
+    <w:p>
+      <w:pPr>
+        <w:pStyle w:val="Heading1"/>
+      </w:pPr>
+      <w:r>
+        <w:lastRenderedPageBreak/>
+        <w:br/>
+        <w:t>Correct production architecture</w:t>
+      </w:r>
+    </w:p>
+    <w:p>
+      <w:pPr>
+        <w:pStyle w:val="NormalWeb"/>
+      </w:pPr>
+      <w:r>
+        <w:t>After deployment it becomes:</w:t>
+      </w:r>
+    </w:p>
+    <w:p>
+      <w:pPr>
+        <w:pStyle w:val="HTMLPreformatted"/>
+      </w:pPr>
+      <w:r>
+        <w:t>Frontend (React + Clerk)</w:t>
+      </w:r>
+      <w:r>
+        <w:br/>
+        <w:t xml:space="preserve">        ↓</w:t>
+      </w:r>
+      <w:r>
+        <w:br/>
+        <w:t>Clerk Auth</w:t>
+      </w:r>
+      <w:r>
+        <w:br/>
+        <w:t xml:space="preserve">        ↓</w:t>
+      </w:r>
+      <w:r>
+        <w:br/>
+        <w:t xml:space="preserve">Clerk </w:t>
+      </w:r>
+      <w:proofErr w:type="spellStart"/>
+      <w:r>
+        <w:t>Webhook</w:t>
+      </w:r>
+      <w:proofErr w:type="spellEnd"/>
+      <w:r>
+        <w:br/>
+        <w:t xml:space="preserve">        ↓</w:t>
+      </w:r>
+      <w:r>
+        <w:br/>
+      </w:r>
+      <w:proofErr w:type="spellStart"/>
+      <w:r>
+        <w:t>Vercel</w:t>
+      </w:r>
+      <w:proofErr w:type="spellEnd"/>
+      <w:r>
+        <w:t xml:space="preserve"> Backend</w:t>
+      </w:r>
+      <w:r>
+        <w:br/>
+        <w:t>/</w:t>
+      </w:r>
+      <w:proofErr w:type="spellStart"/>
+      <w:r>
+        <w:t>api</w:t>
+      </w:r>
+      <w:proofErr w:type="spellEnd"/>
+      <w:r>
+        <w:t>/</w:t>
+      </w:r>
+      <w:proofErr w:type="spellStart"/>
+      <w:r>
+        <w:t>webhooks</w:t>
+      </w:r>
+      <w:proofErr w:type="spellEnd"/>
+      <w:r>
+        <w:t>/clerk</w:t>
+      </w:r>
+      <w:r>
+        <w:br/>
+        <w:t xml:space="preserve">        ↓</w:t>
+      </w:r>
+      <w:r>
+        <w:br/>
+      </w:r>
+      <w:proofErr w:type="spellStart"/>
+      <w:r>
+        <w:t>Inngest</w:t>
+      </w:r>
+      <w:proofErr w:type="spellEnd"/>
+      <w:r>
+        <w:t xml:space="preserve"> Event Bus</w:t>
+      </w:r>
+      <w:r>
+        <w:br/>
+        <w:t xml:space="preserve">        ↓</w:t>
+      </w:r>
+      <w:r>
+        <w:br/>
+      </w:r>
+      <w:proofErr w:type="spellStart"/>
+      <w:r>
+        <w:t>Inngest</w:t>
+      </w:r>
+      <w:proofErr w:type="spellEnd"/>
+      <w:r>
+        <w:t xml:space="preserve"> Functions</w:t>
+      </w:r>
+      <w:r>
+        <w:br/>
+        <w:t xml:space="preserve">        ↓</w:t>
+      </w:r>
+      <w:r>
+        <w:br/>
+      </w:r>
+      <w:proofErr w:type="spellStart"/>
+      <w:r>
+        <w:t>Prisma</w:t>
+      </w:r>
+      <w:proofErr w:type="spellEnd"/>
+      <w:r>
+        <w:br/>
+        <w:t xml:space="preserve">        ↓</w:t>
+      </w:r>
+      <w:r>
+        <w:br/>
+        <w:t xml:space="preserve">Neon </w:t>
+      </w:r>
+      <w:proofErr w:type="spellStart"/>
+      <w:r>
+        <w:t>PostgreSQL</w:t>
+      </w:r>
+      <w:proofErr w:type="spellEnd"/>
+    </w:p>
+    <w:p>
+      <w:pPr>
+        <w:pStyle w:val="NormalWeb"/>
+      </w:pPr>
+      <w:r>
+        <w:t xml:space="preserve">This is </w:t>
+      </w:r>
+      <w:r>
+        <w:rPr>
+          <w:rStyle w:val="Strong"/>
+        </w:rPr>
+        <w:t xml:space="preserve">exactly how </w:t>
+      </w:r>
+      <w:proofErr w:type="spellStart"/>
+      <w:r>
+        <w:rPr>
+          <w:rStyle w:val="Strong"/>
+        </w:rPr>
+        <w:t>SaaS</w:t>
+      </w:r>
+      <w:proofErr w:type="spellEnd"/>
+      <w:r>
+        <w:rPr>
+          <w:rStyle w:val="Strong"/>
+        </w:rPr>
+        <w:t xml:space="preserve"> apps work</w:t>
+      </w:r>
+      <w:r>
+        <w:t>.</w:t>
+      </w:r>
+    </w:p>
+    <w:p>
+      <w:pPr>
+        <w:pStyle w:val="Heading2"/>
+      </w:pPr>
+      <w:r>
+        <w:br/>
+      </w:r>
+      <w:r>
+        <w:br/>
+      </w:r>
+      <w:r>
+        <w:br/>
+      </w:r>
+      <w:r>
+        <w:br/>
+      </w:r>
+      <w:r>
+        <w:t xml:space="preserve">Restart </w:t>
+      </w:r>
+      <w:proofErr w:type="spellStart"/>
+      <w:r>
+        <w:t>Inngest</w:t>
+      </w:r>
+      <w:proofErr w:type="spellEnd"/>
+      <w:r>
+        <w:t xml:space="preserve"> Dev Server (IMPORTANT)</w:t>
+      </w:r>
+    </w:p>
+    <w:p>
+      <w:pPr>
+        <w:spacing w:before="100" w:beforeAutospacing="1" w:after="100" w:afterAutospacing="1" w:line="240" w:lineRule="auto"/>
+        <w:rPr>
+          <w:rFonts w:ascii="Times New Roman" w:eastAsia="Times New Roman" w:hAnsi="Times New Roman" w:cs="Times New Roman"/>
+          <w:sz w:val="24"/>
+          <w:szCs w:val="24"/>
+        </w:rPr>
+      </w:pPr>
+      <w:r>
+        <w:rPr>
+          <w:rFonts w:ascii="Times New Roman" w:eastAsia="Times New Roman" w:hAnsi="Times New Roman" w:cs="Times New Roman"/>
+          <w:sz w:val="24"/>
+          <w:szCs w:val="24"/>
+        </w:rPr>
+        <w:t xml:space="preserve">Run this </w:t>
+      </w:r>
+      <w:r>
+        <w:rPr>
+          <w:rFonts w:ascii="Times New Roman" w:eastAsia="Times New Roman" w:hAnsi="Times New Roman" w:cs="Times New Roman"/>
+          <w:b/>
+          <w:bCs/>
+          <w:sz w:val="24"/>
+          <w:szCs w:val="24"/>
+        </w:rPr>
+        <w:t>from backend folder</w:t>
+      </w:r>
+      <w:r>
+        <w:rPr>
+          <w:rFonts w:ascii="Times New Roman" w:eastAsia="Times New Roman" w:hAnsi="Times New Roman" w:cs="Times New Roman"/>
+          <w:sz w:val="24"/>
+          <w:szCs w:val="24"/>
+        </w:rPr>
+        <w:t>:</w:t>
+      </w:r>
+    </w:p>
+    <w:p>
+      <w:pPr>
+        <w:tabs>
+          <w:tab w:val="left" w:pos="916"/>
+          <w:tab w:val="left" w:pos="1832"/>
+          <w:tab w:val="left" w:pos="2748"/>
+          <w:tab w:val="left" w:pos="3664"/>
+          <w:tab w:val="left" w:pos="4580"/>
+          <w:tab w:val="left" w:pos="5496"/>
+          <w:tab w:val="left" w:pos="6412"/>
+          <w:tab w:val="left" w:pos="7328"/>
+          <w:tab w:val="left" w:pos="8244"/>
+          <w:tab w:val="left" w:pos="9160"/>
+          <w:tab w:val="left" w:pos="10076"/>
+          <w:tab w:val="left" w:pos="10992"/>
+          <w:tab w:val="left" w:pos="11908"/>
+          <w:tab w:val="left" w:pos="12824"/>
+          <w:tab w:val="left" w:pos="13740"/>
+          <w:tab w:val="left" w:pos="14656"/>
+        </w:tabs>
+        <w:spacing w:after="0" w:line="240" w:lineRule="auto"/>
+        <w:rPr>
+          <w:rFonts w:ascii="Courier New" w:eastAsia="Times New Roman" w:hAnsi="Courier New" w:cs="Courier New"/>
+          <w:sz w:val="20"/>
+          <w:szCs w:val="20"/>
+        </w:rPr>
+      </w:pPr>
+      <w:proofErr w:type="spellStart"/>
+      <w:r>
+        <w:rPr>
+          <w:rFonts w:ascii="Courier New" w:eastAsia="Times New Roman" w:hAnsi="Courier New" w:cs="Courier New"/>
+          <w:sz w:val="20"/>
+          <w:szCs w:val="20"/>
+        </w:rPr>
+        <w:t>npx</w:t>
+      </w:r>
+      <w:proofErr w:type="spellEnd"/>
+      <w:r>
+        <w:rPr>
+          <w:rFonts w:ascii="Courier New" w:eastAsia="Times New Roman" w:hAnsi="Courier New" w:cs="Courier New"/>
+          <w:sz w:val="20"/>
+          <w:szCs w:val="20"/>
+        </w:rPr>
+        <w:t xml:space="preserve"> </w:t>
+      </w:r>
+      <w:proofErr w:type="spellStart"/>
+      <w:r>
+        <w:rPr>
+          <w:rFonts w:ascii="Courier New" w:eastAsia="Times New Roman" w:hAnsi="Courier New" w:cs="Courier New"/>
+          <w:sz w:val="20"/>
+          <w:szCs w:val="20"/>
+        </w:rPr>
+        <w:t>inngest-cli@latest</w:t>
+      </w:r>
+      <w:proofErr w:type="spellEnd"/>
+      <w:r>
+        <w:rPr>
+          <w:rFonts w:ascii="Courier New" w:eastAsia="Times New Roman" w:hAnsi="Courier New" w:cs="Courier New"/>
+          <w:sz w:val="20"/>
+          <w:szCs w:val="20"/>
+        </w:rPr>
+        <w:t xml:space="preserve"> dev -u http://localhost:5000/api/inngest</w:t>
+      </w:r>
+    </w:p>
+    <w:p>
+      <w:pPr>
+        <w:spacing w:before="100" w:beforeAutospacing="1" w:after="100" w:afterAutospacing="1" w:line="240" w:lineRule="auto"/>
+        <w:rPr>
+          <w:rFonts w:ascii="Times New Roman" w:eastAsia="Times New Roman" w:hAnsi="Times New Roman" w:cs="Times New Roman"/>
+          <w:sz w:val="24"/>
+          <w:szCs w:val="24"/>
+        </w:rPr>
+      </w:pPr>
+      <w:r>
+        <w:rPr>
+          <w:rFonts w:ascii="Times New Roman" w:eastAsia="Times New Roman" w:hAnsi="Times New Roman" w:cs="Times New Roman"/>
+          <w:sz w:val="24"/>
+          <w:szCs w:val="24"/>
+        </w:rPr>
+        <w:t xml:space="preserve">This </w:t>
+      </w:r>
+      <w:r>
+        <w:rPr>
+          <w:rFonts w:ascii="Courier New" w:eastAsia="Times New Roman" w:hAnsi="Courier New" w:cs="Courier New"/>
+          <w:sz w:val="20"/>
+        </w:rPr>
+        <w:t>-u</w:t>
+      </w:r>
+      <w:r>
+        <w:rPr>
+          <w:rFonts w:ascii="Times New Roman" w:eastAsia="Times New Roman" w:hAnsi="Times New Roman" w:cs="Times New Roman"/>
+          <w:sz w:val="24"/>
+          <w:szCs w:val="24"/>
+        </w:rPr>
+        <w:t xml:space="preserve"> flag is </w:t>
+      </w:r>
+      <w:r>
+        <w:rPr>
+          <w:rFonts w:ascii="Times New Roman" w:eastAsia="Times New Roman" w:hAnsi="Times New Roman" w:cs="Times New Roman"/>
+          <w:b/>
+          <w:bCs/>
+          <w:sz w:val="24"/>
+          <w:szCs w:val="24"/>
+        </w:rPr>
+        <w:t>VERY important</w:t>
+      </w:r>
+      <w:r>
+        <w:rPr>
+          <w:rFonts w:ascii="Times New Roman" w:eastAsia="Times New Roman" w:hAnsi="Times New Roman" w:cs="Times New Roman"/>
+          <w:sz w:val="24"/>
+          <w:szCs w:val="24"/>
+        </w:rPr>
+        <w:t>.</w:t>
+      </w:r>
+    </w:p>
+    <w:p>
+      <w:pPr>
+        <w:spacing w:before="100" w:beforeAutospacing="1" w:after="100" w:afterAutospacing="1" w:line="240" w:lineRule="auto"/>
+        <w:rPr>
+          <w:rFonts w:ascii="Times New Roman" w:eastAsia="Times New Roman" w:hAnsi="Times New Roman" w:cs="Times New Roman"/>
+          <w:sz w:val="24"/>
+          <w:szCs w:val="24"/>
+        </w:rPr>
+      </w:pPr>
+      <w:r>
+        <w:rPr>
+          <w:rFonts w:ascii="Times New Roman" w:eastAsia="Times New Roman" w:hAnsi="Times New Roman" w:cs="Times New Roman"/>
+          <w:sz w:val="24"/>
+          <w:szCs w:val="24"/>
+        </w:rPr>
+        <w:t xml:space="preserve">It tells </w:t>
+      </w:r>
+      <w:proofErr w:type="spellStart"/>
+      <w:r>
+        <w:rPr>
+          <w:rFonts w:ascii="Times New Roman" w:eastAsia="Times New Roman" w:hAnsi="Times New Roman" w:cs="Times New Roman"/>
+          <w:sz w:val="24"/>
+          <w:szCs w:val="24"/>
+        </w:rPr>
+        <w:t>Inngest</w:t>
+      </w:r>
+      <w:proofErr w:type="spellEnd"/>
+      <w:r>
+        <w:rPr>
+          <w:rFonts w:ascii="Times New Roman" w:eastAsia="Times New Roman" w:hAnsi="Times New Roman" w:cs="Times New Roman"/>
+          <w:sz w:val="24"/>
+          <w:szCs w:val="24"/>
+        </w:rPr>
+        <w:t xml:space="preserve"> where your functions are.</w:t>
+      </w:r>
+    </w:p>
+    <w:p>
+      <w:pPr>
+        <w:spacing w:before="100" w:beforeAutospacing="1" w:after="100" w:afterAutospacing="1" w:line="240" w:lineRule="auto"/>
+        <w:rPr>
+          <w:rFonts w:ascii="Times New Roman" w:eastAsia="Times New Roman" w:hAnsi="Times New Roman" w:cs="Times New Roman"/>
+          <w:sz w:val="24"/>
+          <w:szCs w:val="24"/>
+        </w:rPr>
+      </w:pPr>
+      <w:r>
+        <w:rPr>
+          <w:rFonts w:ascii="Times New Roman" w:eastAsia="Times New Roman" w:hAnsi="Times New Roman" w:cs="Times New Roman"/>
+          <w:sz w:val="24"/>
+          <w:szCs w:val="24"/>
+        </w:rPr>
+        <w:t>You should see something like:</w:t>
+      </w:r>
+    </w:p>
+    <w:p>
+      <w:pPr>
+        <w:tabs>
+          <w:tab w:val="left" w:pos="916"/>
+          <w:tab w:val="left" w:pos="1832"/>
+          <w:tab w:val="left" w:pos="2748"/>
+          <w:tab w:val="left" w:pos="3664"/>
+          <w:tab w:val="left" w:pos="4580"/>
+          <w:tab w:val="left" w:pos="5496"/>
+          <w:tab w:val="left" w:pos="6412"/>
+          <w:tab w:val="left" w:pos="7328"/>
+          <w:tab w:val="left" w:pos="8244"/>
+          <w:tab w:val="left" w:pos="9160"/>
+          <w:tab w:val="left" w:pos="10076"/>
+          <w:tab w:val="left" w:pos="10992"/>
+          <w:tab w:val="left" w:pos="11908"/>
+          <w:tab w:val="left" w:pos="12824"/>
+          <w:tab w:val="left" w:pos="13740"/>
+          <w:tab w:val="left" w:pos="14656"/>
+        </w:tabs>
+        <w:spacing w:after="0" w:line="240" w:lineRule="auto"/>
+        <w:rPr>
+          <w:rFonts w:ascii="Courier New" w:eastAsia="Times New Roman" w:hAnsi="Courier New" w:cs="Courier New"/>
+          <w:sz w:val="20"/>
+          <w:szCs w:val="20"/>
+        </w:rPr>
+      </w:pPr>
+      <w:r>
+        <w:rPr>
+          <w:rFonts w:ascii="MS Mincho" w:eastAsia="MS Mincho" w:hAnsi="MS Mincho" w:cs="MS Mincho" w:hint="eastAsia"/>
+          <w:sz w:val="20"/>
+          <w:szCs w:val="20"/>
+        </w:rPr>
+        <w:t>✔</w:t>
+      </w:r>
+      <w:r>
+        <w:rPr>
+          <w:rFonts w:ascii="Courier New" w:eastAsia="Times New Roman" w:hAnsi="Courier New" w:cs="Courier New"/>
+          <w:sz w:val="20"/>
+          <w:szCs w:val="20"/>
+        </w:rPr>
+        <w:t xml:space="preserve"> Connected to http://localhost:5000/api/inngest</w:t>
+      </w:r>
+      <w:r>
+        <w:rPr>
+          <w:rFonts w:ascii="Courier New" w:eastAsia="Times New Roman" w:hAnsi="Courier New" w:cs="Courier New"/>
+          <w:sz w:val="20"/>
+          <w:szCs w:val="20"/>
+        </w:rPr>
+        <w:br/>
+      </w:r>
+      <w:r>
+        <w:rPr>
+          <w:rFonts w:ascii="MS Mincho" w:eastAsia="MS Mincho" w:hAnsi="MS Mincho" w:cs="MS Mincho" w:hint="eastAsia"/>
+          <w:sz w:val="20"/>
+          <w:szCs w:val="20"/>
+        </w:rPr>
+        <w:t>✔</w:t>
+      </w:r>
+      <w:r>
+        <w:rPr>
+          <w:rFonts w:ascii="Courier New" w:eastAsia="Times New Roman" w:hAnsi="Courier New" w:cs="Courier New"/>
+          <w:sz w:val="20"/>
+          <w:szCs w:val="20"/>
+        </w:rPr>
+        <w:t xml:space="preserve"> Discovered 3 functions</w:t>
+      </w:r>
+    </w:p>
+    <w:p>
+      <w:pPr>
+        <w:spacing w:before="100" w:beforeAutospacing="1" w:after="100" w:afterAutospacing="1" w:line="240" w:lineRule="auto"/>
+        <w:rPr>
+          <w:rFonts w:ascii="Times New Roman" w:eastAsia="Times New Roman" w:hAnsi="Times New Roman" w:cs="Times New Roman"/>
+          <w:sz w:val="24"/>
+          <w:szCs w:val="24"/>
+        </w:rPr>
+      </w:pPr>
+      <w:r>
+        <w:rPr>
+          <w:rFonts w:ascii="Times New Roman" w:eastAsia="Times New Roman" w:hAnsi="Times New Roman" w:cs="Times New Roman"/>
+          <w:sz w:val="24"/>
+          <w:szCs w:val="24"/>
+        </w:rPr>
+        <w:t>Those 3 should be:</w:t>
+      </w:r>
+    </w:p>
+    <w:p>
+      <w:pPr>
+        <w:tabs>
+          <w:tab w:val="left" w:pos="916"/>
+          <w:tab w:val="left" w:pos="1832"/>
+          <w:tab w:val="left" w:pos="2748"/>
+          <w:tab w:val="left" w:pos="3664"/>
+          <w:tab w:val="left" w:pos="4580"/>
+          <w:tab w:val="left" w:pos="5496"/>
+          <w:tab w:val="left" w:pos="6412"/>
+          <w:tab w:val="left" w:pos="7328"/>
+          <w:tab w:val="left" w:pos="8244"/>
+          <w:tab w:val="left" w:pos="9160"/>
+          <w:tab w:val="left" w:pos="10076"/>
+          <w:tab w:val="left" w:pos="10992"/>
+          <w:tab w:val="left" w:pos="11908"/>
+          <w:tab w:val="left" w:pos="12824"/>
+          <w:tab w:val="left" w:pos="13740"/>
+          <w:tab w:val="left" w:pos="14656"/>
+        </w:tabs>
+        <w:spacing w:after="0" w:line="240" w:lineRule="auto"/>
+        <w:rPr>
+          <w:rFonts w:ascii="Courier New" w:eastAsia="Times New Roman" w:hAnsi="Courier New" w:cs="Courier New"/>
+          <w:sz w:val="20"/>
+          <w:szCs w:val="20"/>
+        </w:rPr>
+      </w:pPr>
+      <w:r>
+        <w:rPr>
+          <w:rFonts w:ascii="Courier New" w:eastAsia="Times New Roman" w:hAnsi="Courier New" w:cs="Courier New"/>
+          <w:sz w:val="20"/>
+          <w:szCs w:val="20"/>
+        </w:rPr>
+        <w:t>clerk-user-created</w:t>
+      </w:r>
+      <w:r>
+        <w:rPr>
+          <w:rFonts w:ascii="Courier New" w:eastAsia="Times New Roman" w:hAnsi="Courier New" w:cs="Courier New"/>
+          <w:sz w:val="20"/>
+          <w:szCs w:val="20"/>
+        </w:rPr>
+        <w:br/>
+        <w:t>clerk-user-updated</w:t>
+      </w:r>
+      <w:r>
+        <w:rPr>
+          <w:rFonts w:ascii="Courier New" w:eastAsia="Times New Roman" w:hAnsi="Courier New" w:cs="Courier New"/>
+          <w:sz w:val="20"/>
+          <w:szCs w:val="20"/>
+        </w:rPr>
+        <w:br/>
+        <w:t>clerk-user-deleted</w:t>
+      </w:r>
+    </w:p>
+    <w:p>
+      <w:pPr>
+        <w:pStyle w:val="NormalWeb"/>
+      </w:pPr>
+    </w:p>
+    <w:p>
+      <w:pPr>
+        <w:rPr>
+          <w:rFonts w:ascii="Cambria" w:hAnsi="Cambria"/>
+        </w:rPr>
+      </w:pPr>
+      <w:r>
+        <w:rPr>
+          <w:rFonts w:ascii="Cambria" w:hAnsi="Cambria"/>
+        </w:rPr>
+        <w:lastRenderedPageBreak/>
+        <w:br/>
+      </w:r>
+      <w:r>
+        <w:rPr>
+          <w:rFonts w:ascii="Cambria" w:hAnsi="Cambria"/>
+        </w:rPr>
+        <w:br/>
+      </w:r>
     </w:p>
     <w:sectPr>
       <w:pgSz w:w="12240" w:h="15840" w:code="1"/>
@@ -29146,6 +30216,11 @@
     <w:basedOn w:val="DefaultParagraphFont"/>
     <w:rsid w:val="00E06097"/>
   </w:style>
+  <w:style w:type="character" w:customStyle="1" w:styleId="u">
+    <w:name w:val="ͼu"/>
+    <w:basedOn w:val="DefaultParagraphFont"/>
+    <w:rsid w:val="00C10EEA"/>
+  </w:style>
 </w:styles>
 </file>
 

</xml_diff>

<commit_message>
feat(workspace): implement workspace sync with Clerk organizations (#1)
- add Inngest function for organization.created to create workspace
- add idempotent upsert logic for workspace creation
- add workspace owner as ADMIN member in WorkspaceMember table
- implement organization.updated event to sync workspace metadata
- implement organization.deleted event to remove workspace
- add organizationMembership.created event to sync workspace members
- ensure retry-safe operations using step.run and upsert
</commit_message>
<xml_diff>
--- a/notes.docx
+++ b/notes.docx
@@ -196,7 +196,6 @@
           <w:szCs w:val="27"/>
         </w:rPr>
       </w:pPr>
-      <w:proofErr w:type="gramStart"/>
       <w:r>
         <w:rPr>
           <w:rFonts w:ascii="Times New Roman" w:eastAsia="Times New Roman" w:hAnsi="Times New Roman" w:cs="Times New Roman"/>
@@ -235,18 +234,7 @@
           <w:sz w:val="27"/>
           <w:szCs w:val="27"/>
         </w:rPr>
-        <w:t>Without</w:t>
-      </w:r>
-      <w:proofErr w:type="gramEnd"/>
-      <w:r>
-        <w:rPr>
-          <w:rFonts w:ascii="Cambria" w:eastAsia="Times New Roman" w:hAnsi="Cambria" w:cs="Times New Roman"/>
-          <w:b/>
-          <w:bCs/>
-          <w:sz w:val="27"/>
-          <w:szCs w:val="27"/>
-        </w:rPr>
-        <w:t xml:space="preserve"> ORM (Raw SQL)</w:t>
+        <w:t>Without ORM (Raw SQL)</w:t>
       </w:r>
     </w:p>
     <w:p>
@@ -539,19 +527,11 @@
         </w:rPr>
         <w:t xml:space="preserve"> </w:t>
       </w:r>
-      <w:proofErr w:type="gramStart"/>
-      <w:r>
-        <w:rPr>
-          <w:rFonts w:ascii="Cambria" w:hAnsi="Cambria"/>
-        </w:rPr>
-        <w:t>With</w:t>
-      </w:r>
-      <w:proofErr w:type="gramEnd"/>
-      <w:r>
-        <w:rPr>
-          <w:rFonts w:ascii="Cambria" w:hAnsi="Cambria"/>
-        </w:rPr>
-        <w:t xml:space="preserve"> ORM</w:t>
+      <w:r>
+        <w:rPr>
+          <w:rFonts w:ascii="Cambria" w:hAnsi="Cambria"/>
+        </w:rPr>
+        <w:t>With ORM</w:t>
       </w:r>
     </w:p>
     <w:p>
@@ -565,7 +545,6 @@
         </w:rPr>
       </w:pPr>
       <w:proofErr w:type="spellStart"/>
-      <w:proofErr w:type="gramStart"/>
       <w:r>
         <w:rPr>
           <w:rStyle w:val="hljs-title"/>
@@ -601,17 +580,7 @@
           <w:color w:val="0070C0"/>
           <w:sz w:val="22"/>
         </w:rPr>
-        <w:t>(</w:t>
-      </w:r>
-      <w:proofErr w:type="gramEnd"/>
-      <w:r>
-        <w:rPr>
-          <w:rStyle w:val="HTMLCode"/>
-          <w:rFonts w:ascii="Cambria" w:hAnsi="Cambria"/>
-          <w:color w:val="0070C0"/>
-          <w:sz w:val="22"/>
-        </w:rPr>
-        <w:t xml:space="preserve">{ </w:t>
+        <w:t xml:space="preserve">({ </w:t>
       </w:r>
       <w:r>
         <w:rPr>
@@ -1204,20 +1173,8 @@
           <w:sz w:val="24"/>
           <w:szCs w:val="24"/>
         </w:rPr>
-        <w:t xml:space="preserve"> uses ODM (Mongoose</w:t>
-      </w:r>
-      <w:proofErr w:type="gramStart"/>
-      <w:r>
-        <w:rPr>
-          <w:rFonts w:ascii="Cambria" w:eastAsia="Times New Roman" w:hAnsi="Cambria" w:cs="Times New Roman"/>
-          <w:b/>
-          <w:bCs/>
-          <w:sz w:val="24"/>
-          <w:szCs w:val="24"/>
-        </w:rPr>
-        <w:t>)</w:t>
-      </w:r>
-      <w:proofErr w:type="gramEnd"/>
+        <w:t xml:space="preserve"> uses ODM (Mongoose)</w:t>
+      </w:r>
       <w:r>
         <w:rPr>
           <w:rFonts w:ascii="Cambria" w:eastAsia="Times New Roman" w:hAnsi="Cambria" w:cs="Times New Roman"/>
@@ -2377,7 +2334,6 @@
           <w:szCs w:val="24"/>
         </w:rPr>
       </w:pPr>
-      <w:proofErr w:type="gramStart"/>
       <w:r>
         <w:rPr>
           <w:rFonts w:ascii="Cambria" w:eastAsia="Times New Roman" w:hAnsi="Cambria" w:cs="Times New Roman"/>
@@ -2386,7 +2342,6 @@
         </w:rPr>
         <w:t>Auto-generated JS/TS client used in backend code.</w:t>
       </w:r>
-      <w:proofErr w:type="gramEnd"/>
     </w:p>
     <w:p>
       <w:pPr>
@@ -2432,7 +2387,6 @@
           <w:color w:val="0070C0"/>
         </w:rPr>
       </w:pPr>
-      <w:proofErr w:type="gramStart"/>
       <w:r>
         <w:rPr>
           <w:rFonts w:ascii="Cambria" w:eastAsia="Times New Roman" w:hAnsi="Cambria" w:cs="Courier New"/>
@@ -2441,7 +2395,6 @@
         </w:rPr>
         <w:t>const</w:t>
       </w:r>
-      <w:proofErr w:type="gramEnd"/>
       <w:r>
         <w:rPr>
           <w:rFonts w:ascii="Cambria" w:eastAsia="Times New Roman" w:hAnsi="Cambria" w:cs="Courier New"/>
@@ -2537,7 +2490,6 @@
         </w:rPr>
         <w:t xml:space="preserve">  </w:t>
       </w:r>
-      <w:proofErr w:type="gramStart"/>
       <w:r>
         <w:rPr>
           <w:rFonts w:ascii="Cambria" w:eastAsia="Times New Roman" w:hAnsi="Cambria" w:cs="Courier New"/>
@@ -2546,7 +2498,6 @@
         </w:rPr>
         <w:t>where</w:t>
       </w:r>
-      <w:proofErr w:type="gramEnd"/>
       <w:r>
         <w:rPr>
           <w:rFonts w:ascii="Cambria" w:eastAsia="Times New Roman" w:hAnsi="Cambria" w:cs="Courier New"/>
@@ -2711,7 +2662,6 @@
         </w:rPr>
       </w:pPr>
       <w:proofErr w:type="spellStart"/>
-      <w:proofErr w:type="gramStart"/>
       <w:r>
         <w:rPr>
           <w:rFonts w:ascii="Cambria" w:eastAsia="Times New Roman" w:hAnsi="Cambria" w:cs="Courier New"/>
@@ -2728,7 +2678,6 @@
         <w:t>px</w:t>
       </w:r>
       <w:proofErr w:type="spellEnd"/>
-      <w:proofErr w:type="gramEnd"/>
       <w:r>
         <w:rPr>
           <w:rFonts w:ascii="Cambria" w:eastAsia="Times New Roman" w:hAnsi="Cambria" w:cs="Courier New"/>
@@ -3379,7 +3328,6 @@
           <w:sz w:val="22"/>
         </w:rPr>
       </w:pPr>
-      <w:proofErr w:type="gramStart"/>
       <w:r>
         <w:rPr>
           <w:rStyle w:val="hljs-keyword"/>
@@ -3389,7 +3337,6 @@
         </w:rPr>
         <w:t>await</w:t>
       </w:r>
-      <w:proofErr w:type="gramEnd"/>
       <w:r>
         <w:rPr>
           <w:rStyle w:val="HTMLCode"/>
@@ -3466,7 +3413,6 @@
         </w:rPr>
         <w:t xml:space="preserve">  </w:t>
       </w:r>
-      <w:proofErr w:type="gramStart"/>
       <w:r>
         <w:rPr>
           <w:rStyle w:val="hljs-attr"/>
@@ -3476,7 +3422,6 @@
         </w:rPr>
         <w:t>data</w:t>
       </w:r>
-      <w:proofErr w:type="gramEnd"/>
       <w:r>
         <w:rPr>
           <w:rStyle w:val="HTMLCode"/>
@@ -3612,7 +3557,6 @@
           <w:sz w:val="22"/>
         </w:rPr>
       </w:pPr>
-      <w:proofErr w:type="gramStart"/>
       <w:r>
         <w:rPr>
           <w:rStyle w:val="hljs-keyword"/>
@@ -3622,7 +3566,6 @@
         </w:rPr>
         <w:t>await</w:t>
       </w:r>
-      <w:proofErr w:type="gramEnd"/>
       <w:r>
         <w:rPr>
           <w:rStyle w:val="HTMLCode"/>
@@ -3706,7 +3649,6 @@
           <w:sz w:val="22"/>
         </w:rPr>
       </w:pPr>
-      <w:proofErr w:type="gramStart"/>
       <w:r>
         <w:rPr>
           <w:rStyle w:val="hljs-keyword"/>
@@ -3716,7 +3658,6 @@
         </w:rPr>
         <w:t>await</w:t>
       </w:r>
-      <w:proofErr w:type="gramEnd"/>
       <w:r>
         <w:rPr>
           <w:rStyle w:val="HTMLCode"/>
@@ -3793,7 +3734,6 @@
         </w:rPr>
         <w:t xml:space="preserve">  </w:t>
       </w:r>
-      <w:proofErr w:type="gramStart"/>
       <w:r>
         <w:rPr>
           <w:rStyle w:val="hljs-attr"/>
@@ -3803,7 +3743,6 @@
         </w:rPr>
         <w:t>where</w:t>
       </w:r>
-      <w:proofErr w:type="gramEnd"/>
       <w:r>
         <w:rPr>
           <w:rStyle w:val="HTMLCode"/>
@@ -3869,7 +3808,6 @@
         </w:rPr>
         <w:t xml:space="preserve">  </w:t>
       </w:r>
-      <w:proofErr w:type="gramStart"/>
       <w:r>
         <w:rPr>
           <w:rStyle w:val="hljs-attr"/>
@@ -3879,7 +3817,6 @@
         </w:rPr>
         <w:t>data</w:t>
       </w:r>
-      <w:proofErr w:type="gramEnd"/>
       <w:r>
         <w:rPr>
           <w:rStyle w:val="HTMLCode"/>
@@ -3970,7 +3907,6 @@
           <w:sz w:val="22"/>
         </w:rPr>
       </w:pPr>
-      <w:proofErr w:type="gramStart"/>
       <w:r>
         <w:rPr>
           <w:rStyle w:val="hljs-keyword"/>
@@ -3980,7 +3916,6 @@
         </w:rPr>
         <w:t>await</w:t>
       </w:r>
-      <w:proofErr w:type="gramEnd"/>
       <w:r>
         <w:rPr>
           <w:rStyle w:val="HTMLCode"/>
@@ -4057,7 +3992,6 @@
         </w:rPr>
         <w:t xml:space="preserve">  </w:t>
       </w:r>
-      <w:proofErr w:type="gramStart"/>
       <w:r>
         <w:rPr>
           <w:rStyle w:val="hljs-attr"/>
@@ -4067,7 +4001,6 @@
         </w:rPr>
         <w:t>where</w:t>
       </w:r>
-      <w:proofErr w:type="gramEnd"/>
       <w:r>
         <w:rPr>
           <w:rStyle w:val="HTMLCode"/>
@@ -4896,16 +4829,8 @@
         <w:rPr>
           <w:rFonts w:ascii="Cambria" w:hAnsi="Cambria"/>
         </w:rPr>
-        <w:t xml:space="preserve"> In simple words</w:t>
-      </w:r>
-      <w:proofErr w:type="gramStart"/>
-      <w:r>
-        <w:rPr>
-          <w:rFonts w:ascii="Cambria" w:hAnsi="Cambria"/>
-        </w:rPr>
-        <w:t>:</w:t>
-      </w:r>
-      <w:proofErr w:type="gramEnd"/>
+        <w:t xml:space="preserve"> In simple words:</w:t>
+      </w:r>
       <w:r>
         <w:rPr>
           <w:rFonts w:ascii="Cambria" w:hAnsi="Cambria"/>
@@ -4963,21 +4888,7 @@
         <w:rPr>
           <w:rFonts w:ascii="Cambria" w:hAnsi="Cambria"/>
         </w:rPr>
-        <w:t xml:space="preserve"> </w:t>
-      </w:r>
-      <w:proofErr w:type="gramStart"/>
-      <w:r>
-        <w:rPr>
-          <w:rFonts w:ascii="Cambria" w:hAnsi="Cambria"/>
-        </w:rPr>
-        <w:t>Without</w:t>
-      </w:r>
-      <w:proofErr w:type="gramEnd"/>
-      <w:r>
-        <w:rPr>
-          <w:rFonts w:ascii="Cambria" w:hAnsi="Cambria"/>
-        </w:rPr>
-        <w:t xml:space="preserve"> Clerk (Manual Auth)</w:t>
+        <w:t xml:space="preserve"> Without Clerk (Manual Auth)</w:t>
       </w:r>
     </w:p>
     <w:p>
@@ -5186,7 +5097,6 @@
         </w:rPr>
         <w:br/>
       </w:r>
-      <w:proofErr w:type="gramStart"/>
       <w:r>
         <w:rPr>
           <w:color w:val="FF0000"/>
@@ -5204,14 +5114,7 @@
         <w:rPr>
           <w:rFonts w:ascii="Cambria" w:hAnsi="Cambria"/>
         </w:rPr>
-        <w:t>Security</w:t>
-      </w:r>
-      <w:proofErr w:type="gramEnd"/>
-      <w:r>
-        <w:rPr>
-          <w:rFonts w:ascii="Cambria" w:hAnsi="Cambria"/>
-        </w:rPr>
-        <w:t xml:space="preserve"> risks</w:t>
+        <w:t>Security risks</w:t>
       </w:r>
     </w:p>
     <w:p>
@@ -5236,7 +5139,6 @@
           <w:rFonts w:ascii="Cambria" w:hAnsi="Cambria"/>
         </w:rPr>
       </w:pPr>
-      <w:proofErr w:type="gramStart"/>
       <w:r>
         <w:t>✅</w:t>
       </w:r>
@@ -5244,14 +5146,7 @@
         <w:rPr>
           <w:rFonts w:ascii="Cambria" w:hAnsi="Cambria"/>
         </w:rPr>
-        <w:t xml:space="preserve">  With</w:t>
-      </w:r>
-      <w:proofErr w:type="gramEnd"/>
-      <w:r>
-        <w:rPr>
-          <w:rFonts w:ascii="Cambria" w:hAnsi="Cambria"/>
-        </w:rPr>
-        <w:t xml:space="preserve"> Clerk</w:t>
+        <w:t xml:space="preserve">  With Clerk</w:t>
       </w:r>
     </w:p>
     <w:p>
@@ -7675,7 +7570,6 @@
           <w:rFonts w:ascii="Cambria" w:hAnsi="Cambria"/>
         </w:rPr>
       </w:pPr>
-      <w:proofErr w:type="gramStart"/>
       <w:r>
         <w:t>✅</w:t>
       </w:r>
@@ -7683,14 +7577,7 @@
         <w:rPr>
           <w:rFonts w:ascii="Cambria" w:hAnsi="Cambria"/>
         </w:rPr>
-        <w:t xml:space="preserve">  Use</w:t>
-      </w:r>
-      <w:proofErr w:type="gramEnd"/>
-      <w:r>
-        <w:rPr>
-          <w:rFonts w:ascii="Cambria" w:hAnsi="Cambria"/>
-        </w:rPr>
-        <w:t xml:space="preserve"> Clerk when:</w:t>
+        <w:t xml:space="preserve">  Use Clerk when:</w:t>
       </w:r>
     </w:p>
     <w:p>
@@ -7802,7 +7689,6 @@
           <w:rFonts w:ascii="Cambria" w:hAnsi="Cambria"/>
         </w:rPr>
       </w:pPr>
-      <w:proofErr w:type="gramStart"/>
       <w:r>
         <w:t>❌</w:t>
       </w:r>
@@ -7810,14 +7696,7 @@
         <w:rPr>
           <w:rFonts w:ascii="Cambria" w:hAnsi="Cambria"/>
         </w:rPr>
-        <w:t xml:space="preserve">  Avoid</w:t>
-      </w:r>
-      <w:proofErr w:type="gramEnd"/>
-      <w:r>
-        <w:rPr>
-          <w:rFonts w:ascii="Cambria" w:hAnsi="Cambria"/>
-        </w:rPr>
-        <w:t xml:space="preserve"> Clerk when:</w:t>
+        <w:t xml:space="preserve">  Avoid Clerk when:</w:t>
       </w:r>
     </w:p>
     <w:p>
@@ -8120,19 +7999,11 @@
           <w:color w:val="0070C0"/>
         </w:rPr>
       </w:pPr>
-      <w:proofErr w:type="gramStart"/>
-      <w:r>
-        <w:rPr>
-          <w:rFonts w:ascii="Cambria" w:hAnsi="Cambria"/>
-        </w:rPr>
-        <w:t>this</w:t>
-      </w:r>
-      <w:proofErr w:type="gramEnd"/>
-      <w:r>
-        <w:rPr>
-          <w:rFonts w:ascii="Cambria" w:hAnsi="Cambria"/>
-        </w:rPr>
-        <w:t xml:space="preserve"> entire app uses authentication</w:t>
+      <w:r>
+        <w:rPr>
+          <w:rFonts w:ascii="Cambria" w:hAnsi="Cambria"/>
+        </w:rPr>
+        <w:t>this entire app uses authentication</w:t>
       </w:r>
     </w:p>
     <w:p>
@@ -8231,14 +8102,12 @@
           <w:rFonts w:ascii="Cambria" w:hAnsi="Cambria"/>
         </w:rPr>
       </w:pPr>
-      <w:proofErr w:type="gramStart"/>
       <w:r>
         <w:rPr>
           <w:rFonts w:ascii="Cambria" w:hAnsi="Cambria"/>
         </w:rPr>
         <w:t>A live network link between your backend app and the database.</w:t>
       </w:r>
-      <w:proofErr w:type="gramEnd"/>
     </w:p>
     <w:p>
       <w:pPr>
@@ -8890,21 +8759,7 @@
         <w:rPr>
           <w:rFonts w:ascii="Cambria" w:hAnsi="Cambria"/>
         </w:rPr>
-        <w:t xml:space="preserve"> “</w:t>
-      </w:r>
-      <w:proofErr w:type="gramStart"/>
-      <w:r>
-        <w:rPr>
-          <w:rFonts w:ascii="Cambria" w:hAnsi="Cambria"/>
-        </w:rPr>
-        <w:t>server</w:t>
-      </w:r>
-      <w:proofErr w:type="gramEnd"/>
-      <w:r>
-        <w:rPr>
-          <w:rFonts w:ascii="Cambria" w:hAnsi="Cambria"/>
-        </w:rPr>
-        <w:t xml:space="preserve"> stays alive, so DB connections are reused.”</w:t>
+        <w:t xml:space="preserve"> “server stays alive, so DB connections are reused.”</w:t>
       </w:r>
     </w:p>
     <w:p>
@@ -9947,29 +9802,7 @@
           <w:sz w:val="36"/>
           <w:szCs w:val="36"/>
         </w:rPr>
-        <w:t xml:space="preserve">Connection String — </w:t>
-      </w:r>
-      <w:proofErr w:type="gramStart"/>
-      <w:r>
-        <w:rPr>
-          <w:rFonts w:ascii="Cambria" w:eastAsia="Times New Roman" w:hAnsi="Cambria" w:cs="Times New Roman"/>
-          <w:b/>
-          <w:bCs/>
-          <w:sz w:val="36"/>
-          <w:szCs w:val="36"/>
-        </w:rPr>
-        <w:t>Why</w:t>
-      </w:r>
-      <w:proofErr w:type="gramEnd"/>
-      <w:r>
-        <w:rPr>
-          <w:rFonts w:ascii="Cambria" w:eastAsia="Times New Roman" w:hAnsi="Cambria" w:cs="Times New Roman"/>
-          <w:b/>
-          <w:bCs/>
-          <w:sz w:val="36"/>
-          <w:szCs w:val="36"/>
-        </w:rPr>
-        <w:t xml:space="preserve"> it Matters So Much</w:t>
+        <w:t>Connection String — Why it Matters So Much</w:t>
       </w:r>
     </w:p>
     <w:p>
@@ -11060,7 +10893,6 @@
           <w:szCs w:val="27"/>
         </w:rPr>
       </w:pPr>
-      <w:proofErr w:type="gramStart"/>
       <w:r>
         <w:rPr>
           <w:rFonts w:ascii="Times New Roman" w:eastAsia="Times New Roman" w:hAnsi="Times New Roman" w:cs="Times New Roman"/>
@@ -11079,18 +10911,7 @@
           <w:sz w:val="27"/>
           <w:szCs w:val="27"/>
         </w:rPr>
-        <w:t xml:space="preserve">  BAD</w:t>
-      </w:r>
-      <w:proofErr w:type="gramEnd"/>
-      <w:r>
-        <w:rPr>
-          <w:rFonts w:ascii="Cambria" w:eastAsia="Times New Roman" w:hAnsi="Cambria" w:cs="Times New Roman"/>
-          <w:b/>
-          <w:bCs/>
-          <w:sz w:val="27"/>
-          <w:szCs w:val="27"/>
-        </w:rPr>
-        <w:t xml:space="preserve"> (</w:t>
+        <w:t xml:space="preserve">  BAD (</w:t>
       </w:r>
       <w:proofErr w:type="spellStart"/>
       <w:r>
@@ -11141,7 +10962,6 @@
           <w:color w:val="0070C0"/>
         </w:rPr>
       </w:pPr>
-      <w:proofErr w:type="gramStart"/>
       <w:r>
         <w:rPr>
           <w:rFonts w:ascii="Cambria" w:eastAsia="Times New Roman" w:hAnsi="Cambria" w:cs="Courier New"/>
@@ -11150,7 +10970,6 @@
         </w:rPr>
         <w:t>const</w:t>
       </w:r>
-      <w:proofErr w:type="gramEnd"/>
       <w:r>
         <w:rPr>
           <w:rFonts w:ascii="Cambria" w:eastAsia="Times New Roman" w:hAnsi="Cambria" w:cs="Courier New"/>
@@ -11219,7 +11038,6 @@
           <w:szCs w:val="27"/>
         </w:rPr>
       </w:pPr>
-      <w:proofErr w:type="gramStart"/>
       <w:r>
         <w:rPr>
           <w:rFonts w:ascii="Times New Roman" w:eastAsia="Times New Roman" w:hAnsi="Times New Roman" w:cs="Times New Roman"/>
@@ -11238,18 +11056,7 @@
           <w:sz w:val="27"/>
           <w:szCs w:val="27"/>
         </w:rPr>
-        <w:t xml:space="preserve">  GOOD</w:t>
-      </w:r>
-      <w:proofErr w:type="gramEnd"/>
-      <w:r>
-        <w:rPr>
-          <w:rFonts w:ascii="Cambria" w:eastAsia="Times New Roman" w:hAnsi="Cambria" w:cs="Times New Roman"/>
-          <w:b/>
-          <w:bCs/>
-          <w:sz w:val="27"/>
-          <w:szCs w:val="27"/>
-        </w:rPr>
-        <w:t xml:space="preserve"> (</w:t>
+        <w:t xml:space="preserve">  GOOD (</w:t>
       </w:r>
       <w:proofErr w:type="spellStart"/>
       <w:r>
@@ -11300,7 +11107,6 @@
           <w:color w:val="0070C0"/>
         </w:rPr>
       </w:pPr>
-      <w:proofErr w:type="gramStart"/>
       <w:r>
         <w:rPr>
           <w:rFonts w:ascii="Cambria" w:eastAsia="Times New Roman" w:hAnsi="Cambria" w:cs="Courier New"/>
@@ -11309,7 +11115,6 @@
         </w:rPr>
         <w:t>const</w:t>
       </w:r>
-      <w:proofErr w:type="gramEnd"/>
       <w:r>
         <w:rPr>
           <w:rFonts w:ascii="Cambria" w:eastAsia="Times New Roman" w:hAnsi="Cambria" w:cs="Courier New"/>
@@ -12695,19 +12500,11 @@
           <w:rFonts w:ascii="Cambria" w:hAnsi="Cambria"/>
         </w:rPr>
       </w:pPr>
-      <w:proofErr w:type="gramStart"/>
-      <w:r>
-        <w:rPr>
-          <w:rFonts w:ascii="Cambria" w:hAnsi="Cambria"/>
-        </w:rPr>
-        <w:t>insight</w:t>
-      </w:r>
-      <w:proofErr w:type="gramEnd"/>
-      <w:r>
-        <w:rPr>
-          <w:rFonts w:ascii="Cambria" w:hAnsi="Cambria"/>
-        </w:rPr>
-        <w:t>:</w:t>
+      <w:r>
+        <w:rPr>
+          <w:rFonts w:ascii="Cambria" w:hAnsi="Cambria"/>
+        </w:rPr>
+        <w:t>insight:</w:t>
       </w:r>
     </w:p>
     <w:p>
@@ -13687,19 +13484,8 @@
           <w:sz w:val="24"/>
           <w:szCs w:val="24"/>
         </w:rPr>
-        <w:t>Summary</w:t>
-      </w:r>
-      <w:proofErr w:type="gramStart"/>
-      <w:r>
-        <w:rPr>
-          <w:rFonts w:ascii="Cambria" w:eastAsia="Times New Roman" w:hAnsi="Cambria" w:cs="Times New Roman"/>
-          <w:b/>
-          <w:sz w:val="24"/>
-          <w:szCs w:val="24"/>
-        </w:rPr>
-        <w:t>:</w:t>
-      </w:r>
-      <w:proofErr w:type="gramEnd"/>
+        <w:t>Summary:</w:t>
+      </w:r>
       <w:r>
         <w:rPr>
           <w:rFonts w:ascii="Cambria" w:eastAsia="Times New Roman" w:hAnsi="Cambria" w:cs="Times New Roman"/>
@@ -13832,7 +13618,6 @@
         <w:t xml:space="preserve">What is </w:t>
       </w:r>
       <w:proofErr w:type="spellStart"/>
-      <w:proofErr w:type="gramStart"/>
       <w:r>
         <w:rPr>
           <w:rFonts w:ascii="Cambria" w:eastAsia="Times New Roman" w:hAnsi="Cambria" w:cs="Courier New"/>
@@ -13865,7 +13650,6 @@
         </w:rPr>
         <w:t>?</w:t>
       </w:r>
-      <w:proofErr w:type="gramEnd"/>
     </w:p>
     <w:p>
       <w:pPr>
@@ -13877,7 +13661,6 @@
         </w:rPr>
       </w:pPr>
       <w:proofErr w:type="spellStart"/>
-      <w:proofErr w:type="gramStart"/>
       <w:r>
         <w:rPr>
           <w:rFonts w:ascii="Cambria" w:eastAsia="Times New Roman" w:hAnsi="Cambria" w:cs="Courier New"/>
@@ -13886,7 +13669,6 @@
         <w:t>schema.prisma</w:t>
       </w:r>
       <w:proofErr w:type="spellEnd"/>
-      <w:proofErr w:type="gramEnd"/>
       <w:r>
         <w:rPr>
           <w:rFonts w:ascii="Cambria" w:eastAsia="Times New Roman" w:hAnsi="Cambria" w:cs="Times New Roman"/>
@@ -14037,17 +13819,8 @@
           <w:rFonts w:ascii="Cambria" w:eastAsia="Times New Roman" w:hAnsi="Cambria" w:cs="Times New Roman"/>
           <w:szCs w:val="24"/>
         </w:rPr>
-        <w:t xml:space="preserve"> between</w:t>
-      </w:r>
-      <w:proofErr w:type="gramStart"/>
-      <w:r>
-        <w:rPr>
-          <w:rFonts w:ascii="Cambria" w:eastAsia="Times New Roman" w:hAnsi="Cambria" w:cs="Times New Roman"/>
-          <w:szCs w:val="24"/>
-        </w:rPr>
-        <w:t>:</w:t>
-      </w:r>
-      <w:proofErr w:type="gramEnd"/>
+        <w:t xml:space="preserve"> between:</w:t>
+      </w:r>
       <w:r>
         <w:rPr>
           <w:rFonts w:ascii="Cambria" w:eastAsia="Times New Roman" w:hAnsi="Cambria" w:cs="Times New Roman"/>
@@ -14531,9 +14304,19 @@
           <w:sz w:val="36"/>
           <w:szCs w:val="36"/>
         </w:rPr>
-        <w:t xml:space="preserve">What Problems </w:t>
-      </w:r>
-      <w:proofErr w:type="gramStart"/>
+        <w:t xml:space="preserve">What Problems Does </w:t>
+      </w:r>
+      <w:proofErr w:type="spellStart"/>
+      <w:r>
+        <w:rPr>
+          <w:rFonts w:ascii="Cambria" w:eastAsia="Times New Roman" w:hAnsi="Cambria" w:cs="Courier New"/>
+          <w:b/>
+          <w:bCs/>
+          <w:sz w:val="20"/>
+        </w:rPr>
+        <w:t>schema.prisma</w:t>
+      </w:r>
+      <w:proofErr w:type="spellEnd"/>
       <w:r>
         <w:rPr>
           <w:rFonts w:ascii="Cambria" w:eastAsia="Times New Roman" w:hAnsi="Cambria" w:cs="Times New Roman"/>
@@ -14542,38 +14325,6 @@
           <w:sz w:val="36"/>
           <w:szCs w:val="36"/>
         </w:rPr>
-        <w:t>Does</w:t>
-      </w:r>
-      <w:proofErr w:type="gramEnd"/>
-      <w:r>
-        <w:rPr>
-          <w:rFonts w:ascii="Cambria" w:eastAsia="Times New Roman" w:hAnsi="Cambria" w:cs="Times New Roman"/>
-          <w:b/>
-          <w:bCs/>
-          <w:sz w:val="36"/>
-          <w:szCs w:val="36"/>
-        </w:rPr>
-        <w:t xml:space="preserve"> </w:t>
-      </w:r>
-      <w:proofErr w:type="spellStart"/>
-      <w:r>
-        <w:rPr>
-          <w:rFonts w:ascii="Cambria" w:eastAsia="Times New Roman" w:hAnsi="Cambria" w:cs="Courier New"/>
-          <w:b/>
-          <w:bCs/>
-          <w:sz w:val="20"/>
-        </w:rPr>
-        <w:t>schema.prisma</w:t>
-      </w:r>
-      <w:proofErr w:type="spellEnd"/>
-      <w:r>
-        <w:rPr>
-          <w:rFonts w:ascii="Cambria" w:eastAsia="Times New Roman" w:hAnsi="Cambria" w:cs="Times New Roman"/>
-          <w:b/>
-          <w:bCs/>
-          <w:sz w:val="36"/>
-          <w:szCs w:val="36"/>
-        </w:rPr>
         <w:t xml:space="preserve"> Solve?</w:t>
       </w:r>
     </w:p>
@@ -14589,7 +14340,6 @@
           <w:szCs w:val="27"/>
         </w:rPr>
       </w:pPr>
-      <w:proofErr w:type="gramStart"/>
       <w:r>
         <w:rPr>
           <w:rFonts w:ascii="Times New Roman" w:eastAsia="Times New Roman" w:hAnsi="Times New Roman" w:cs="Times New Roman"/>
@@ -14608,18 +14358,7 @@
           <w:sz w:val="27"/>
           <w:szCs w:val="27"/>
         </w:rPr>
-        <w:t xml:space="preserve">  Without</w:t>
-      </w:r>
-      <w:proofErr w:type="gramEnd"/>
-      <w:r>
-        <w:rPr>
-          <w:rFonts w:ascii="Cambria" w:eastAsia="Times New Roman" w:hAnsi="Cambria" w:cs="Times New Roman"/>
-          <w:b/>
-          <w:bCs/>
-          <w:sz w:val="27"/>
-          <w:szCs w:val="27"/>
-        </w:rPr>
-        <w:t xml:space="preserve"> a Schema File</w:t>
+        <w:t xml:space="preserve">  Without a Schema File</w:t>
       </w:r>
     </w:p>
     <w:p>
@@ -14745,7 +14484,6 @@
           <w:szCs w:val="27"/>
         </w:rPr>
       </w:pPr>
-      <w:proofErr w:type="gramStart"/>
       <w:r>
         <w:rPr>
           <w:rFonts w:ascii="Times New Roman" w:eastAsia="Times New Roman" w:hAnsi="Times New Roman" w:cs="Times New Roman"/>
@@ -14764,18 +14502,7 @@
           <w:sz w:val="27"/>
           <w:szCs w:val="27"/>
         </w:rPr>
-        <w:t xml:space="preserve">  With</w:t>
-      </w:r>
-      <w:proofErr w:type="gramEnd"/>
-      <w:r>
-        <w:rPr>
-          <w:rFonts w:ascii="Cambria" w:eastAsia="Times New Roman" w:hAnsi="Cambria" w:cs="Times New Roman"/>
-          <w:b/>
-          <w:bCs/>
-          <w:sz w:val="27"/>
-          <w:szCs w:val="27"/>
-        </w:rPr>
-        <w:t xml:space="preserve"> </w:t>
+        <w:t xml:space="preserve">  With </w:t>
       </w:r>
       <w:proofErr w:type="spellStart"/>
       <w:r>
@@ -15008,7 +14735,6 @@
         </w:rPr>
       </w:pPr>
       <w:proofErr w:type="spellStart"/>
-      <w:proofErr w:type="gramStart"/>
       <w:r>
         <w:rPr>
           <w:rFonts w:ascii="Cambria" w:eastAsia="Times New Roman" w:hAnsi="Cambria" w:cs="Times New Roman"/>
@@ -15019,7 +14745,6 @@
         <w:t>datasource</w:t>
       </w:r>
       <w:proofErr w:type="spellEnd"/>
-      <w:proofErr w:type="gramEnd"/>
       <w:r>
         <w:rPr>
           <w:rFonts w:ascii="Cambria" w:eastAsia="Times New Roman" w:hAnsi="Cambria" w:cs="Times New Roman"/>
@@ -15047,9 +14772,9 @@
           <w:color w:val="0070C0"/>
           <w:szCs w:val="24"/>
         </w:rPr>
-        <w:t xml:space="preserve">  </w:t>
-      </w:r>
-      <w:proofErr w:type="gramStart"/>
+        <w:t xml:space="preserve">  provider = "</w:t>
+      </w:r>
+      <w:proofErr w:type="spellStart"/>
       <w:r>
         <w:rPr>
           <w:rFonts w:ascii="Cambria" w:eastAsia="Times New Roman" w:hAnsi="Cambria" w:cs="Times New Roman"/>
@@ -15057,9 +14782,9 @@
           <w:color w:val="0070C0"/>
           <w:szCs w:val="24"/>
         </w:rPr>
-        <w:t>provider</w:t>
-      </w:r>
-      <w:proofErr w:type="gramEnd"/>
+        <w:t>postgresql</w:t>
+      </w:r>
+      <w:proofErr w:type="spellEnd"/>
       <w:r>
         <w:rPr>
           <w:rFonts w:ascii="Cambria" w:eastAsia="Times New Roman" w:hAnsi="Cambria" w:cs="Times New Roman"/>
@@ -15067,19 +14792,19 @@
           <w:color w:val="0070C0"/>
           <w:szCs w:val="24"/>
         </w:rPr>
-        <w:t xml:space="preserve"> = "</w:t>
-      </w:r>
-      <w:proofErr w:type="spellStart"/>
-      <w:r>
+        <w:t>"</w:t>
+      </w:r>
+    </w:p>
+    <w:p>
+      <w:pPr>
+        <w:spacing w:before="100" w:beforeAutospacing="1" w:after="100" w:afterAutospacing="1" w:line="240" w:lineRule="auto"/>
         <w:rPr>
           <w:rFonts w:ascii="Cambria" w:eastAsia="Times New Roman" w:hAnsi="Cambria" w:cs="Times New Roman"/>
           <w:bCs/>
           <w:color w:val="0070C0"/>
           <w:szCs w:val="24"/>
         </w:rPr>
-        <w:t>postgresql</w:t>
-      </w:r>
-      <w:proofErr w:type="spellEnd"/>
+      </w:pPr>
       <w:r>
         <w:rPr>
           <w:rFonts w:ascii="Cambria" w:eastAsia="Times New Roman" w:hAnsi="Cambria" w:cs="Times New Roman"/>
@@ -15087,41 +14812,19 @@
           <w:color w:val="0070C0"/>
           <w:szCs w:val="24"/>
         </w:rPr>
-        <w:t>"</w:t>
-      </w:r>
-    </w:p>
-    <w:p>
-      <w:pPr>
-        <w:spacing w:before="100" w:beforeAutospacing="1" w:after="100" w:afterAutospacing="1" w:line="240" w:lineRule="auto"/>
+        <w:t xml:space="preserve">  </w:t>
+      </w:r>
+      <w:proofErr w:type="spellStart"/>
+      <w:r>
         <w:rPr>
           <w:rFonts w:ascii="Cambria" w:eastAsia="Times New Roman" w:hAnsi="Cambria" w:cs="Times New Roman"/>
           <w:bCs/>
           <w:color w:val="0070C0"/>
           <w:szCs w:val="24"/>
         </w:rPr>
-      </w:pPr>
-      <w:r>
-        <w:rPr>
-          <w:rFonts w:ascii="Cambria" w:eastAsia="Times New Roman" w:hAnsi="Cambria" w:cs="Times New Roman"/>
-          <w:bCs/>
-          <w:color w:val="0070C0"/>
-          <w:szCs w:val="24"/>
-        </w:rPr>
-        <w:t xml:space="preserve">  </w:t>
-      </w:r>
-      <w:proofErr w:type="spellStart"/>
-      <w:proofErr w:type="gramStart"/>
-      <w:r>
-        <w:rPr>
-          <w:rFonts w:ascii="Cambria" w:eastAsia="Times New Roman" w:hAnsi="Cambria" w:cs="Times New Roman"/>
-          <w:bCs/>
-          <w:color w:val="0070C0"/>
-          <w:szCs w:val="24"/>
-        </w:rPr>
         <w:t>url</w:t>
       </w:r>
       <w:proofErr w:type="spellEnd"/>
-      <w:proofErr w:type="gramEnd"/>
       <w:r>
         <w:rPr>
           <w:rFonts w:ascii="Cambria" w:eastAsia="Times New Roman" w:hAnsi="Cambria" w:cs="Times New Roman"/>
@@ -15209,19 +14912,11 @@
           <w:rFonts w:ascii="Cambria" w:hAnsi="Cambria"/>
         </w:rPr>
       </w:pPr>
-      <w:proofErr w:type="gramStart"/>
-      <w:r>
-        <w:rPr>
-          <w:rFonts w:ascii="Cambria" w:hAnsi="Cambria"/>
-        </w:rPr>
-        <w:t>2.Generator</w:t>
-      </w:r>
-      <w:proofErr w:type="gramEnd"/>
-      <w:r>
-        <w:rPr>
-          <w:rFonts w:ascii="Cambria" w:hAnsi="Cambria"/>
-        </w:rPr>
-        <w:t xml:space="preserve"> (Client Creation)</w:t>
+      <w:r>
+        <w:rPr>
+          <w:rFonts w:ascii="Cambria" w:hAnsi="Cambria"/>
+        </w:rPr>
+        <w:t>2.Generator (Client Creation)</w:t>
       </w:r>
     </w:p>
     <w:p>
@@ -15234,7 +14929,6 @@
           <w:sz w:val="22"/>
         </w:rPr>
       </w:pPr>
-      <w:proofErr w:type="gramStart"/>
       <w:r>
         <w:rPr>
           <w:rStyle w:val="HTMLCode"/>
@@ -15242,29 +14936,29 @@
           <w:color w:val="0070C0"/>
           <w:sz w:val="22"/>
         </w:rPr>
-        <w:t>generator</w:t>
-      </w:r>
-      <w:proofErr w:type="gramEnd"/>
-      <w:r>
+        <w:t>generator client {</w:t>
+      </w:r>
+    </w:p>
+    <w:p>
+      <w:pPr>
+        <w:pStyle w:val="HTMLPreformatted"/>
         <w:rPr>
           <w:rStyle w:val="HTMLCode"/>
           <w:rFonts w:ascii="Cambria" w:hAnsi="Cambria"/>
           <w:color w:val="0070C0"/>
           <w:sz w:val="22"/>
         </w:rPr>
-        <w:t xml:space="preserve"> client {</w:t>
-      </w:r>
-    </w:p>
-    <w:p>
-      <w:pPr>
-        <w:pStyle w:val="HTMLPreformatted"/>
+      </w:pPr>
+      <w:r>
         <w:rPr>
           <w:rStyle w:val="HTMLCode"/>
           <w:rFonts w:ascii="Cambria" w:hAnsi="Cambria"/>
           <w:color w:val="0070C0"/>
           <w:sz w:val="22"/>
         </w:rPr>
-      </w:pPr>
+        <w:t xml:space="preserve">  provider = "</w:t>
+      </w:r>
+      <w:proofErr w:type="spellStart"/>
       <w:r>
         <w:rPr>
           <w:rStyle w:val="HTMLCode"/>
@@ -15272,9 +14966,9 @@
           <w:color w:val="0070C0"/>
           <w:sz w:val="22"/>
         </w:rPr>
-        <w:t xml:space="preserve">  </w:t>
-      </w:r>
-      <w:proofErr w:type="gramStart"/>
+        <w:t>prisma</w:t>
+      </w:r>
+      <w:proofErr w:type="spellEnd"/>
       <w:r>
         <w:rPr>
           <w:rStyle w:val="HTMLCode"/>
@@ -15282,9 +14976,9 @@
           <w:color w:val="0070C0"/>
           <w:sz w:val="22"/>
         </w:rPr>
-        <w:t>provider</w:t>
-      </w:r>
-      <w:proofErr w:type="gramEnd"/>
+        <w:t>-client-</w:t>
+      </w:r>
+      <w:proofErr w:type="spellStart"/>
       <w:r>
         <w:rPr>
           <w:rStyle w:val="HTMLCode"/>
@@ -15292,9 +14986,9 @@
           <w:color w:val="0070C0"/>
           <w:sz w:val="22"/>
         </w:rPr>
-        <w:t xml:space="preserve"> = "</w:t>
-      </w:r>
-      <w:proofErr w:type="spellStart"/>
+        <w:t>js</w:t>
+      </w:r>
+      <w:proofErr w:type="spellEnd"/>
       <w:r>
         <w:rPr>
           <w:rStyle w:val="HTMLCode"/>
@@ -15302,19 +14996,19 @@
           <w:color w:val="0070C0"/>
           <w:sz w:val="22"/>
         </w:rPr>
-        <w:t>prisma</w:t>
-      </w:r>
-      <w:proofErr w:type="spellEnd"/>
-      <w:r>
+        <w:t>"</w:t>
+      </w:r>
+    </w:p>
+    <w:p>
+      <w:pPr>
+        <w:pStyle w:val="HTMLPreformatted"/>
         <w:rPr>
           <w:rStyle w:val="HTMLCode"/>
           <w:rFonts w:ascii="Cambria" w:hAnsi="Cambria"/>
           <w:color w:val="0070C0"/>
           <w:sz w:val="22"/>
         </w:rPr>
-        <w:t>-client-</w:t>
-      </w:r>
-      <w:proofErr w:type="spellStart"/>
+      </w:pPr>
       <w:r>
         <w:rPr>
           <w:rStyle w:val="HTMLCode"/>
@@ -15322,122 +15016,121 @@
           <w:color w:val="0070C0"/>
           <w:sz w:val="22"/>
         </w:rPr>
-        <w:t>js</w:t>
+        <w:t>}</w:t>
+      </w:r>
+    </w:p>
+    <w:p>
+      <w:pPr>
+        <w:pStyle w:val="NormalWeb"/>
+        <w:rPr>
+          <w:rFonts w:ascii="Cambria" w:hAnsi="Cambria"/>
+        </w:rPr>
+      </w:pPr>
+      <w:r>
+        <w:rPr>
+          <w:rFonts w:ascii="Cambria" w:hAnsi="Cambria"/>
+        </w:rPr>
+        <w:t xml:space="preserve">Tells </w:t>
+      </w:r>
+      <w:proofErr w:type="spellStart"/>
+      <w:r>
+        <w:rPr>
+          <w:rFonts w:ascii="Cambria" w:hAnsi="Cambria"/>
+        </w:rPr>
+        <w:t>Prisma</w:t>
       </w:r>
       <w:proofErr w:type="spellEnd"/>
       <w:r>
+        <w:rPr>
+          <w:rFonts w:ascii="Cambria" w:hAnsi="Cambria"/>
+        </w:rPr>
+        <w:t>:</w:t>
+      </w:r>
+    </w:p>
+    <w:p>
+      <w:pPr>
+        <w:pStyle w:val="NormalWeb"/>
+        <w:rPr>
+          <w:rFonts w:ascii="Cambria" w:hAnsi="Cambria"/>
+        </w:rPr>
+      </w:pPr>
+      <w:r>
+        <w:rPr>
+          <w:rFonts w:ascii="Cambria" w:hAnsi="Cambria"/>
+        </w:rPr>
+        <w:t>“Generate a JS/TS client for my app”</w:t>
+      </w:r>
+    </w:p>
+    <w:p>
+      <w:pPr>
+        <w:pStyle w:val="Heading3"/>
+        <w:rPr>
+          <w:rFonts w:ascii="Cambria" w:hAnsi="Cambria"/>
+        </w:rPr>
+      </w:pPr>
+    </w:p>
+    <w:p>
+      <w:pPr>
+        <w:pStyle w:val="Heading3"/>
+        <w:rPr>
+          <w:rFonts w:ascii="Cambria" w:hAnsi="Cambria"/>
+        </w:rPr>
+      </w:pPr>
+    </w:p>
+    <w:p>
+      <w:pPr>
+        <w:pStyle w:val="Heading3"/>
+        <w:rPr>
+          <w:rFonts w:ascii="Cambria" w:hAnsi="Cambria"/>
+        </w:rPr>
+      </w:pPr>
+      <w:r>
+        <w:rPr>
+          <w:rFonts w:ascii="Cambria" w:hAnsi="Cambria"/>
+        </w:rPr>
+        <w:t>3. Models (Tables)</w:t>
+      </w:r>
+    </w:p>
+    <w:p>
+      <w:pPr>
+        <w:pStyle w:val="HTMLPreformatted"/>
         <w:rPr>
           <w:rStyle w:val="HTMLCode"/>
           <w:rFonts w:ascii="Cambria" w:hAnsi="Cambria"/>
           <w:color w:val="0070C0"/>
           <w:sz w:val="22"/>
         </w:rPr>
-        <w:t>"</w:t>
-      </w:r>
-    </w:p>
-    <w:p>
-      <w:pPr>
-        <w:pStyle w:val="HTMLPreformatted"/>
+      </w:pPr>
+      <w:r>
         <w:rPr>
           <w:rStyle w:val="HTMLCode"/>
           <w:rFonts w:ascii="Cambria" w:hAnsi="Cambria"/>
           <w:color w:val="0070C0"/>
           <w:sz w:val="22"/>
         </w:rPr>
-      </w:pPr>
-      <w:r>
+        <w:t>model User {</w:t>
+      </w:r>
+    </w:p>
+    <w:p>
+      <w:pPr>
+        <w:pStyle w:val="HTMLPreformatted"/>
         <w:rPr>
           <w:rStyle w:val="HTMLCode"/>
           <w:rFonts w:ascii="Cambria" w:hAnsi="Cambria"/>
           <w:color w:val="0070C0"/>
           <w:sz w:val="22"/>
         </w:rPr>
-        <w:t>}</w:t>
-      </w:r>
-    </w:p>
-    <w:p>
-      <w:pPr>
-        <w:pStyle w:val="NormalWeb"/>
-        <w:rPr>
-          <w:rFonts w:ascii="Cambria" w:hAnsi="Cambria"/>
-        </w:rPr>
-      </w:pPr>
-      <w:r>
-        <w:rPr>
-          <w:rFonts w:ascii="Cambria" w:hAnsi="Cambria"/>
-        </w:rPr>
-        <w:t xml:space="preserve">Tells </w:t>
-      </w:r>
-      <w:proofErr w:type="spellStart"/>
-      <w:r>
-        <w:rPr>
-          <w:rFonts w:ascii="Cambria" w:hAnsi="Cambria"/>
-        </w:rPr>
-        <w:t>Prisma</w:t>
-      </w:r>
-      <w:proofErr w:type="spellEnd"/>
-      <w:r>
-        <w:rPr>
-          <w:rFonts w:ascii="Cambria" w:hAnsi="Cambria"/>
-        </w:rPr>
-        <w:t>:</w:t>
-      </w:r>
-    </w:p>
-    <w:p>
-      <w:pPr>
-        <w:pStyle w:val="NormalWeb"/>
-        <w:rPr>
-          <w:rFonts w:ascii="Cambria" w:hAnsi="Cambria"/>
-        </w:rPr>
-      </w:pPr>
-      <w:r>
-        <w:rPr>
-          <w:rFonts w:ascii="Cambria" w:hAnsi="Cambria"/>
-        </w:rPr>
-        <w:t>“Generate a JS/TS client for my app”</w:t>
-      </w:r>
-    </w:p>
-    <w:p>
-      <w:pPr>
-        <w:pStyle w:val="Heading3"/>
-        <w:rPr>
-          <w:rFonts w:ascii="Cambria" w:hAnsi="Cambria"/>
-        </w:rPr>
-      </w:pPr>
-    </w:p>
-    <w:p>
-      <w:pPr>
-        <w:pStyle w:val="Heading3"/>
-        <w:rPr>
-          <w:rFonts w:ascii="Cambria" w:hAnsi="Cambria"/>
-        </w:rPr>
-      </w:pPr>
-    </w:p>
-    <w:p>
-      <w:pPr>
-        <w:pStyle w:val="Heading3"/>
-        <w:rPr>
-          <w:rFonts w:ascii="Cambria" w:hAnsi="Cambria"/>
-        </w:rPr>
-      </w:pPr>
-      <w:r>
-        <w:rPr>
-          <w:rFonts w:ascii="Cambria" w:hAnsi="Cambria"/>
-        </w:rPr>
-        <w:t>3. Models (Tables)</w:t>
-      </w:r>
-    </w:p>
-    <w:p>
-      <w:pPr>
-        <w:pStyle w:val="HTMLPreformatted"/>
+      </w:pPr>
+      <w:r>
         <w:rPr>
           <w:rStyle w:val="HTMLCode"/>
           <w:rFonts w:ascii="Cambria" w:hAnsi="Cambria"/>
           <w:color w:val="0070C0"/>
           <w:sz w:val="22"/>
         </w:rPr>
-      </w:pPr>
-      <w:proofErr w:type="gramStart"/>
+        <w:t xml:space="preserve">  id    </w:t>
+      </w:r>
+      <w:proofErr w:type="spellStart"/>
       <w:r>
         <w:rPr>
           <w:rStyle w:val="HTMLCode"/>
@@ -15445,9 +15138,9 @@
           <w:color w:val="0070C0"/>
           <w:sz w:val="22"/>
         </w:rPr>
-        <w:t>model</w:t>
-      </w:r>
-      <w:proofErr w:type="gramEnd"/>
+        <w:t>Int</w:t>
+      </w:r>
+      <w:proofErr w:type="spellEnd"/>
       <w:r>
         <w:rPr>
           <w:rStyle w:val="HTMLCode"/>
@@ -15455,19 +15148,19 @@
           <w:color w:val="0070C0"/>
           <w:sz w:val="22"/>
         </w:rPr>
-        <w:t xml:space="preserve"> User {</w:t>
-      </w:r>
-    </w:p>
-    <w:p>
-      <w:pPr>
-        <w:pStyle w:val="HTMLPreformatted"/>
+        <w:t xml:space="preserve">    @id @default(</w:t>
+      </w:r>
+      <w:proofErr w:type="spellStart"/>
+      <w:r>
         <w:rPr>
           <w:rStyle w:val="HTMLCode"/>
           <w:rFonts w:ascii="Cambria" w:hAnsi="Cambria"/>
           <w:color w:val="0070C0"/>
           <w:sz w:val="22"/>
         </w:rPr>
-      </w:pPr>
+        <w:t>autoincrement</w:t>
+      </w:r>
+      <w:proofErr w:type="spellEnd"/>
       <w:r>
         <w:rPr>
           <w:rStyle w:val="HTMLCode"/>
@@ -15475,19 +15168,19 @@
           <w:color w:val="0070C0"/>
           <w:sz w:val="22"/>
         </w:rPr>
-        <w:t xml:space="preserve">  </w:t>
-      </w:r>
-      <w:proofErr w:type="gramStart"/>
-      <w:r>
+        <w:t>())</w:t>
+      </w:r>
+    </w:p>
+    <w:p>
+      <w:pPr>
+        <w:pStyle w:val="HTMLPreformatted"/>
         <w:rPr>
           <w:rStyle w:val="HTMLCode"/>
           <w:rFonts w:ascii="Cambria" w:hAnsi="Cambria"/>
           <w:color w:val="0070C0"/>
           <w:sz w:val="22"/>
         </w:rPr>
-        <w:t>id</w:t>
-      </w:r>
-      <w:proofErr w:type="gramEnd"/>
+      </w:pPr>
       <w:r>
         <w:rPr>
           <w:rStyle w:val="HTMLCode"/>
@@ -15495,87 +15188,7 @@
           <w:color w:val="0070C0"/>
           <w:sz w:val="22"/>
         </w:rPr>
-        <w:t xml:space="preserve">    </w:t>
-      </w:r>
-      <w:proofErr w:type="spellStart"/>
-      <w:r>
-        <w:rPr>
-          <w:rStyle w:val="HTMLCode"/>
-          <w:rFonts w:ascii="Cambria" w:hAnsi="Cambria"/>
-          <w:color w:val="0070C0"/>
-          <w:sz w:val="22"/>
-        </w:rPr>
-        <w:t>Int</w:t>
-      </w:r>
-      <w:proofErr w:type="spellEnd"/>
-      <w:r>
-        <w:rPr>
-          <w:rStyle w:val="HTMLCode"/>
-          <w:rFonts w:ascii="Cambria" w:hAnsi="Cambria"/>
-          <w:color w:val="0070C0"/>
-          <w:sz w:val="22"/>
-        </w:rPr>
-        <w:t xml:space="preserve">    @id @default(</w:t>
-      </w:r>
-      <w:proofErr w:type="spellStart"/>
-      <w:r>
-        <w:rPr>
-          <w:rStyle w:val="HTMLCode"/>
-          <w:rFonts w:ascii="Cambria" w:hAnsi="Cambria"/>
-          <w:color w:val="0070C0"/>
-          <w:sz w:val="22"/>
-        </w:rPr>
-        <w:t>autoincrement</w:t>
-      </w:r>
-      <w:proofErr w:type="spellEnd"/>
-      <w:r>
-        <w:rPr>
-          <w:rStyle w:val="HTMLCode"/>
-          <w:rFonts w:ascii="Cambria" w:hAnsi="Cambria"/>
-          <w:color w:val="0070C0"/>
-          <w:sz w:val="22"/>
-        </w:rPr>
-        <w:t>())</w:t>
-      </w:r>
-    </w:p>
-    <w:p>
-      <w:pPr>
-        <w:pStyle w:val="HTMLPreformatted"/>
-        <w:rPr>
-          <w:rStyle w:val="HTMLCode"/>
-          <w:rFonts w:ascii="Cambria" w:hAnsi="Cambria"/>
-          <w:color w:val="0070C0"/>
-          <w:sz w:val="22"/>
-        </w:rPr>
-      </w:pPr>
-      <w:r>
-        <w:rPr>
-          <w:rStyle w:val="HTMLCode"/>
-          <w:rFonts w:ascii="Cambria" w:hAnsi="Cambria"/>
-          <w:color w:val="0070C0"/>
-          <w:sz w:val="22"/>
-        </w:rPr>
-        <w:t xml:space="preserve">  </w:t>
-      </w:r>
-      <w:proofErr w:type="gramStart"/>
-      <w:r>
-        <w:rPr>
-          <w:rStyle w:val="HTMLCode"/>
-          <w:rFonts w:ascii="Cambria" w:hAnsi="Cambria"/>
-          <w:color w:val="0070C0"/>
-          <w:sz w:val="22"/>
-        </w:rPr>
-        <w:t>email</w:t>
-      </w:r>
-      <w:proofErr w:type="gramEnd"/>
-      <w:r>
-        <w:rPr>
-          <w:rStyle w:val="HTMLCode"/>
-          <w:rFonts w:ascii="Cambria" w:hAnsi="Cambria"/>
-          <w:color w:val="0070C0"/>
-          <w:sz w:val="22"/>
-        </w:rPr>
-        <w:t xml:space="preserve"> String @unique</w:t>
+        <w:t xml:space="preserve">  email String @unique</w:t>
       </w:r>
     </w:p>
     <w:p>
@@ -16216,21 +15829,12 @@
           <w:color w:val="0070C0"/>
         </w:rPr>
       </w:pPr>
-      <w:proofErr w:type="gramStart"/>
       <w:r>
         <w:rPr>
           <w:rFonts w:ascii="Cambria" w:eastAsia="Times New Roman" w:hAnsi="Cambria" w:cs="Courier New"/>
           <w:color w:val="0070C0"/>
         </w:rPr>
-        <w:t>model</w:t>
-      </w:r>
-      <w:proofErr w:type="gramEnd"/>
-      <w:r>
-        <w:rPr>
-          <w:rFonts w:ascii="Cambria" w:eastAsia="Times New Roman" w:hAnsi="Cambria" w:cs="Courier New"/>
-          <w:color w:val="0070C0"/>
-        </w:rPr>
-        <w:t xml:space="preserve"> User {</w:t>
+        <w:t>model User {</w:t>
       </w:r>
     </w:p>
     <w:p>
@@ -16264,23 +15868,7 @@
           <w:rFonts w:ascii="Cambria" w:eastAsia="Times New Roman" w:hAnsi="Cambria" w:cs="Courier New"/>
           <w:color w:val="0070C0"/>
         </w:rPr>
-        <w:t xml:space="preserve">  </w:t>
-      </w:r>
-      <w:proofErr w:type="gramStart"/>
-      <w:r>
-        <w:rPr>
-          <w:rFonts w:ascii="Cambria" w:eastAsia="Times New Roman" w:hAnsi="Cambria" w:cs="Courier New"/>
-          <w:color w:val="0070C0"/>
-        </w:rPr>
-        <w:t>id</w:t>
-      </w:r>
-      <w:proofErr w:type="gramEnd"/>
-      <w:r>
-        <w:rPr>
-          <w:rFonts w:ascii="Cambria" w:eastAsia="Times New Roman" w:hAnsi="Cambria" w:cs="Courier New"/>
-          <w:color w:val="0070C0"/>
-        </w:rPr>
-        <w:t xml:space="preserve"> </w:t>
+        <w:t xml:space="preserve">  id </w:t>
       </w:r>
       <w:proofErr w:type="spellStart"/>
       <w:r>
@@ -16475,7 +16063,6 @@
           <w:color w:val="0070C0"/>
         </w:rPr>
       </w:pPr>
-      <w:proofErr w:type="gramStart"/>
       <w:r>
         <w:rPr>
           <w:rFonts w:ascii="Cambria" w:eastAsia="Times New Roman" w:hAnsi="Cambria" w:cs="Courier New"/>
@@ -16484,7 +16071,6 @@
         </w:rPr>
         <w:t>const</w:t>
       </w:r>
-      <w:proofErr w:type="gramEnd"/>
       <w:r>
         <w:rPr>
           <w:rFonts w:ascii="Cambria" w:eastAsia="Times New Roman" w:hAnsi="Cambria" w:cs="Courier New"/>
@@ -16580,7 +16166,6 @@
         </w:rPr>
         <w:t xml:space="preserve">  </w:t>
       </w:r>
-      <w:proofErr w:type="gramStart"/>
       <w:r>
         <w:rPr>
           <w:rFonts w:ascii="Cambria" w:eastAsia="Times New Roman" w:hAnsi="Cambria" w:cs="Courier New"/>
@@ -16589,7 +16174,6 @@
         </w:rPr>
         <w:t>email</w:t>
       </w:r>
-      <w:proofErr w:type="gramEnd"/>
       <w:r>
         <w:rPr>
           <w:rFonts w:ascii="Cambria" w:eastAsia="Times New Roman" w:hAnsi="Cambria" w:cs="Courier New"/>
@@ -16769,7 +16353,6 @@
           <w:color w:val="0070C0"/>
         </w:rPr>
       </w:pPr>
-      <w:proofErr w:type="gramStart"/>
       <w:r>
         <w:rPr>
           <w:rFonts w:ascii="Cambria" w:eastAsia="Times New Roman" w:hAnsi="Cambria" w:cs="Courier New"/>
@@ -16785,7 +16368,6 @@
         </w:rPr>
         <w:t>()</w:t>
       </w:r>
-      <w:proofErr w:type="gramEnd"/>
     </w:p>
     <w:p>
       <w:pPr>
@@ -16813,7 +16395,6 @@
           <w:color w:val="0070C0"/>
         </w:rPr>
       </w:pPr>
-      <w:proofErr w:type="gramStart"/>
       <w:r>
         <w:rPr>
           <w:rFonts w:ascii="Cambria" w:eastAsia="Times New Roman" w:hAnsi="Cambria" w:cs="Courier New"/>
@@ -16822,7 +16403,6 @@
         </w:rPr>
         <w:t>class</w:t>
       </w:r>
-      <w:proofErr w:type="gramEnd"/>
       <w:r>
         <w:rPr>
           <w:rFonts w:ascii="Cambria" w:eastAsia="Times New Roman" w:hAnsi="Cambria" w:cs="Courier New"/>
@@ -16879,7 +16459,6 @@
         </w:rPr>
         <w:t xml:space="preserve">  </w:t>
       </w:r>
-      <w:proofErr w:type="gramStart"/>
       <w:r>
         <w:rPr>
           <w:rFonts w:ascii="Cambria" w:eastAsia="Times New Roman" w:hAnsi="Cambria" w:cs="Courier New"/>
@@ -16895,7 +16474,6 @@
         </w:rPr>
         <w:t>()</w:t>
       </w:r>
-      <w:proofErr w:type="gramEnd"/>
     </w:p>
     <w:p>
       <w:pPr>
@@ -16930,7 +16508,6 @@
         </w:rPr>
         <w:t xml:space="preserve">  </w:t>
       </w:r>
-      <w:proofErr w:type="gramStart"/>
       <w:r>
         <w:rPr>
           <w:rFonts w:ascii="Cambria" w:eastAsia="Times New Roman" w:hAnsi="Cambria" w:cs="Courier New"/>
@@ -16939,7 +16516,6 @@
         </w:rPr>
         <w:t>email</w:t>
       </w:r>
-      <w:proofErr w:type="gramEnd"/>
       <w:r>
         <w:rPr>
           <w:rFonts w:ascii="Cambria" w:eastAsia="Times New Roman" w:hAnsi="Cambria" w:cs="Courier New"/>
@@ -17103,7 +16679,6 @@
           <w:color w:val="0070C0"/>
         </w:rPr>
       </w:pPr>
-      <w:proofErr w:type="gramStart"/>
       <w:r>
         <w:rPr>
           <w:rFonts w:ascii="Cambria" w:eastAsia="Times New Roman" w:hAnsi="Cambria" w:cs="Courier New"/>
@@ -17112,7 +16687,6 @@
         </w:rPr>
         <w:t>const</w:t>
       </w:r>
-      <w:proofErr w:type="gramEnd"/>
       <w:r>
         <w:rPr>
           <w:rFonts w:ascii="Cambria" w:eastAsia="Times New Roman" w:hAnsi="Cambria" w:cs="Courier New"/>
@@ -17209,7 +16783,6 @@
         </w:rPr>
         <w:t xml:space="preserve">  </w:t>
       </w:r>
-      <w:proofErr w:type="gramStart"/>
       <w:r>
         <w:rPr>
           <w:rFonts w:ascii="Cambria" w:eastAsia="Times New Roman" w:hAnsi="Cambria" w:cs="Courier New"/>
@@ -17218,7 +16791,6 @@
         </w:rPr>
         <w:t>email</w:t>
       </w:r>
-      <w:proofErr w:type="gramEnd"/>
       <w:r>
         <w:rPr>
           <w:rFonts w:ascii="Cambria" w:eastAsia="Times New Roman" w:hAnsi="Cambria" w:cs="Courier New"/>
@@ -17344,19 +16916,8 @@
           <w:sz w:val="24"/>
           <w:szCs w:val="24"/>
         </w:rPr>
-        <w:t>Summary</w:t>
-      </w:r>
-      <w:proofErr w:type="gramStart"/>
-      <w:r>
-        <w:rPr>
-          <w:rFonts w:ascii="Cambria" w:eastAsia="Times New Roman" w:hAnsi="Cambria" w:cs="Times New Roman"/>
-          <w:b/>
-          <w:sz w:val="24"/>
-          <w:szCs w:val="24"/>
-        </w:rPr>
-        <w:t>:</w:t>
-      </w:r>
-      <w:proofErr w:type="gramEnd"/>
+        <w:t>Summary:</w:t>
+      </w:r>
       <w:r>
         <w:rPr>
           <w:rFonts w:ascii="Cambria" w:eastAsia="Times New Roman" w:hAnsi="Cambria" w:cs="Times New Roman"/>
@@ -17839,21 +17400,12 @@
           <w:rFonts w:ascii="Cambria" w:hAnsi="Cambria"/>
         </w:rPr>
       </w:pPr>
-      <w:proofErr w:type="gramStart"/>
-      <w:r>
-        <w:rPr>
-          <w:rStyle w:val="HTMLCode"/>
-          <w:rFonts w:ascii="Cambria" w:hAnsi="Cambria"/>
-        </w:rPr>
-        <w:t>events</w:t>
-      </w:r>
-      <w:proofErr w:type="gramEnd"/>
-      <w:r>
-        <w:rPr>
-          <w:rStyle w:val="HTMLCode"/>
-          <w:rFonts w:ascii="Cambria" w:hAnsi="Cambria"/>
-        </w:rPr>
-        <w:t>/</w:t>
+      <w:r>
+        <w:rPr>
+          <w:rStyle w:val="HTMLCode"/>
+          <w:rFonts w:ascii="Cambria" w:hAnsi="Cambria"/>
+        </w:rPr>
+        <w:t>events/</w:t>
       </w:r>
     </w:p>
     <w:p>
@@ -18013,7 +17565,6 @@
           <w:rFonts w:ascii="Cambria" w:hAnsi="Cambria"/>
         </w:rPr>
       </w:pPr>
-      <w:proofErr w:type="gramStart"/>
       <w:r>
         <w:rPr>
           <w:rStyle w:val="HTMLCode"/>
@@ -18021,7 +17572,6 @@
         </w:rPr>
         <w:t>events/index.js</w:t>
       </w:r>
-      <w:proofErr w:type="gramEnd"/>
     </w:p>
     <w:p>
       <w:pPr>
@@ -18110,21 +17660,12 @@
           <w:rFonts w:ascii="Cambria" w:hAnsi="Cambria"/>
         </w:rPr>
       </w:pPr>
-      <w:proofErr w:type="gramStart"/>
-      <w:r>
-        <w:rPr>
-          <w:rStyle w:val="HTMLCode"/>
-          <w:rFonts w:ascii="Cambria" w:hAnsi="Cambria"/>
-        </w:rPr>
-        <w:t>export</w:t>
-      </w:r>
-      <w:proofErr w:type="gramEnd"/>
-      <w:r>
-        <w:rPr>
-          <w:rStyle w:val="HTMLCode"/>
-          <w:rFonts w:ascii="Cambria" w:hAnsi="Cambria"/>
-        </w:rPr>
-        <w:t xml:space="preserve"> const </w:t>
+      <w:r>
+        <w:rPr>
+          <w:rStyle w:val="HTMLCode"/>
+          <w:rFonts w:ascii="Cambria" w:hAnsi="Cambria"/>
+        </w:rPr>
+        <w:t xml:space="preserve">export const </w:t>
       </w:r>
       <w:proofErr w:type="spellStart"/>
       <w:r>
@@ -18151,21 +17692,12 @@
           <w:rFonts w:ascii="Cambria" w:hAnsi="Cambria"/>
         </w:rPr>
       </w:pPr>
-      <w:proofErr w:type="gramStart"/>
-      <w:r>
-        <w:rPr>
-          <w:rStyle w:val="HTMLCode"/>
-          <w:rFonts w:ascii="Cambria" w:hAnsi="Cambria"/>
-        </w:rPr>
-        <w:t>export</w:t>
-      </w:r>
-      <w:proofErr w:type="gramEnd"/>
-      <w:r>
-        <w:rPr>
-          <w:rStyle w:val="HTMLCode"/>
-          <w:rFonts w:ascii="Cambria" w:hAnsi="Cambria"/>
-        </w:rPr>
-        <w:t xml:space="preserve"> const </w:t>
+      <w:r>
+        <w:rPr>
+          <w:rStyle w:val="HTMLCode"/>
+          <w:rFonts w:ascii="Cambria" w:hAnsi="Cambria"/>
+        </w:rPr>
+        <w:t xml:space="preserve">export const </w:t>
       </w:r>
       <w:proofErr w:type="spellStart"/>
       <w:r>
@@ -18206,21 +17738,12 @@
           <w:rFonts w:ascii="Cambria" w:hAnsi="Cambria"/>
         </w:rPr>
       </w:pPr>
-      <w:proofErr w:type="gramStart"/>
-      <w:r>
-        <w:rPr>
-          <w:rStyle w:val="HTMLCode"/>
-          <w:rFonts w:ascii="Cambria" w:hAnsi="Cambria"/>
-        </w:rPr>
-        <w:t>export</w:t>
-      </w:r>
-      <w:proofErr w:type="gramEnd"/>
-      <w:r>
-        <w:rPr>
-          <w:rStyle w:val="HTMLCode"/>
-          <w:rFonts w:ascii="Cambria" w:hAnsi="Cambria"/>
-        </w:rPr>
-        <w:t xml:space="preserve"> const </w:t>
+      <w:r>
+        <w:rPr>
+          <w:rStyle w:val="HTMLCode"/>
+          <w:rFonts w:ascii="Cambria" w:hAnsi="Cambria"/>
+        </w:rPr>
+        <w:t xml:space="preserve">export const </w:t>
       </w:r>
       <w:proofErr w:type="spellStart"/>
       <w:r>
@@ -18247,21 +17770,12 @@
           <w:rFonts w:ascii="Cambria" w:hAnsi="Cambria"/>
         </w:rPr>
       </w:pPr>
-      <w:proofErr w:type="gramStart"/>
-      <w:r>
-        <w:rPr>
-          <w:rStyle w:val="HTMLCode"/>
-          <w:rFonts w:ascii="Cambria" w:hAnsi="Cambria"/>
-        </w:rPr>
-        <w:t>export</w:t>
-      </w:r>
-      <w:proofErr w:type="gramEnd"/>
-      <w:r>
-        <w:rPr>
-          <w:rStyle w:val="HTMLCode"/>
-          <w:rFonts w:ascii="Cambria" w:hAnsi="Cambria"/>
-        </w:rPr>
-        <w:t xml:space="preserve"> const </w:t>
+      <w:r>
+        <w:rPr>
+          <w:rStyle w:val="HTMLCode"/>
+          <w:rFonts w:ascii="Cambria" w:hAnsi="Cambria"/>
+        </w:rPr>
+        <w:t xml:space="preserve">export const </w:t>
       </w:r>
       <w:proofErr w:type="spellStart"/>
       <w:r>
@@ -18331,21 +17845,12 @@
           <w:rFonts w:ascii="Cambria" w:hAnsi="Cambria"/>
         </w:rPr>
       </w:pPr>
-      <w:proofErr w:type="gramStart"/>
-      <w:r>
-        <w:rPr>
-          <w:rStyle w:val="HTMLCode"/>
-          <w:rFonts w:ascii="Cambria" w:hAnsi="Cambria"/>
-        </w:rPr>
-        <w:t>import</w:t>
-      </w:r>
-      <w:proofErr w:type="gramEnd"/>
-      <w:r>
-        <w:rPr>
-          <w:rStyle w:val="HTMLCode"/>
-          <w:rFonts w:ascii="Cambria" w:hAnsi="Cambria"/>
-        </w:rPr>
-        <w:t xml:space="preserve"> { </w:t>
+      <w:r>
+        <w:rPr>
+          <w:rStyle w:val="HTMLCode"/>
+          <w:rFonts w:ascii="Cambria" w:hAnsi="Cambria"/>
+        </w:rPr>
+        <w:t xml:space="preserve">import { </w:t>
       </w:r>
       <w:proofErr w:type="spellStart"/>
       <w:r>
@@ -18388,21 +17893,12 @@
           <w:rFonts w:ascii="Cambria" w:hAnsi="Cambria"/>
         </w:rPr>
       </w:pPr>
-      <w:proofErr w:type="gramStart"/>
-      <w:r>
-        <w:rPr>
-          <w:rStyle w:val="HTMLCode"/>
-          <w:rFonts w:ascii="Cambria" w:hAnsi="Cambria"/>
-        </w:rPr>
-        <w:t>import</w:t>
-      </w:r>
-      <w:proofErr w:type="gramEnd"/>
-      <w:r>
-        <w:rPr>
-          <w:rStyle w:val="HTMLCode"/>
-          <w:rFonts w:ascii="Cambria" w:hAnsi="Cambria"/>
-        </w:rPr>
-        <w:t xml:space="preserve"> { </w:t>
+      <w:r>
+        <w:rPr>
+          <w:rStyle w:val="HTMLCode"/>
+          <w:rFonts w:ascii="Cambria" w:hAnsi="Cambria"/>
+        </w:rPr>
+        <w:t xml:space="preserve">import { </w:t>
       </w:r>
       <w:proofErr w:type="spellStart"/>
       <w:r>
@@ -18454,21 +17950,12 @@
           <w:rFonts w:ascii="Cambria" w:hAnsi="Cambria"/>
         </w:rPr>
       </w:pPr>
-      <w:proofErr w:type="gramStart"/>
-      <w:r>
-        <w:rPr>
-          <w:rStyle w:val="HTMLCode"/>
-          <w:rFonts w:ascii="Cambria" w:hAnsi="Cambria"/>
-        </w:rPr>
-        <w:t>export</w:t>
-      </w:r>
-      <w:proofErr w:type="gramEnd"/>
-      <w:r>
-        <w:rPr>
-          <w:rStyle w:val="HTMLCode"/>
-          <w:rFonts w:ascii="Cambria" w:hAnsi="Cambria"/>
-        </w:rPr>
-        <w:t xml:space="preserve"> const functions = [</w:t>
+      <w:r>
+        <w:rPr>
+          <w:rStyle w:val="HTMLCode"/>
+          <w:rFonts w:ascii="Cambria" w:hAnsi="Cambria"/>
+        </w:rPr>
+        <w:t>export const functions = [</w:t>
       </w:r>
     </w:p>
     <w:p>
@@ -18487,7 +17974,6 @@
         <w:t xml:space="preserve">  </w:t>
       </w:r>
       <w:proofErr w:type="spellStart"/>
-      <w:proofErr w:type="gramStart"/>
       <w:r>
         <w:rPr>
           <w:rStyle w:val="HTMLCode"/>
@@ -18496,7 +17982,6 @@
         <w:t>userCreated</w:t>
       </w:r>
       <w:proofErr w:type="spellEnd"/>
-      <w:proofErr w:type="gramEnd"/>
       <w:r>
         <w:rPr>
           <w:rStyle w:val="HTMLCode"/>
@@ -18521,7 +18006,6 @@
         <w:t xml:space="preserve">  </w:t>
       </w:r>
       <w:proofErr w:type="spellStart"/>
-      <w:proofErr w:type="gramStart"/>
       <w:r>
         <w:rPr>
           <w:rStyle w:val="HTMLCode"/>
@@ -18530,7 +18014,6 @@
         <w:t>userUpdated</w:t>
       </w:r>
       <w:proofErr w:type="spellEnd"/>
-      <w:proofErr w:type="gramEnd"/>
       <w:r>
         <w:rPr>
           <w:rStyle w:val="HTMLCode"/>
@@ -18555,7 +18038,6 @@
         <w:t xml:space="preserve">  </w:t>
       </w:r>
       <w:proofErr w:type="spellStart"/>
-      <w:proofErr w:type="gramStart"/>
       <w:r>
         <w:rPr>
           <w:rStyle w:val="HTMLCode"/>
@@ -18564,7 +18046,6 @@
         <w:t>taskCreated</w:t>
       </w:r>
       <w:proofErr w:type="spellEnd"/>
-      <w:proofErr w:type="gramEnd"/>
       <w:r>
         <w:rPr>
           <w:rStyle w:val="HTMLCode"/>
@@ -18589,7 +18070,6 @@
         <w:t xml:space="preserve">  </w:t>
       </w:r>
       <w:proofErr w:type="spellStart"/>
-      <w:proofErr w:type="gramStart"/>
       <w:r>
         <w:rPr>
           <w:rStyle w:val="HTMLCode"/>
@@ -18598,7 +18078,6 @@
         <w:t>taskAssigned</w:t>
       </w:r>
       <w:proofErr w:type="spellEnd"/>
-      <w:proofErr w:type="gramEnd"/>
     </w:p>
     <w:p>
       <w:pPr>
@@ -18667,7 +18146,6 @@
           <w:rFonts w:ascii="Cambria" w:hAnsi="Cambria"/>
         </w:rPr>
       </w:pPr>
-      <w:proofErr w:type="gramStart"/>
       <w:r>
         <w:rPr>
           <w:rStyle w:val="HTMLCode"/>
@@ -18675,7 +18153,6 @@
         </w:rPr>
         <w:t>serve({</w:t>
       </w:r>
-      <w:proofErr w:type="gramEnd"/>
     </w:p>
     <w:p>
       <w:pPr>
@@ -18690,23 +18167,7 @@
           <w:rStyle w:val="HTMLCode"/>
           <w:rFonts w:ascii="Cambria" w:hAnsi="Cambria"/>
         </w:rPr>
-        <w:t xml:space="preserve">   </w:t>
-      </w:r>
-      <w:proofErr w:type="gramStart"/>
-      <w:r>
-        <w:rPr>
-          <w:rStyle w:val="HTMLCode"/>
-          <w:rFonts w:ascii="Cambria" w:hAnsi="Cambria"/>
-        </w:rPr>
-        <w:t>client</w:t>
-      </w:r>
-      <w:proofErr w:type="gramEnd"/>
-      <w:r>
-        <w:rPr>
-          <w:rStyle w:val="HTMLCode"/>
-          <w:rFonts w:ascii="Cambria" w:hAnsi="Cambria"/>
-        </w:rPr>
-        <w:t xml:space="preserve">: </w:t>
+        <w:t xml:space="preserve">   client: </w:t>
       </w:r>
       <w:proofErr w:type="spellStart"/>
       <w:r>
@@ -18738,17 +18199,8 @@
           <w:rStyle w:val="HTMLCode"/>
           <w:rFonts w:ascii="Cambria" w:hAnsi="Cambria"/>
         </w:rPr>
-        <w:t xml:space="preserve">   </w:t>
-      </w:r>
-      <w:proofErr w:type="gramStart"/>
-      <w:r>
-        <w:rPr>
-          <w:rStyle w:val="HTMLCode"/>
-          <w:rFonts w:ascii="Cambria" w:hAnsi="Cambria"/>
-        </w:rPr>
-        <w:t>functions</w:t>
-      </w:r>
-      <w:proofErr w:type="gramEnd"/>
+        <w:t xml:space="preserve">   functions</w:t>
+      </w:r>
     </w:p>
     <w:p>
       <w:pPr>
@@ -18854,21 +18306,12 @@
           <w:rFonts w:ascii="Cambria" w:hAnsi="Cambria"/>
         </w:rPr>
       </w:pPr>
-      <w:proofErr w:type="gramStart"/>
-      <w:r>
-        <w:rPr>
-          <w:rStyle w:val="HTMLCode"/>
-          <w:rFonts w:ascii="Cambria" w:hAnsi="Cambria"/>
-        </w:rPr>
-        <w:t>import</w:t>
-      </w:r>
-      <w:proofErr w:type="gramEnd"/>
-      <w:r>
-        <w:rPr>
-          <w:rStyle w:val="HTMLCode"/>
-          <w:rFonts w:ascii="Cambria" w:hAnsi="Cambria"/>
-        </w:rPr>
-        <w:t xml:space="preserve"> </w:t>
+      <w:r>
+        <w:rPr>
+          <w:rStyle w:val="HTMLCode"/>
+          <w:rFonts w:ascii="Cambria" w:hAnsi="Cambria"/>
+        </w:rPr>
+        <w:t xml:space="preserve">import </w:t>
       </w:r>
       <w:proofErr w:type="spellStart"/>
       <w:r>
@@ -18895,21 +18338,12 @@
           <w:rFonts w:ascii="Cambria" w:hAnsi="Cambria"/>
         </w:rPr>
       </w:pPr>
-      <w:proofErr w:type="gramStart"/>
-      <w:r>
-        <w:rPr>
-          <w:rStyle w:val="HTMLCode"/>
-          <w:rFonts w:ascii="Cambria" w:hAnsi="Cambria"/>
-        </w:rPr>
-        <w:t>import</w:t>
-      </w:r>
-      <w:proofErr w:type="gramEnd"/>
-      <w:r>
-        <w:rPr>
-          <w:rStyle w:val="HTMLCode"/>
-          <w:rFonts w:ascii="Cambria" w:hAnsi="Cambria"/>
-        </w:rPr>
-        <w:t xml:space="preserve"> </w:t>
+      <w:r>
+        <w:rPr>
+          <w:rStyle w:val="HTMLCode"/>
+          <w:rFonts w:ascii="Cambria" w:hAnsi="Cambria"/>
+        </w:rPr>
+        <w:t xml:space="preserve">import </w:t>
       </w:r>
       <w:proofErr w:type="spellStart"/>
       <w:r>
@@ -18936,21 +18370,12 @@
           <w:rFonts w:ascii="Cambria" w:hAnsi="Cambria"/>
         </w:rPr>
       </w:pPr>
-      <w:proofErr w:type="gramStart"/>
-      <w:r>
-        <w:rPr>
-          <w:rStyle w:val="HTMLCode"/>
-          <w:rFonts w:ascii="Cambria" w:hAnsi="Cambria"/>
-        </w:rPr>
-        <w:t>import</w:t>
-      </w:r>
-      <w:proofErr w:type="gramEnd"/>
-      <w:r>
-        <w:rPr>
-          <w:rStyle w:val="HTMLCode"/>
-          <w:rFonts w:ascii="Cambria" w:hAnsi="Cambria"/>
-        </w:rPr>
-        <w:t xml:space="preserve"> </w:t>
+      <w:r>
+        <w:rPr>
+          <w:rStyle w:val="HTMLCode"/>
+          <w:rFonts w:ascii="Cambria" w:hAnsi="Cambria"/>
+        </w:rPr>
+        <w:t xml:space="preserve">import </w:t>
       </w:r>
       <w:proofErr w:type="spellStart"/>
       <w:r>
@@ -18977,21 +18402,12 @@
           <w:rFonts w:ascii="Cambria" w:hAnsi="Cambria"/>
         </w:rPr>
       </w:pPr>
-      <w:proofErr w:type="gramStart"/>
-      <w:r>
-        <w:rPr>
-          <w:rStyle w:val="HTMLCode"/>
-          <w:rFonts w:ascii="Cambria" w:hAnsi="Cambria"/>
-        </w:rPr>
-        <w:t>import</w:t>
-      </w:r>
-      <w:proofErr w:type="gramEnd"/>
-      <w:r>
-        <w:rPr>
-          <w:rStyle w:val="HTMLCode"/>
-          <w:rFonts w:ascii="Cambria" w:hAnsi="Cambria"/>
-        </w:rPr>
-        <w:t xml:space="preserve"> </w:t>
+      <w:r>
+        <w:rPr>
+          <w:rStyle w:val="HTMLCode"/>
+          <w:rFonts w:ascii="Cambria" w:hAnsi="Cambria"/>
+        </w:rPr>
+        <w:t xml:space="preserve">import </w:t>
       </w:r>
       <w:proofErr w:type="spellStart"/>
       <w:r>
@@ -19018,21 +18434,12 @@
           <w:rFonts w:ascii="Cambria" w:hAnsi="Cambria"/>
         </w:rPr>
       </w:pPr>
-      <w:proofErr w:type="gramStart"/>
-      <w:r>
-        <w:rPr>
-          <w:rStyle w:val="HTMLCode"/>
-          <w:rFonts w:ascii="Cambria" w:hAnsi="Cambria"/>
-        </w:rPr>
-        <w:t>import</w:t>
-      </w:r>
-      <w:proofErr w:type="gramEnd"/>
-      <w:r>
-        <w:rPr>
-          <w:rStyle w:val="HTMLCode"/>
-          <w:rFonts w:ascii="Cambria" w:hAnsi="Cambria"/>
-        </w:rPr>
-        <w:t xml:space="preserve"> </w:t>
+      <w:r>
+        <w:rPr>
+          <w:rStyle w:val="HTMLCode"/>
+          <w:rFonts w:ascii="Cambria" w:hAnsi="Cambria"/>
+        </w:rPr>
+        <w:t xml:space="preserve">import </w:t>
       </w:r>
       <w:proofErr w:type="spellStart"/>
       <w:r>
@@ -19073,21 +18480,12 @@
           <w:rFonts w:ascii="Cambria" w:hAnsi="Cambria"/>
         </w:rPr>
       </w:pPr>
-      <w:proofErr w:type="gramStart"/>
-      <w:r>
-        <w:rPr>
-          <w:rStyle w:val="HTMLCode"/>
-          <w:rFonts w:ascii="Cambria" w:hAnsi="Cambria"/>
-        </w:rPr>
-        <w:t>import</w:t>
-      </w:r>
-      <w:proofErr w:type="gramEnd"/>
-      <w:r>
-        <w:rPr>
-          <w:rStyle w:val="HTMLCode"/>
-          <w:rFonts w:ascii="Cambria" w:hAnsi="Cambria"/>
-        </w:rPr>
-        <w:t xml:space="preserve"> { functions } from "./events"</w:t>
+      <w:r>
+        <w:rPr>
+          <w:rStyle w:val="HTMLCode"/>
+          <w:rFonts w:ascii="Cambria" w:hAnsi="Cambria"/>
+        </w:rPr>
+        <w:t>import { functions } from "./events"</w:t>
       </w:r>
     </w:p>
     <w:p>
@@ -19169,21 +18567,12 @@
           <w:rFonts w:ascii="Cambria" w:hAnsi="Cambria"/>
         </w:rPr>
       </w:pPr>
-      <w:proofErr w:type="gramStart"/>
-      <w:r>
-        <w:rPr>
-          <w:rStyle w:val="HTMLCode"/>
-          <w:rFonts w:ascii="Cambria" w:hAnsi="Cambria"/>
-        </w:rPr>
-        <w:t>events</w:t>
-      </w:r>
-      <w:proofErr w:type="gramEnd"/>
-      <w:r>
-        <w:rPr>
-          <w:rStyle w:val="HTMLCode"/>
-          <w:rFonts w:ascii="Cambria" w:hAnsi="Cambria"/>
-        </w:rPr>
-        <w:t>/</w:t>
+      <w:r>
+        <w:rPr>
+          <w:rStyle w:val="HTMLCode"/>
+          <w:rFonts w:ascii="Cambria" w:hAnsi="Cambria"/>
+        </w:rPr>
+        <w:t>events/</w:t>
       </w:r>
     </w:p>
     <w:p>
@@ -19717,21 +19106,12 @@
           <w:rFonts w:ascii="Cambria" w:hAnsi="Cambria"/>
         </w:rPr>
       </w:pPr>
-      <w:proofErr w:type="gramStart"/>
-      <w:r>
-        <w:rPr>
-          <w:rStyle w:val="HTMLCode"/>
-          <w:rFonts w:ascii="Cambria" w:hAnsi="Cambria"/>
-        </w:rPr>
-        <w:t>routes</w:t>
-      </w:r>
-      <w:proofErr w:type="gramEnd"/>
-      <w:r>
-        <w:rPr>
-          <w:rStyle w:val="HTMLCode"/>
-          <w:rFonts w:ascii="Cambria" w:hAnsi="Cambria"/>
-        </w:rPr>
-        <w:t>/</w:t>
+      <w:r>
+        <w:rPr>
+          <w:rStyle w:val="HTMLCode"/>
+          <w:rFonts w:ascii="Cambria" w:hAnsi="Cambria"/>
+        </w:rPr>
+        <w:t>routes/</w:t>
       </w:r>
     </w:p>
     <w:p>
@@ -19831,7 +19211,6 @@
           <w:rFonts w:ascii="Cambria" w:hAnsi="Cambria"/>
         </w:rPr>
       </w:pPr>
-      <w:proofErr w:type="gramStart"/>
       <w:r>
         <w:rPr>
           <w:rStyle w:val="HTMLCode"/>
@@ -19839,7 +19218,6 @@
         </w:rPr>
         <w:t>routes/index.js</w:t>
       </w:r>
-      <w:proofErr w:type="gramEnd"/>
     </w:p>
     <w:p>
       <w:pPr>
@@ -19849,21 +19227,12 @@
           <w:rFonts w:ascii="Cambria" w:hAnsi="Cambria"/>
         </w:rPr>
       </w:pPr>
-      <w:proofErr w:type="gramStart"/>
-      <w:r>
-        <w:rPr>
-          <w:rStyle w:val="HTMLCode"/>
-          <w:rFonts w:ascii="Cambria" w:hAnsi="Cambria"/>
-        </w:rPr>
-        <w:t>export</w:t>
-      </w:r>
-      <w:proofErr w:type="gramEnd"/>
-      <w:r>
-        <w:rPr>
-          <w:rStyle w:val="HTMLCode"/>
-          <w:rFonts w:ascii="Cambria" w:hAnsi="Cambria"/>
-        </w:rPr>
-        <w:t xml:space="preserve"> default [</w:t>
+      <w:r>
+        <w:rPr>
+          <w:rStyle w:val="HTMLCode"/>
+          <w:rFonts w:ascii="Cambria" w:hAnsi="Cambria"/>
+        </w:rPr>
+        <w:t>export default [</w:t>
       </w:r>
     </w:p>
     <w:p>
@@ -19882,7 +19251,6 @@
         <w:t xml:space="preserve">   </w:t>
       </w:r>
       <w:proofErr w:type="spellStart"/>
-      <w:proofErr w:type="gramStart"/>
       <w:r>
         <w:rPr>
           <w:rStyle w:val="HTMLCode"/>
@@ -19891,7 +19259,6 @@
         <w:t>authRoutes</w:t>
       </w:r>
       <w:proofErr w:type="spellEnd"/>
-      <w:proofErr w:type="gramEnd"/>
       <w:r>
         <w:rPr>
           <w:rStyle w:val="HTMLCode"/>
@@ -19916,7 +19283,6 @@
         <w:t xml:space="preserve">   </w:t>
       </w:r>
       <w:proofErr w:type="spellStart"/>
-      <w:proofErr w:type="gramStart"/>
       <w:r>
         <w:rPr>
           <w:rStyle w:val="HTMLCode"/>
@@ -19925,7 +19291,6 @@
         <w:t>userRoutes</w:t>
       </w:r>
       <w:proofErr w:type="spellEnd"/>
-      <w:proofErr w:type="gramEnd"/>
       <w:r>
         <w:rPr>
           <w:rStyle w:val="HTMLCode"/>
@@ -19950,7 +19315,6 @@
         <w:t xml:space="preserve">   </w:t>
       </w:r>
       <w:proofErr w:type="spellStart"/>
-      <w:proofErr w:type="gramStart"/>
       <w:r>
         <w:rPr>
           <w:rStyle w:val="HTMLCode"/>
@@ -19959,7 +19323,6 @@
         <w:t>projectRoutes</w:t>
       </w:r>
       <w:proofErr w:type="spellEnd"/>
-      <w:proofErr w:type="gramEnd"/>
     </w:p>
     <w:p>
       <w:pPr>
@@ -20022,21 +19385,12 @@
           <w:rFonts w:ascii="Cambria" w:hAnsi="Cambria"/>
         </w:rPr>
       </w:pPr>
-      <w:proofErr w:type="gramStart"/>
-      <w:r>
-        <w:rPr>
-          <w:rStyle w:val="HTMLCode"/>
-          <w:rFonts w:ascii="Cambria" w:hAnsi="Cambria"/>
-        </w:rPr>
-        <w:t>reducers</w:t>
-      </w:r>
-      <w:proofErr w:type="gramEnd"/>
-      <w:r>
-        <w:rPr>
-          <w:rStyle w:val="HTMLCode"/>
-          <w:rFonts w:ascii="Cambria" w:hAnsi="Cambria"/>
-        </w:rPr>
-        <w:t>/</w:t>
+      <w:r>
+        <w:rPr>
+          <w:rStyle w:val="HTMLCode"/>
+          <w:rFonts w:ascii="Cambria" w:hAnsi="Cambria"/>
+        </w:rPr>
+        <w:t>reducers/</w:t>
       </w:r>
     </w:p>
     <w:p>
@@ -20110,7 +19464,6 @@
         </w:rPr>
       </w:pPr>
       <w:proofErr w:type="spellStart"/>
-      <w:proofErr w:type="gramStart"/>
       <w:r>
         <w:rPr>
           <w:rStyle w:val="HTMLCode"/>
@@ -20126,7 +19479,6 @@
         </w:rPr>
         <w:t>({</w:t>
       </w:r>
-      <w:proofErr w:type="gramEnd"/>
     </w:p>
     <w:p>
       <w:pPr>
@@ -20141,23 +19493,7 @@
           <w:rStyle w:val="HTMLCode"/>
           <w:rFonts w:ascii="Cambria" w:hAnsi="Cambria"/>
         </w:rPr>
-        <w:t xml:space="preserve">   </w:t>
-      </w:r>
-      <w:proofErr w:type="gramStart"/>
-      <w:r>
-        <w:rPr>
-          <w:rStyle w:val="HTMLCode"/>
-          <w:rFonts w:ascii="Cambria" w:hAnsi="Cambria"/>
-        </w:rPr>
-        <w:t>user</w:t>
-      </w:r>
-      <w:proofErr w:type="gramEnd"/>
-      <w:r>
-        <w:rPr>
-          <w:rStyle w:val="HTMLCode"/>
-          <w:rFonts w:ascii="Cambria" w:hAnsi="Cambria"/>
-        </w:rPr>
-        <w:t>,</w:t>
+        <w:t xml:space="preserve">   user,</w:t>
       </w:r>
     </w:p>
     <w:p>
@@ -20173,23 +19509,7 @@
           <w:rStyle w:val="HTMLCode"/>
           <w:rFonts w:ascii="Cambria" w:hAnsi="Cambria"/>
         </w:rPr>
-        <w:t xml:space="preserve">   </w:t>
-      </w:r>
-      <w:proofErr w:type="gramStart"/>
-      <w:r>
-        <w:rPr>
-          <w:rStyle w:val="HTMLCode"/>
-          <w:rFonts w:ascii="Cambria" w:hAnsi="Cambria"/>
-        </w:rPr>
-        <w:t>auth</w:t>
-      </w:r>
-      <w:proofErr w:type="gramEnd"/>
-      <w:r>
-        <w:rPr>
-          <w:rStyle w:val="HTMLCode"/>
-          <w:rFonts w:ascii="Cambria" w:hAnsi="Cambria"/>
-        </w:rPr>
-        <w:t>,</w:t>
+        <w:t xml:space="preserve">   auth,</w:t>
       </w:r>
     </w:p>
     <w:p>
@@ -20205,17 +19525,8 @@
           <w:rStyle w:val="HTMLCode"/>
           <w:rFonts w:ascii="Cambria" w:hAnsi="Cambria"/>
         </w:rPr>
-        <w:t xml:space="preserve">   </w:t>
-      </w:r>
-      <w:proofErr w:type="gramStart"/>
-      <w:r>
-        <w:rPr>
-          <w:rStyle w:val="HTMLCode"/>
-          <w:rFonts w:ascii="Cambria" w:hAnsi="Cambria"/>
-        </w:rPr>
-        <w:t>task</w:t>
-      </w:r>
-      <w:proofErr w:type="gramEnd"/>
+        <w:t xml:space="preserve">   task</w:t>
+      </w:r>
     </w:p>
     <w:p>
       <w:pPr>
@@ -20359,19 +19670,11 @@
           <w:rFonts w:ascii="Cambria" w:hAnsi="Cambria"/>
         </w:rPr>
       </w:pPr>
-      <w:proofErr w:type="gramStart"/>
-      <w:r>
-        <w:rPr>
-          <w:rFonts w:ascii="Cambria" w:hAnsi="Cambria"/>
-        </w:rPr>
-        <w:t>often</w:t>
-      </w:r>
-      <w:proofErr w:type="gramEnd"/>
-      <w:r>
-        <w:rPr>
-          <w:rFonts w:ascii="Cambria" w:hAnsi="Cambria"/>
-        </w:rPr>
-        <w:t xml:space="preserve"> use registry-based function loading to manage event handlers.</w:t>
+      <w:r>
+        <w:rPr>
+          <w:rFonts w:ascii="Cambria" w:hAnsi="Cambria"/>
+        </w:rPr>
+        <w:t>often use registry-based function loading to manage event handlers.</w:t>
       </w:r>
     </w:p>
     <w:p>
@@ -20544,14 +19847,12 @@
           <w:rFonts w:ascii="Cambria" w:hAnsi="Cambria"/>
         </w:rPr>
       </w:pPr>
-      <w:proofErr w:type="gramStart"/>
       <w:r>
         <w:rPr>
           <w:rFonts w:ascii="Cambria" w:hAnsi="Cambria"/>
         </w:rPr>
         <w:t>For very small projects with only a few modules.</w:t>
       </w:r>
-      <w:proofErr w:type="gramEnd"/>
     </w:p>
     <w:p>
       <w:pPr>
@@ -20766,7 +20067,6 @@
         </w:rPr>
       </w:pPr>
       <w:proofErr w:type="spellStart"/>
-      <w:proofErr w:type="gramStart"/>
       <w:r>
         <w:rPr>
           <w:rStyle w:val="HTMLCode"/>
@@ -20775,7 +20075,6 @@
         <w:t>inngest</w:t>
       </w:r>
       <w:proofErr w:type="spellEnd"/>
-      <w:proofErr w:type="gramEnd"/>
       <w:r>
         <w:rPr>
           <w:rStyle w:val="HTMLCode"/>
@@ -20854,21 +20153,12 @@
           <w:rFonts w:ascii="Cambria" w:hAnsi="Cambria"/>
         </w:rPr>
       </w:pPr>
-      <w:proofErr w:type="gramStart"/>
-      <w:r>
-        <w:rPr>
-          <w:rStyle w:val="HTMLCode"/>
-          <w:rFonts w:ascii="Cambria" w:hAnsi="Cambria"/>
-        </w:rPr>
-        <w:t>client.js  →</w:t>
-      </w:r>
-      <w:proofErr w:type="gramEnd"/>
-      <w:r>
-        <w:rPr>
-          <w:rStyle w:val="HTMLCode"/>
-          <w:rFonts w:ascii="Cambria" w:hAnsi="Cambria"/>
-        </w:rPr>
-        <w:t xml:space="preserve"> creates the </w:t>
+      <w:r>
+        <w:rPr>
+          <w:rStyle w:val="HTMLCode"/>
+          <w:rFonts w:ascii="Cambria" w:hAnsi="Cambria"/>
+        </w:rPr>
+        <w:t xml:space="preserve">client.js  → creates the </w:t>
       </w:r>
       <w:proofErr w:type="spellStart"/>
       <w:r>
@@ -20927,21 +20217,12 @@
           <w:rFonts w:ascii="Cambria" w:hAnsi="Cambria"/>
         </w:rPr>
       </w:pPr>
-      <w:proofErr w:type="gramStart"/>
-      <w:r>
-        <w:rPr>
-          <w:rStyle w:val="HTMLCode"/>
-          <w:rFonts w:ascii="Cambria" w:hAnsi="Cambria"/>
-        </w:rPr>
-        <w:t>server.js  →</w:t>
-      </w:r>
-      <w:proofErr w:type="gramEnd"/>
-      <w:r>
-        <w:rPr>
-          <w:rStyle w:val="HTMLCode"/>
-          <w:rFonts w:ascii="Cambria" w:hAnsi="Cambria"/>
-        </w:rPr>
-        <w:t xml:space="preserve"> starts the server and registers the functions</w:t>
+      <w:r>
+        <w:rPr>
+          <w:rStyle w:val="HTMLCode"/>
+          <w:rFonts w:ascii="Cambria" w:hAnsi="Cambria"/>
+        </w:rPr>
+        <w:t>server.js  → starts the server and registers the functions</w:t>
       </w:r>
     </w:p>
     <w:p>
@@ -21135,6 +20416,1795 @@
           <w:rFonts w:ascii="Cambria" w:hAnsi="Cambria"/>
         </w:rPr>
       </w:pPr>
+    </w:p>
+    <w:p>
+      <w:pPr>
+        <w:rPr>
+          <w:rFonts w:ascii="Cambria" w:hAnsi="Cambria"/>
+        </w:rPr>
+      </w:pPr>
+    </w:p>
+    <w:p>
+      <w:pPr>
+        <w:rPr>
+          <w:rFonts w:ascii="Cambria" w:hAnsi="Cambria"/>
+        </w:rPr>
+      </w:pPr>
+    </w:p>
+    <w:p>
+      <w:pPr>
+        <w:rPr>
+          <w:rFonts w:ascii="Cambria" w:hAnsi="Cambria"/>
+        </w:rPr>
+      </w:pPr>
+    </w:p>
+    <w:p>
+      <w:pPr>
+        <w:rPr>
+          <w:rFonts w:ascii="Cambria" w:hAnsi="Cambria"/>
+        </w:rPr>
+      </w:pPr>
+    </w:p>
+    <w:p>
+      <w:pPr>
+        <w:rPr>
+          <w:rFonts w:ascii="Cambria" w:hAnsi="Cambria"/>
+        </w:rPr>
+      </w:pPr>
+    </w:p>
+    <w:p>
+      <w:pPr>
+        <w:rPr>
+          <w:rFonts w:ascii="Cambria" w:hAnsi="Cambria"/>
+        </w:rPr>
+      </w:pPr>
+    </w:p>
+    <w:p>
+      <w:pPr>
+        <w:rPr>
+          <w:rFonts w:ascii="Cambria" w:hAnsi="Cambria"/>
+        </w:rPr>
+      </w:pPr>
+    </w:p>
+    <w:p>
+      <w:pPr>
+        <w:rPr>
+          <w:rFonts w:ascii="Cambria" w:hAnsi="Cambria"/>
+        </w:rPr>
+      </w:pPr>
+    </w:p>
+    <w:p>
+      <w:pPr>
+        <w:rPr>
+          <w:rFonts w:ascii="Cambria" w:hAnsi="Cambria"/>
+        </w:rPr>
+      </w:pPr>
+    </w:p>
+    <w:p>
+      <w:pPr>
+        <w:rPr>
+          <w:rFonts w:ascii="Cambria" w:hAnsi="Cambria"/>
+        </w:rPr>
+      </w:pPr>
+    </w:p>
+    <w:p>
+      <w:pPr>
+        <w:rPr>
+          <w:rFonts w:ascii="Cambria" w:hAnsi="Cambria"/>
+        </w:rPr>
+      </w:pPr>
+    </w:p>
+    <w:p>
+      <w:pPr>
+        <w:rPr>
+          <w:rFonts w:ascii="Cambria" w:hAnsi="Cambria"/>
+        </w:rPr>
+      </w:pPr>
+    </w:p>
+    <w:p>
+      <w:pPr>
+        <w:rPr>
+          <w:rFonts w:ascii="Cambria" w:hAnsi="Cambria"/>
+        </w:rPr>
+      </w:pPr>
+    </w:p>
+    <w:p>
+      <w:pPr>
+        <w:rPr>
+          <w:rFonts w:ascii="Cambria" w:hAnsi="Cambria"/>
+        </w:rPr>
+      </w:pPr>
+    </w:p>
+    <w:p>
+      <w:pPr>
+        <w:rPr>
+          <w:rFonts w:ascii="Cambria" w:hAnsi="Cambria"/>
+        </w:rPr>
+      </w:pPr>
+    </w:p>
+    <w:p>
+      <w:pPr>
+        <w:rPr>
+          <w:rFonts w:ascii="Cambria" w:hAnsi="Cambria"/>
+        </w:rPr>
+      </w:pPr>
+    </w:p>
+    <w:p>
+      <w:pPr>
+        <w:rPr>
+          <w:rFonts w:ascii="Cambria" w:hAnsi="Cambria"/>
+        </w:rPr>
+      </w:pPr>
+    </w:p>
+    <w:p>
+      <w:pPr>
+        <w:rPr>
+          <w:rFonts w:ascii="Cambria" w:hAnsi="Cambria"/>
+        </w:rPr>
+      </w:pPr>
+    </w:p>
+    <w:p>
+      <w:pPr>
+        <w:rPr>
+          <w:rFonts w:ascii="Cambria" w:hAnsi="Cambria"/>
+        </w:rPr>
+      </w:pPr>
+    </w:p>
+    <w:p>
+      <w:pPr>
+        <w:rPr>
+          <w:rFonts w:ascii="Cambria" w:hAnsi="Cambria"/>
+        </w:rPr>
+      </w:pPr>
+    </w:p>
+    <w:p>
+      <w:pPr>
+        <w:rPr>
+          <w:rFonts w:ascii="Cambria" w:hAnsi="Cambria"/>
+        </w:rPr>
+      </w:pPr>
+    </w:p>
+    <w:p>
+      <w:pPr>
+        <w:rPr>
+          <w:rFonts w:ascii="Cambria" w:hAnsi="Cambria"/>
+        </w:rPr>
+      </w:pPr>
+    </w:p>
+    <w:p>
+      <w:pPr>
+        <w:rPr>
+          <w:rFonts w:ascii="Cambria" w:hAnsi="Cambria"/>
+        </w:rPr>
+      </w:pPr>
+    </w:p>
+    <w:p>
+      <w:pPr>
+        <w:rPr>
+          <w:rFonts w:ascii="Cambria" w:hAnsi="Cambria"/>
+        </w:rPr>
+      </w:pPr>
+    </w:p>
+    <w:p>
+      <w:pPr>
+        <w:rPr>
+          <w:rFonts w:ascii="Cambria" w:hAnsi="Cambria"/>
+        </w:rPr>
+      </w:pPr>
+    </w:p>
+    <w:p>
+      <w:pPr>
+        <w:pStyle w:val="Heading1"/>
+      </w:pPr>
+      <w:r>
+        <w:t>1</w:t>
+      </w:r>
+      <w:r>
+        <w:rPr>
+          <w:rFonts w:ascii="Cambria" w:hAnsi="Cambria" w:cs="Cambria"/>
+        </w:rPr>
+        <w:t>️</w:t>
+      </w:r>
+      <w:r>
+        <w:rPr>
+          <w:rFonts w:ascii="Tahoma" w:hAnsi="Tahoma" w:cs="Tahoma"/>
+        </w:rPr>
+        <w:t>⃣</w:t>
+      </w:r>
+      <w:r>
+        <w:t xml:space="preserve"> What workflow actually happened (end-to-end)</w:t>
+      </w:r>
+    </w:p>
+    <w:p>
+      <w:pPr>
+        <w:pStyle w:val="NormalWeb"/>
+      </w:pPr>
+      <w:r>
+        <w:t xml:space="preserve">Your current architecture is </w:t>
+      </w:r>
+      <w:r>
+        <w:rPr>
+          <w:rStyle w:val="Strong"/>
+        </w:rPr>
+        <w:t>event-driven</w:t>
+      </w:r>
+      <w:r>
+        <w:t>. The pipeline that ran is:</w:t>
+      </w:r>
+    </w:p>
+    <w:p>
+      <w:pPr>
+        <w:pStyle w:val="HTMLPreformatted"/>
+      </w:pPr>
+      <w:r>
+        <w:t>User signs up (Google / Clerk)</w:t>
+      </w:r>
+      <w:r>
+        <w:br/>
+        <w:t xml:space="preserve">        ↓</w:t>
+      </w:r>
+      <w:r>
+        <w:br/>
+        <w:t>Clerk creates the user</w:t>
+      </w:r>
+      <w:r>
+        <w:br/>
+        <w:t xml:space="preserve">        ↓</w:t>
+      </w:r>
+      <w:r>
+        <w:br/>
+        <w:t xml:space="preserve">Clerk fires event: </w:t>
+      </w:r>
+      <w:proofErr w:type="spellStart"/>
+      <w:r>
+        <w:t>user.created</w:t>
+      </w:r>
+      <w:proofErr w:type="spellEnd"/>
+      <w:r>
+        <w:br/>
+        <w:t xml:space="preserve">        ↓</w:t>
+      </w:r>
+      <w:r>
+        <w:br/>
+        <w:t xml:space="preserve">Clerk </w:t>
+      </w:r>
+      <w:proofErr w:type="spellStart"/>
+      <w:r>
+        <w:t>Webhook</w:t>
+      </w:r>
+      <w:proofErr w:type="spellEnd"/>
+      <w:r>
+        <w:t xml:space="preserve"> sends POST request</w:t>
+      </w:r>
+      <w:r>
+        <w:br/>
+        <w:t xml:space="preserve">        ↓</w:t>
+      </w:r>
+      <w:r>
+        <w:br/>
+        <w:t>https://&lt;ngrok-url&gt;/api/webhooks/clerk</w:t>
+      </w:r>
+      <w:r>
+        <w:br/>
+        <w:t xml:space="preserve">        ↓</w:t>
+      </w:r>
+      <w:r>
+        <w:br/>
+        <w:t xml:space="preserve">Express </w:t>
+      </w:r>
+      <w:proofErr w:type="spellStart"/>
+      <w:r>
+        <w:t>webhook</w:t>
+      </w:r>
+      <w:proofErr w:type="spellEnd"/>
+      <w:r>
+        <w:t xml:space="preserve"> adapter receives it</w:t>
+      </w:r>
+      <w:r>
+        <w:br/>
+        <w:t xml:space="preserve">        ↓</w:t>
+      </w:r>
+      <w:r>
+        <w:br/>
+      </w:r>
+      <w:proofErr w:type="spellStart"/>
+      <w:r>
+        <w:t>inngest.send</w:t>
+      </w:r>
+      <w:proofErr w:type="spellEnd"/>
+      <w:r>
+        <w:t>({ name: "clerk/</w:t>
+      </w:r>
+      <w:proofErr w:type="spellStart"/>
+      <w:r>
+        <w:t>user.created</w:t>
+      </w:r>
+      <w:proofErr w:type="spellEnd"/>
+      <w:r>
+        <w:t>" })</w:t>
+      </w:r>
+      <w:r>
+        <w:br/>
+        <w:t xml:space="preserve">        ↓</w:t>
+      </w:r>
+      <w:r>
+        <w:br/>
+      </w:r>
+      <w:proofErr w:type="spellStart"/>
+      <w:r>
+        <w:t>Inngest</w:t>
+      </w:r>
+      <w:proofErr w:type="spellEnd"/>
+      <w:r>
+        <w:t xml:space="preserve"> Dev Server receives event</w:t>
+      </w:r>
+      <w:r>
+        <w:br/>
+        <w:t xml:space="preserve">        ↓</w:t>
+      </w:r>
+      <w:r>
+        <w:br/>
+      </w:r>
+      <w:proofErr w:type="spellStart"/>
+      <w:r>
+        <w:t>userCreation</w:t>
+      </w:r>
+      <w:proofErr w:type="spellEnd"/>
+      <w:r>
+        <w:t xml:space="preserve"> function runs</w:t>
+      </w:r>
+      <w:r>
+        <w:br/>
+        <w:t xml:space="preserve">        ↓</w:t>
+      </w:r>
+      <w:r>
+        <w:br/>
+      </w:r>
+      <w:proofErr w:type="spellStart"/>
+      <w:r>
+        <w:t>Prisma</w:t>
+      </w:r>
+      <w:proofErr w:type="spellEnd"/>
+      <w:r>
+        <w:t xml:space="preserve"> inserts user</w:t>
+      </w:r>
+      <w:r>
+        <w:br/>
+        <w:t xml:space="preserve">        ↓</w:t>
+      </w:r>
+      <w:r>
+        <w:br/>
+        <w:t>Neon database updated</w:t>
+      </w:r>
+    </w:p>
+    <w:p>
+      <w:pPr>
+        <w:pStyle w:val="Heading1"/>
+      </w:pPr>
+      <w:r>
+        <w:rPr>
+          <w:rFonts w:ascii="Cambria" w:hAnsi="Cambria"/>
+        </w:rPr>
+        <w:br/>
+      </w:r>
+      <w:r>
+        <w:rPr>
+          <w:rFonts w:ascii="Cambria" w:hAnsi="Cambria"/>
+        </w:rPr>
+        <w:br/>
+      </w:r>
+      <w:r>
+        <w:rPr>
+          <w:rFonts w:ascii="Cambria" w:hAnsi="Cambria"/>
+        </w:rPr>
+        <w:br/>
+      </w:r>
+      <w:r>
+        <w:rPr>
+          <w:rFonts w:ascii="Cambria" w:hAnsi="Cambria"/>
+        </w:rPr>
+        <w:br/>
+      </w:r>
+      <w:r>
+        <w:rPr>
+          <w:rFonts w:ascii="Cambria" w:hAnsi="Cambria"/>
+        </w:rPr>
+        <w:br/>
+      </w:r>
+      <w:r>
+        <w:t>What actually happened in your current setup</w:t>
+      </w:r>
+    </w:p>
+    <w:p>
+      <w:pPr>
+        <w:pStyle w:val="NormalWeb"/>
+      </w:pPr>
+      <w:r>
+        <w:t>Right now your system flow is exactly this:</w:t>
+      </w:r>
+    </w:p>
+    <w:p>
+      <w:pPr>
+        <w:pStyle w:val="HTMLPreformatted"/>
+      </w:pPr>
+      <w:r>
+        <w:t>Clerk</w:t>
+      </w:r>
+      <w:r>
+        <w:br/>
+        <w:t xml:space="preserve">   ↓</w:t>
+      </w:r>
+      <w:r>
+        <w:br/>
+      </w:r>
+      <w:proofErr w:type="spellStart"/>
+      <w:r>
+        <w:t>Webhook</w:t>
+      </w:r>
+      <w:proofErr w:type="spellEnd"/>
+      <w:r>
+        <w:br/>
+        <w:t xml:space="preserve">   ↓</w:t>
+      </w:r>
+      <w:r>
+        <w:br/>
+      </w:r>
+      <w:proofErr w:type="spellStart"/>
+      <w:r>
+        <w:t>ngrok</w:t>
+      </w:r>
+      <w:proofErr w:type="spellEnd"/>
+      <w:r>
+        <w:t xml:space="preserve"> public URL</w:t>
+      </w:r>
+      <w:r>
+        <w:br/>
+        <w:t xml:space="preserve">   ↓</w:t>
+      </w:r>
+      <w:r>
+        <w:br/>
+        <w:t>localhost:5000/</w:t>
+      </w:r>
+      <w:proofErr w:type="spellStart"/>
+      <w:r>
+        <w:t>api</w:t>
+      </w:r>
+      <w:proofErr w:type="spellEnd"/>
+      <w:r>
+        <w:t>/</w:t>
+      </w:r>
+      <w:proofErr w:type="spellStart"/>
+      <w:r>
+        <w:t>webhooks</w:t>
+      </w:r>
+      <w:proofErr w:type="spellEnd"/>
+      <w:r>
+        <w:t>/clerk</w:t>
+      </w:r>
+      <w:r>
+        <w:br/>
+        <w:t xml:space="preserve">   ↓</w:t>
+      </w:r>
+      <w:r>
+        <w:br/>
+        <w:t xml:space="preserve">Express </w:t>
+      </w:r>
+      <w:proofErr w:type="spellStart"/>
+      <w:r>
+        <w:t>webhook</w:t>
+      </w:r>
+      <w:proofErr w:type="spellEnd"/>
+      <w:r>
+        <w:t xml:space="preserve"> adapter</w:t>
+      </w:r>
+      <w:r>
+        <w:br/>
+        <w:t xml:space="preserve">   ↓</w:t>
+      </w:r>
+      <w:r>
+        <w:br/>
+      </w:r>
+      <w:proofErr w:type="spellStart"/>
+      <w:r>
+        <w:t>inngest.send</w:t>
+      </w:r>
+      <w:proofErr w:type="spellEnd"/>
+      <w:r>
+        <w:t>()</w:t>
+      </w:r>
+      <w:r>
+        <w:br/>
+        <w:t xml:space="preserve">   ↓</w:t>
+      </w:r>
+      <w:r>
+        <w:br/>
+      </w:r>
+      <w:proofErr w:type="spellStart"/>
+      <w:r>
+        <w:t>Inngest</w:t>
+      </w:r>
+      <w:proofErr w:type="spellEnd"/>
+      <w:r>
+        <w:t xml:space="preserve"> Dev Server</w:t>
+      </w:r>
+      <w:r>
+        <w:br/>
+        <w:t xml:space="preserve">   ↓</w:t>
+      </w:r>
+      <w:r>
+        <w:br/>
+      </w:r>
+      <w:proofErr w:type="spellStart"/>
+      <w:r>
+        <w:t>userCreation</w:t>
+      </w:r>
+      <w:proofErr w:type="spellEnd"/>
+      <w:r>
+        <w:t>() function</w:t>
+      </w:r>
+      <w:r>
+        <w:br/>
+        <w:t xml:space="preserve">   ↓</w:t>
+      </w:r>
+      <w:r>
+        <w:br/>
+      </w:r>
+      <w:proofErr w:type="spellStart"/>
+      <w:r>
+        <w:t>Prisma</w:t>
+      </w:r>
+      <w:proofErr w:type="spellEnd"/>
+      <w:r>
+        <w:br/>
+        <w:t xml:space="preserve">   ↓</w:t>
+      </w:r>
+      <w:r>
+        <w:br/>
+        <w:t>Neon Database</w:t>
+      </w:r>
+    </w:p>
+    <w:p>
+      <w:pPr>
+        <w:pStyle w:val="NormalWeb"/>
+      </w:pPr>
+      <w:r>
+        <w:lastRenderedPageBreak/>
+        <w:t>From your screenshot we can confirm:</w:t>
+      </w:r>
+    </w:p>
+    <w:p>
+      <w:pPr>
+        <w:pStyle w:val="NormalWeb"/>
+      </w:pPr>
+      <w:r>
+        <w:rPr>
+          <w:rFonts w:ascii="MS Mincho" w:eastAsia="MS Mincho" w:hAnsi="MS Mincho" w:cs="MS Mincho" w:hint="eastAsia"/>
+        </w:rPr>
+        <w:t>✔</w:t>
+      </w:r>
+      <w:r>
+        <w:t xml:space="preserve"> Clerk → </w:t>
+      </w:r>
+      <w:proofErr w:type="spellStart"/>
+      <w:r>
+        <w:t>webhook</w:t>
+      </w:r>
+      <w:proofErr w:type="spellEnd"/>
+      <w:r>
+        <w:t xml:space="preserve"> triggered</w:t>
+      </w:r>
+      <w:r>
+        <w:br/>
+      </w:r>
+      <w:r>
+        <w:rPr>
+          <w:rFonts w:ascii="MS Mincho" w:eastAsia="MS Mincho" w:hAnsi="MS Mincho" w:cs="MS Mincho" w:hint="eastAsia"/>
+        </w:rPr>
+        <w:t>✔</w:t>
+      </w:r>
+      <w:r>
+        <w:t xml:space="preserve"> </w:t>
+      </w:r>
+      <w:proofErr w:type="spellStart"/>
+      <w:r>
+        <w:t>ngrok</w:t>
+      </w:r>
+      <w:proofErr w:type="spellEnd"/>
+      <w:r>
+        <w:t xml:space="preserve"> → request received</w:t>
+      </w:r>
+      <w:r>
+        <w:br/>
+      </w:r>
+      <w:r>
+        <w:rPr>
+          <w:rFonts w:ascii="MS Mincho" w:eastAsia="MS Mincho" w:hAnsi="MS Mincho" w:cs="MS Mincho" w:hint="eastAsia"/>
+        </w:rPr>
+        <w:t>✔</w:t>
+      </w:r>
+      <w:r>
+        <w:t xml:space="preserve"> </w:t>
+      </w:r>
+      <w:proofErr w:type="spellStart"/>
+      <w:r>
+        <w:t>Inngest</w:t>
+      </w:r>
+      <w:proofErr w:type="spellEnd"/>
+      <w:r>
+        <w:t xml:space="preserve"> → synced app</w:t>
+      </w:r>
+      <w:r>
+        <w:br/>
+      </w:r>
+      <w:r>
+        <w:rPr>
+          <w:rFonts w:ascii="MS Mincho" w:eastAsia="MS Mincho" w:hAnsi="MS Mincho" w:cs="MS Mincho" w:hint="eastAsia"/>
+        </w:rPr>
+        <w:t>✔</w:t>
+      </w:r>
+      <w:r>
+        <w:t xml:space="preserve"> function executed</w:t>
+      </w:r>
+      <w:r>
+        <w:br/>
+      </w:r>
+      <w:r>
+        <w:rPr>
+          <w:rFonts w:ascii="MS Mincho" w:eastAsia="MS Mincho" w:hAnsi="MS Mincho" w:cs="MS Mincho" w:hint="eastAsia"/>
+        </w:rPr>
+        <w:t>✔</w:t>
+      </w:r>
+      <w:r>
+        <w:t xml:space="preserve"> database saved user</w:t>
+      </w:r>
+    </w:p>
+    <w:p>
+      <w:pPr>
+        <w:pStyle w:val="Heading1"/>
+      </w:pPr>
+      <w:r>
+        <w:t xml:space="preserve">So </w:t>
+      </w:r>
+      <w:r>
+        <w:rPr>
+          <w:rStyle w:val="Strong"/>
+        </w:rPr>
+        <w:t>your backend pipeline is fully working</w:t>
+      </w:r>
+      <w:r>
+        <w:t>.</w:t>
+      </w:r>
+      <w:r>
+        <w:br/>
+      </w:r>
+      <w:r>
+        <w:br/>
+      </w:r>
+      <w:r>
+        <w:br/>
+      </w:r>
+      <w:r>
+        <w:br/>
+        <w:t xml:space="preserve">Why </w:t>
+      </w:r>
+      <w:proofErr w:type="spellStart"/>
+      <w:r>
+        <w:t>ngrok</w:t>
+      </w:r>
+      <w:proofErr w:type="spellEnd"/>
+      <w:r>
+        <w:t xml:space="preserve"> was needed</w:t>
+      </w:r>
+    </w:p>
+    <w:p>
+      <w:pPr>
+        <w:pStyle w:val="NormalWeb"/>
+      </w:pPr>
+      <w:r>
+        <w:t>Clerk servers are on the internet.</w:t>
+      </w:r>
+    </w:p>
+    <w:p>
+      <w:pPr>
+        <w:pStyle w:val="NormalWeb"/>
+      </w:pPr>
+      <w:r>
+        <w:t>But your backend was running locally:</w:t>
+      </w:r>
+    </w:p>
+    <w:p>
+      <w:pPr>
+        <w:pStyle w:val="HTMLPreformatted"/>
+      </w:pPr>
+      <w:r>
+        <w:t>http://localhost:5000</w:t>
+      </w:r>
+    </w:p>
+    <w:p>
+      <w:pPr>
+        <w:pStyle w:val="NormalWeb"/>
+      </w:pPr>
+      <w:r>
+        <w:t xml:space="preserve">Clerk cannot access </w:t>
+      </w:r>
+      <w:proofErr w:type="spellStart"/>
+      <w:r>
+        <w:t>localhost</w:t>
+      </w:r>
+      <w:proofErr w:type="spellEnd"/>
+      <w:r>
+        <w:t>.</w:t>
+      </w:r>
+    </w:p>
+    <w:p>
+      <w:pPr>
+        <w:pStyle w:val="NormalWeb"/>
+      </w:pPr>
+      <w:r>
+        <w:t xml:space="preserve">So we used </w:t>
+      </w:r>
+      <w:proofErr w:type="spellStart"/>
+      <w:r>
+        <w:rPr>
+          <w:rStyle w:val="Strong"/>
+        </w:rPr>
+        <w:t>ngrok</w:t>
+      </w:r>
+      <w:proofErr w:type="spellEnd"/>
+      <w:r>
+        <w:rPr>
+          <w:rStyle w:val="Strong"/>
+        </w:rPr>
+        <w:t xml:space="preserve"> as a tunnel</w:t>
+      </w:r>
+      <w:r>
+        <w:t>:</w:t>
+      </w:r>
+    </w:p>
+    <w:p>
+      <w:pPr>
+        <w:pStyle w:val="HTMLPreformatted"/>
+      </w:pPr>
+      <w:r>
+        <w:t xml:space="preserve">Internet → </w:t>
+      </w:r>
+      <w:proofErr w:type="spellStart"/>
+      <w:r>
+        <w:t>ngrok</w:t>
+      </w:r>
+      <w:proofErr w:type="spellEnd"/>
+      <w:r>
+        <w:t xml:space="preserve"> → </w:t>
+      </w:r>
+      <w:proofErr w:type="spellStart"/>
+      <w:r>
+        <w:t>localhost</w:t>
+      </w:r>
+      <w:proofErr w:type="spellEnd"/>
+    </w:p>
+    <w:p>
+      <w:pPr>
+        <w:pStyle w:val="NormalWeb"/>
+      </w:pPr>
+      <w:r>
+        <w:t xml:space="preserve">That’s why the </w:t>
+      </w:r>
+      <w:proofErr w:type="spellStart"/>
+      <w:r>
+        <w:t>webhook</w:t>
+      </w:r>
+      <w:proofErr w:type="spellEnd"/>
+      <w:r>
+        <w:t xml:space="preserve"> worked.</w:t>
+      </w:r>
+    </w:p>
+    <w:p>
+      <w:pPr>
+        <w:pStyle w:val="Heading1"/>
+      </w:pPr>
+      <w:r>
+        <w:br/>
+      </w:r>
+      <w:r>
+        <w:br/>
+      </w:r>
+      <w:r>
+        <w:br/>
+        <w:t xml:space="preserve">What changes after deployment to </w:t>
+      </w:r>
+      <w:proofErr w:type="spellStart"/>
+      <w:r>
+        <w:t>Vercel</w:t>
+      </w:r>
+      <w:proofErr w:type="spellEnd"/>
+    </w:p>
+    <w:p>
+      <w:pPr>
+        <w:pStyle w:val="NormalWeb"/>
+      </w:pPr>
+      <w:r>
+        <w:t xml:space="preserve">When you deploy backend to </w:t>
+      </w:r>
+      <w:proofErr w:type="spellStart"/>
+      <w:r>
+        <w:t>Vercel</w:t>
+      </w:r>
+      <w:proofErr w:type="spellEnd"/>
+      <w:r>
+        <w:t xml:space="preserve">, your server will have a </w:t>
+      </w:r>
+      <w:r>
+        <w:rPr>
+          <w:rStyle w:val="Strong"/>
+        </w:rPr>
+        <w:t>real public URL</w:t>
+      </w:r>
+      <w:r>
+        <w:t>.</w:t>
+      </w:r>
+    </w:p>
+    <w:p>
+      <w:pPr>
+        <w:pStyle w:val="NormalWeb"/>
+      </w:pPr>
+      <w:r>
+        <w:t>Example:</w:t>
+      </w:r>
+    </w:p>
+    <w:p>
+      <w:pPr>
+        <w:pStyle w:val="HTMLPreformatted"/>
+      </w:pPr>
+      <w:r>
+        <w:t>https://project-management-backend.vercel.app</w:t>
+      </w:r>
+    </w:p>
+    <w:p>
+      <w:pPr>
+        <w:pStyle w:val="NormalWeb"/>
+      </w:pPr>
+      <w:r>
+        <w:t xml:space="preserve">Now Clerk can call it </w:t>
+      </w:r>
+      <w:r>
+        <w:rPr>
+          <w:rStyle w:val="Strong"/>
+        </w:rPr>
+        <w:t>directly</w:t>
+      </w:r>
+      <w:r>
+        <w:t>.</w:t>
+      </w:r>
+    </w:p>
+    <w:p>
+      <w:pPr>
+        <w:pStyle w:val="NormalWeb"/>
+      </w:pPr>
+      <w:r>
+        <w:t>So the flow becomes:</w:t>
+      </w:r>
+    </w:p>
+    <w:p>
+      <w:pPr>
+        <w:pStyle w:val="HTMLPreformatted"/>
+      </w:pPr>
+      <w:r>
+        <w:t>Clerk</w:t>
+      </w:r>
+      <w:r>
+        <w:br/>
+        <w:t xml:space="preserve">   ↓</w:t>
+      </w:r>
+      <w:r>
+        <w:br/>
+      </w:r>
+      <w:proofErr w:type="spellStart"/>
+      <w:r>
+        <w:t>Webhook</w:t>
+      </w:r>
+      <w:proofErr w:type="spellEnd"/>
+      <w:r>
+        <w:br/>
+        <w:t xml:space="preserve">   ↓</w:t>
+      </w:r>
+      <w:r>
+        <w:br/>
+        <w:t>https://your-backend.vercel.app/api/webhooks/clerk</w:t>
+      </w:r>
+      <w:r>
+        <w:br/>
+        <w:t xml:space="preserve">   ↓</w:t>
+      </w:r>
+      <w:r>
+        <w:br/>
+      </w:r>
+      <w:r>
+        <w:lastRenderedPageBreak/>
+        <w:t>Express /</w:t>
+      </w:r>
+      <w:proofErr w:type="spellStart"/>
+      <w:r>
+        <w:t>api</w:t>
+      </w:r>
+      <w:proofErr w:type="spellEnd"/>
+      <w:r>
+        <w:t>/</w:t>
+      </w:r>
+      <w:proofErr w:type="spellStart"/>
+      <w:r>
+        <w:t>webhooks</w:t>
+      </w:r>
+      <w:proofErr w:type="spellEnd"/>
+      <w:r>
+        <w:t>/clerk</w:t>
+      </w:r>
+      <w:r>
+        <w:br/>
+        <w:t xml:space="preserve">   ↓</w:t>
+      </w:r>
+      <w:r>
+        <w:br/>
+      </w:r>
+      <w:proofErr w:type="spellStart"/>
+      <w:r>
+        <w:t>Inngest</w:t>
+      </w:r>
+      <w:proofErr w:type="spellEnd"/>
+      <w:r>
+        <w:br/>
+        <w:t xml:space="preserve">   ↓</w:t>
+      </w:r>
+      <w:r>
+        <w:br/>
+      </w:r>
+      <w:proofErr w:type="spellStart"/>
+      <w:r>
+        <w:t>Prisma</w:t>
+      </w:r>
+      <w:proofErr w:type="spellEnd"/>
+      <w:r>
+        <w:br/>
+        <w:t xml:space="preserve">   ↓</w:t>
+      </w:r>
+      <w:r>
+        <w:br/>
+        <w:t>Neon</w:t>
+      </w:r>
+    </w:p>
+    <w:p>
+      <w:pPr>
+        <w:pStyle w:val="NormalWeb"/>
+      </w:pPr>
+      <w:r>
+        <w:t xml:space="preserve">So </w:t>
+      </w:r>
+      <w:proofErr w:type="spellStart"/>
+      <w:r>
+        <w:rPr>
+          <w:rStyle w:val="Strong"/>
+        </w:rPr>
+        <w:t>ngrok</w:t>
+      </w:r>
+      <w:proofErr w:type="spellEnd"/>
+      <w:r>
+        <w:rPr>
+          <w:rStyle w:val="Strong"/>
+        </w:rPr>
+        <w:t xml:space="preserve"> is no longer needed</w:t>
+      </w:r>
+      <w:r>
+        <w:t>.</w:t>
+      </w:r>
+    </w:p>
+    <w:p>
+      <w:pPr>
+        <w:pStyle w:val="Heading1"/>
+      </w:pPr>
+      <w:r>
+        <w:br/>
+      </w:r>
+      <w:r>
+        <w:br/>
+      </w:r>
+      <w:r>
+        <w:br/>
+        <w:t xml:space="preserve">Where exactly you change the </w:t>
+      </w:r>
+      <w:proofErr w:type="spellStart"/>
+      <w:r>
+        <w:t>webhook</w:t>
+      </w:r>
+      <w:proofErr w:type="spellEnd"/>
+      <w:r>
+        <w:t xml:space="preserve"> URL</w:t>
+      </w:r>
+    </w:p>
+    <w:p>
+      <w:pPr>
+        <w:pStyle w:val="NormalWeb"/>
+      </w:pPr>
+      <w:r>
+        <w:t>Go to:</w:t>
+      </w:r>
+    </w:p>
+    <w:p>
+      <w:pPr>
+        <w:pStyle w:val="HTMLPreformatted"/>
+      </w:pPr>
+      <w:r>
+        <w:t>Clerk Dashboard</w:t>
+      </w:r>
+      <w:r>
+        <w:br/>
+        <w:t xml:space="preserve"> → </w:t>
+      </w:r>
+      <w:proofErr w:type="spellStart"/>
+      <w:r>
+        <w:t>Webhooks</w:t>
+      </w:r>
+      <w:proofErr w:type="spellEnd"/>
+    </w:p>
+    <w:p>
+      <w:pPr>
+        <w:pStyle w:val="NormalWeb"/>
+      </w:pPr>
+      <w:r>
+        <w:t>You currently have:</w:t>
+      </w:r>
+    </w:p>
+    <w:p>
+      <w:pPr>
+        <w:pStyle w:val="HTMLPreformatted"/>
+      </w:pPr>
+      <w:r>
+        <w:t>https://janna-blastoporic-dylan.ngrok-free.dev/api/webhooks/clerk</w:t>
+      </w:r>
+    </w:p>
+    <w:p>
+      <w:pPr>
+        <w:pStyle w:val="NormalWeb"/>
+      </w:pPr>
+      <w:r>
+        <w:t>After deployment change it to:</w:t>
+      </w:r>
+    </w:p>
+    <w:p>
+      <w:pPr>
+        <w:pStyle w:val="HTMLPreformatted"/>
+      </w:pPr>
+      <w:r>
+        <w:t>https://your-backend.vercel.app/api/webhooks/clerk</w:t>
+      </w:r>
+    </w:p>
+    <w:p>
+      <w:pPr>
+        <w:pStyle w:val="NormalWeb"/>
+      </w:pPr>
+      <w:r>
+        <w:t xml:space="preserve">That is the </w:t>
+      </w:r>
+      <w:r>
+        <w:rPr>
+          <w:rStyle w:val="Strong"/>
+        </w:rPr>
+        <w:t>only change required</w:t>
+      </w:r>
+      <w:r>
+        <w:t>.</w:t>
+      </w:r>
+    </w:p>
+    <w:p>
+      <w:pPr>
+        <w:pStyle w:val="NormalWeb"/>
+      </w:pPr>
+      <w:r>
+        <w:t xml:space="preserve">Your backend code </w:t>
+      </w:r>
+      <w:r>
+        <w:rPr>
+          <w:rStyle w:val="Strong"/>
+        </w:rPr>
+        <w:t>does not change</w:t>
+      </w:r>
+      <w:r>
+        <w:t>.</w:t>
+      </w:r>
+    </w:p>
+    <w:p>
+      <w:pPr>
+        <w:pStyle w:val="Heading1"/>
+      </w:pPr>
+      <w:r>
+        <w:br/>
+      </w:r>
+      <w:r>
+        <w:br/>
+      </w:r>
+      <w:r>
+        <w:br/>
+        <w:t xml:space="preserve">What changes in </w:t>
+      </w:r>
+      <w:proofErr w:type="spellStart"/>
+      <w:r>
+        <w:t>Inngest</w:t>
+      </w:r>
+      <w:proofErr w:type="spellEnd"/>
+      <w:r>
+        <w:t xml:space="preserve"> after deployment</w:t>
+      </w:r>
+    </w:p>
+    <w:p>
+      <w:pPr>
+        <w:pStyle w:val="NormalWeb"/>
+      </w:pPr>
+      <w:r>
+        <w:t xml:space="preserve">Right now </w:t>
+      </w:r>
+      <w:proofErr w:type="spellStart"/>
+      <w:r>
+        <w:t>Inngest</w:t>
+      </w:r>
+      <w:proofErr w:type="spellEnd"/>
+      <w:r>
+        <w:t xml:space="preserve"> synced your </w:t>
+      </w:r>
+      <w:r>
+        <w:rPr>
+          <w:rStyle w:val="Strong"/>
+        </w:rPr>
+        <w:t>local server</w:t>
+      </w:r>
+      <w:r>
+        <w:t>:</w:t>
+      </w:r>
+    </w:p>
+    <w:p>
+      <w:pPr>
+        <w:pStyle w:val="HTMLPreformatted"/>
+      </w:pPr>
+      <w:r>
+        <w:t>http://localhost:5000/api/inngest</w:t>
+      </w:r>
+    </w:p>
+    <w:p>
+      <w:pPr>
+        <w:pStyle w:val="NormalWeb"/>
+      </w:pPr>
+      <w:r>
+        <w:t>You saw that in your screenshot:</w:t>
+      </w:r>
+    </w:p>
+    <w:p>
+      <w:pPr>
+        <w:pStyle w:val="HTMLPreformatted"/>
+      </w:pPr>
+      <w:r>
+        <w:t>project-management</w:t>
+      </w:r>
+      <w:r>
+        <w:br/>
+        <w:t>http://localhost:5000/api/inngest</w:t>
+      </w:r>
+    </w:p>
+    <w:p>
+      <w:pPr>
+        <w:pStyle w:val="NormalWeb"/>
+      </w:pPr>
+      <w:r>
+        <w:t>After deployment you must run:</w:t>
+      </w:r>
+    </w:p>
+    <w:p>
+      <w:pPr>
+        <w:pStyle w:val="HTMLPreformatted"/>
+      </w:pPr>
+      <w:proofErr w:type="spellStart"/>
+      <w:r>
+        <w:t>npx</w:t>
+      </w:r>
+      <w:proofErr w:type="spellEnd"/>
+      <w:r>
+        <w:t xml:space="preserve"> </w:t>
+      </w:r>
+      <w:proofErr w:type="spellStart"/>
+      <w:r>
+        <w:t>inngest-cli</w:t>
+      </w:r>
+      <w:proofErr w:type="spellEnd"/>
+      <w:r>
+        <w:t xml:space="preserve"> dev -u https://your-backend.vercel.app/api/inngest</w:t>
+      </w:r>
+    </w:p>
+    <w:p>
+      <w:pPr>
+        <w:pStyle w:val="NormalWeb"/>
+      </w:pPr>
+      <w:r>
+        <w:t xml:space="preserve">Then </w:t>
+      </w:r>
+      <w:proofErr w:type="spellStart"/>
+      <w:r>
+        <w:t>Inngest</w:t>
+      </w:r>
+      <w:proofErr w:type="spellEnd"/>
+      <w:r>
+        <w:t xml:space="preserve"> will sync the </w:t>
+      </w:r>
+      <w:r>
+        <w:rPr>
+          <w:rStyle w:val="Strong"/>
+        </w:rPr>
+        <w:t>production endpoint</w:t>
+      </w:r>
+      <w:r>
+        <w:t>.</w:t>
+      </w:r>
+    </w:p>
+    <w:p>
+      <w:pPr>
+        <w:pStyle w:val="Heading1"/>
+      </w:pPr>
+      <w:r>
+        <w:lastRenderedPageBreak/>
+        <w:br/>
+        <w:t>Correct production architecture</w:t>
+      </w:r>
+    </w:p>
+    <w:p>
+      <w:pPr>
+        <w:pStyle w:val="NormalWeb"/>
+      </w:pPr>
+      <w:r>
+        <w:t>After deployment it becomes:</w:t>
+      </w:r>
+    </w:p>
+    <w:p>
+      <w:pPr>
+        <w:pStyle w:val="HTMLPreformatted"/>
+      </w:pPr>
+      <w:r>
+        <w:t>Frontend (React + Clerk)</w:t>
+      </w:r>
+      <w:r>
+        <w:br/>
+        <w:t xml:space="preserve">        ↓</w:t>
+      </w:r>
+      <w:r>
+        <w:br/>
+        <w:t>Clerk Auth</w:t>
+      </w:r>
+      <w:r>
+        <w:br/>
+        <w:t xml:space="preserve">        ↓</w:t>
+      </w:r>
+      <w:r>
+        <w:br/>
+        <w:t xml:space="preserve">Clerk </w:t>
+      </w:r>
+      <w:proofErr w:type="spellStart"/>
+      <w:r>
+        <w:t>Webhook</w:t>
+      </w:r>
+      <w:proofErr w:type="spellEnd"/>
+      <w:r>
+        <w:br/>
+        <w:t xml:space="preserve">        ↓</w:t>
+      </w:r>
+      <w:r>
+        <w:br/>
+      </w:r>
+      <w:proofErr w:type="spellStart"/>
+      <w:r>
+        <w:t>Vercel</w:t>
+      </w:r>
+      <w:proofErr w:type="spellEnd"/>
+      <w:r>
+        <w:t xml:space="preserve"> Backend</w:t>
+      </w:r>
+      <w:r>
+        <w:br/>
+        <w:t>/</w:t>
+      </w:r>
+      <w:proofErr w:type="spellStart"/>
+      <w:r>
+        <w:t>api</w:t>
+      </w:r>
+      <w:proofErr w:type="spellEnd"/>
+      <w:r>
+        <w:t>/</w:t>
+      </w:r>
+      <w:proofErr w:type="spellStart"/>
+      <w:r>
+        <w:t>webhooks</w:t>
+      </w:r>
+      <w:proofErr w:type="spellEnd"/>
+      <w:r>
+        <w:t>/clerk</w:t>
+      </w:r>
+      <w:r>
+        <w:br/>
+        <w:t xml:space="preserve">        ↓</w:t>
+      </w:r>
+      <w:r>
+        <w:br/>
+      </w:r>
+      <w:proofErr w:type="spellStart"/>
+      <w:r>
+        <w:t>Inngest</w:t>
+      </w:r>
+      <w:proofErr w:type="spellEnd"/>
+      <w:r>
+        <w:t xml:space="preserve"> Event Bus</w:t>
+      </w:r>
+      <w:r>
+        <w:br/>
+        <w:t xml:space="preserve">        ↓</w:t>
+      </w:r>
+      <w:r>
+        <w:br/>
+      </w:r>
+      <w:proofErr w:type="spellStart"/>
+      <w:r>
+        <w:t>Inngest</w:t>
+      </w:r>
+      <w:proofErr w:type="spellEnd"/>
+      <w:r>
+        <w:t xml:space="preserve"> Functions</w:t>
+      </w:r>
+      <w:r>
+        <w:br/>
+        <w:t xml:space="preserve">        ↓</w:t>
+      </w:r>
+      <w:r>
+        <w:br/>
+      </w:r>
+      <w:proofErr w:type="spellStart"/>
+      <w:r>
+        <w:t>Prisma</w:t>
+      </w:r>
+      <w:proofErr w:type="spellEnd"/>
+      <w:r>
+        <w:br/>
+        <w:t xml:space="preserve">        ↓</w:t>
+      </w:r>
+      <w:r>
+        <w:br/>
+        <w:t xml:space="preserve">Neon </w:t>
+      </w:r>
+      <w:proofErr w:type="spellStart"/>
+      <w:r>
+        <w:t>PostgreSQL</w:t>
+      </w:r>
+      <w:proofErr w:type="spellEnd"/>
+    </w:p>
+    <w:p>
+      <w:pPr>
+        <w:pStyle w:val="NormalWeb"/>
+      </w:pPr>
+      <w:r>
+        <w:t xml:space="preserve">This is </w:t>
+      </w:r>
+      <w:r>
+        <w:rPr>
+          <w:rStyle w:val="Strong"/>
+        </w:rPr>
+        <w:t xml:space="preserve">exactly how </w:t>
+      </w:r>
+      <w:proofErr w:type="spellStart"/>
+      <w:r>
+        <w:rPr>
+          <w:rStyle w:val="Strong"/>
+        </w:rPr>
+        <w:t>SaaS</w:t>
+      </w:r>
+      <w:proofErr w:type="spellEnd"/>
+      <w:r>
+        <w:rPr>
+          <w:rStyle w:val="Strong"/>
+        </w:rPr>
+        <w:t xml:space="preserve"> apps work</w:t>
+      </w:r>
+      <w:r>
+        <w:t>.</w:t>
+      </w:r>
+    </w:p>
+    <w:p>
+      <w:pPr>
+        <w:pStyle w:val="Heading2"/>
+      </w:pPr>
+      <w:r>
+        <w:br/>
+      </w:r>
+      <w:r>
+        <w:br/>
+      </w:r>
+      <w:r>
+        <w:br/>
+      </w:r>
+      <w:r>
+        <w:br/>
+      </w:r>
+      <w:r>
+        <w:t xml:space="preserve">Restart </w:t>
+      </w:r>
+      <w:proofErr w:type="spellStart"/>
+      <w:r>
+        <w:t>Inngest</w:t>
+      </w:r>
+      <w:proofErr w:type="spellEnd"/>
+      <w:r>
+        <w:t xml:space="preserve"> Dev Server (IMPORTANT)</w:t>
+      </w:r>
+    </w:p>
+    <w:p>
+      <w:pPr>
+        <w:spacing w:before="100" w:beforeAutospacing="1" w:after="100" w:afterAutospacing="1" w:line="240" w:lineRule="auto"/>
+        <w:rPr>
+          <w:rFonts w:ascii="Times New Roman" w:eastAsia="Times New Roman" w:hAnsi="Times New Roman" w:cs="Times New Roman"/>
+          <w:sz w:val="24"/>
+          <w:szCs w:val="24"/>
+        </w:rPr>
+      </w:pPr>
+      <w:r>
+        <w:rPr>
+          <w:rFonts w:ascii="Times New Roman" w:eastAsia="Times New Roman" w:hAnsi="Times New Roman" w:cs="Times New Roman"/>
+          <w:sz w:val="24"/>
+          <w:szCs w:val="24"/>
+        </w:rPr>
+        <w:t xml:space="preserve">Run this </w:t>
+      </w:r>
+      <w:r>
+        <w:rPr>
+          <w:rFonts w:ascii="Times New Roman" w:eastAsia="Times New Roman" w:hAnsi="Times New Roman" w:cs="Times New Roman"/>
+          <w:b/>
+          <w:bCs/>
+          <w:sz w:val="24"/>
+          <w:szCs w:val="24"/>
+        </w:rPr>
+        <w:t>from backend folder</w:t>
+      </w:r>
+      <w:r>
+        <w:rPr>
+          <w:rFonts w:ascii="Times New Roman" w:eastAsia="Times New Roman" w:hAnsi="Times New Roman" w:cs="Times New Roman"/>
+          <w:sz w:val="24"/>
+          <w:szCs w:val="24"/>
+        </w:rPr>
+        <w:t>:</w:t>
+      </w:r>
+    </w:p>
+    <w:p>
+      <w:pPr>
+        <w:tabs>
+          <w:tab w:val="left" w:pos="916"/>
+          <w:tab w:val="left" w:pos="1832"/>
+          <w:tab w:val="left" w:pos="2748"/>
+          <w:tab w:val="left" w:pos="3664"/>
+          <w:tab w:val="left" w:pos="4580"/>
+          <w:tab w:val="left" w:pos="5496"/>
+          <w:tab w:val="left" w:pos="6412"/>
+          <w:tab w:val="left" w:pos="7328"/>
+          <w:tab w:val="left" w:pos="8244"/>
+          <w:tab w:val="left" w:pos="9160"/>
+          <w:tab w:val="left" w:pos="10076"/>
+          <w:tab w:val="left" w:pos="10992"/>
+          <w:tab w:val="left" w:pos="11908"/>
+          <w:tab w:val="left" w:pos="12824"/>
+          <w:tab w:val="left" w:pos="13740"/>
+          <w:tab w:val="left" w:pos="14656"/>
+        </w:tabs>
+        <w:spacing w:after="0" w:line="240" w:lineRule="auto"/>
+        <w:rPr>
+          <w:rFonts w:ascii="Courier New" w:eastAsia="Times New Roman" w:hAnsi="Courier New" w:cs="Courier New"/>
+          <w:sz w:val="20"/>
+          <w:szCs w:val="20"/>
+        </w:rPr>
+      </w:pPr>
+      <w:proofErr w:type="spellStart"/>
+      <w:r>
+        <w:rPr>
+          <w:rFonts w:ascii="Courier New" w:eastAsia="Times New Roman" w:hAnsi="Courier New" w:cs="Courier New"/>
+          <w:sz w:val="20"/>
+          <w:szCs w:val="20"/>
+        </w:rPr>
+        <w:t>npx</w:t>
+      </w:r>
+      <w:proofErr w:type="spellEnd"/>
+      <w:r>
+        <w:rPr>
+          <w:rFonts w:ascii="Courier New" w:eastAsia="Times New Roman" w:hAnsi="Courier New" w:cs="Courier New"/>
+          <w:sz w:val="20"/>
+          <w:szCs w:val="20"/>
+        </w:rPr>
+        <w:t xml:space="preserve"> </w:t>
+      </w:r>
+      <w:proofErr w:type="spellStart"/>
+      <w:r>
+        <w:rPr>
+          <w:rFonts w:ascii="Courier New" w:eastAsia="Times New Roman" w:hAnsi="Courier New" w:cs="Courier New"/>
+          <w:sz w:val="20"/>
+          <w:szCs w:val="20"/>
+        </w:rPr>
+        <w:t>inngest-cli@latest</w:t>
+      </w:r>
+      <w:proofErr w:type="spellEnd"/>
+      <w:r>
+        <w:rPr>
+          <w:rFonts w:ascii="Courier New" w:eastAsia="Times New Roman" w:hAnsi="Courier New" w:cs="Courier New"/>
+          <w:sz w:val="20"/>
+          <w:szCs w:val="20"/>
+        </w:rPr>
+        <w:t xml:space="preserve"> dev -u http://localhost:5000/api/inngest</w:t>
+      </w:r>
+    </w:p>
+    <w:p>
+      <w:pPr>
+        <w:spacing w:before="100" w:beforeAutospacing="1" w:after="100" w:afterAutospacing="1" w:line="240" w:lineRule="auto"/>
+        <w:rPr>
+          <w:rFonts w:ascii="Times New Roman" w:eastAsia="Times New Roman" w:hAnsi="Times New Roman" w:cs="Times New Roman"/>
+          <w:sz w:val="24"/>
+          <w:szCs w:val="24"/>
+        </w:rPr>
+      </w:pPr>
+      <w:r>
+        <w:rPr>
+          <w:rFonts w:ascii="Times New Roman" w:eastAsia="Times New Roman" w:hAnsi="Times New Roman" w:cs="Times New Roman"/>
+          <w:sz w:val="24"/>
+          <w:szCs w:val="24"/>
+        </w:rPr>
+        <w:t xml:space="preserve">This </w:t>
+      </w:r>
+      <w:r>
+        <w:rPr>
+          <w:rFonts w:ascii="Courier New" w:eastAsia="Times New Roman" w:hAnsi="Courier New" w:cs="Courier New"/>
+          <w:sz w:val="20"/>
+        </w:rPr>
+        <w:t>-u</w:t>
+      </w:r>
+      <w:r>
+        <w:rPr>
+          <w:rFonts w:ascii="Times New Roman" w:eastAsia="Times New Roman" w:hAnsi="Times New Roman" w:cs="Times New Roman"/>
+          <w:sz w:val="24"/>
+          <w:szCs w:val="24"/>
+        </w:rPr>
+        <w:t xml:space="preserve"> flag is </w:t>
+      </w:r>
+      <w:r>
+        <w:rPr>
+          <w:rFonts w:ascii="Times New Roman" w:eastAsia="Times New Roman" w:hAnsi="Times New Roman" w:cs="Times New Roman"/>
+          <w:b/>
+          <w:bCs/>
+          <w:sz w:val="24"/>
+          <w:szCs w:val="24"/>
+        </w:rPr>
+        <w:t>VERY important</w:t>
+      </w:r>
+      <w:r>
+        <w:rPr>
+          <w:rFonts w:ascii="Times New Roman" w:eastAsia="Times New Roman" w:hAnsi="Times New Roman" w:cs="Times New Roman"/>
+          <w:sz w:val="24"/>
+          <w:szCs w:val="24"/>
+        </w:rPr>
+        <w:t>.</w:t>
+      </w:r>
+    </w:p>
+    <w:p>
+      <w:pPr>
+        <w:spacing w:before="100" w:beforeAutospacing="1" w:after="100" w:afterAutospacing="1" w:line="240" w:lineRule="auto"/>
+        <w:rPr>
+          <w:rFonts w:ascii="Times New Roman" w:eastAsia="Times New Roman" w:hAnsi="Times New Roman" w:cs="Times New Roman"/>
+          <w:sz w:val="24"/>
+          <w:szCs w:val="24"/>
+        </w:rPr>
+      </w:pPr>
+      <w:r>
+        <w:rPr>
+          <w:rFonts w:ascii="Times New Roman" w:eastAsia="Times New Roman" w:hAnsi="Times New Roman" w:cs="Times New Roman"/>
+          <w:sz w:val="24"/>
+          <w:szCs w:val="24"/>
+        </w:rPr>
+        <w:t xml:space="preserve">It tells </w:t>
+      </w:r>
+      <w:proofErr w:type="spellStart"/>
+      <w:r>
+        <w:rPr>
+          <w:rFonts w:ascii="Times New Roman" w:eastAsia="Times New Roman" w:hAnsi="Times New Roman" w:cs="Times New Roman"/>
+          <w:sz w:val="24"/>
+          <w:szCs w:val="24"/>
+        </w:rPr>
+        <w:t>Inngest</w:t>
+      </w:r>
+      <w:proofErr w:type="spellEnd"/>
+      <w:r>
+        <w:rPr>
+          <w:rFonts w:ascii="Times New Roman" w:eastAsia="Times New Roman" w:hAnsi="Times New Roman" w:cs="Times New Roman"/>
+          <w:sz w:val="24"/>
+          <w:szCs w:val="24"/>
+        </w:rPr>
+        <w:t xml:space="preserve"> where your functions are.</w:t>
+      </w:r>
+    </w:p>
+    <w:p>
+      <w:pPr>
+        <w:spacing w:before="100" w:beforeAutospacing="1" w:after="100" w:afterAutospacing="1" w:line="240" w:lineRule="auto"/>
+        <w:rPr>
+          <w:rFonts w:ascii="Times New Roman" w:eastAsia="Times New Roman" w:hAnsi="Times New Roman" w:cs="Times New Roman"/>
+          <w:sz w:val="24"/>
+          <w:szCs w:val="24"/>
+        </w:rPr>
+      </w:pPr>
+      <w:r>
+        <w:rPr>
+          <w:rFonts w:ascii="Times New Roman" w:eastAsia="Times New Roman" w:hAnsi="Times New Roman" w:cs="Times New Roman"/>
+          <w:sz w:val="24"/>
+          <w:szCs w:val="24"/>
+        </w:rPr>
+        <w:t>You should see something like:</w:t>
+      </w:r>
+    </w:p>
+    <w:p>
+      <w:pPr>
+        <w:tabs>
+          <w:tab w:val="left" w:pos="916"/>
+          <w:tab w:val="left" w:pos="1832"/>
+          <w:tab w:val="left" w:pos="2748"/>
+          <w:tab w:val="left" w:pos="3664"/>
+          <w:tab w:val="left" w:pos="4580"/>
+          <w:tab w:val="left" w:pos="5496"/>
+          <w:tab w:val="left" w:pos="6412"/>
+          <w:tab w:val="left" w:pos="7328"/>
+          <w:tab w:val="left" w:pos="8244"/>
+          <w:tab w:val="left" w:pos="9160"/>
+          <w:tab w:val="left" w:pos="10076"/>
+          <w:tab w:val="left" w:pos="10992"/>
+          <w:tab w:val="left" w:pos="11908"/>
+          <w:tab w:val="left" w:pos="12824"/>
+          <w:tab w:val="left" w:pos="13740"/>
+          <w:tab w:val="left" w:pos="14656"/>
+        </w:tabs>
+        <w:spacing w:after="0" w:line="240" w:lineRule="auto"/>
+        <w:rPr>
+          <w:rFonts w:ascii="Courier New" w:eastAsia="Times New Roman" w:hAnsi="Courier New" w:cs="Courier New"/>
+          <w:sz w:val="20"/>
+          <w:szCs w:val="20"/>
+        </w:rPr>
+      </w:pPr>
+      <w:r>
+        <w:rPr>
+          <w:rFonts w:ascii="MS Mincho" w:eastAsia="MS Mincho" w:hAnsi="MS Mincho" w:cs="MS Mincho" w:hint="eastAsia"/>
+          <w:sz w:val="20"/>
+          <w:szCs w:val="20"/>
+        </w:rPr>
+        <w:t>✔</w:t>
+      </w:r>
+      <w:r>
+        <w:rPr>
+          <w:rFonts w:ascii="Courier New" w:eastAsia="Times New Roman" w:hAnsi="Courier New" w:cs="Courier New"/>
+          <w:sz w:val="20"/>
+          <w:szCs w:val="20"/>
+        </w:rPr>
+        <w:t xml:space="preserve"> Connected to http://localhost:5000/api/inngest</w:t>
+      </w:r>
+      <w:r>
+        <w:rPr>
+          <w:rFonts w:ascii="Courier New" w:eastAsia="Times New Roman" w:hAnsi="Courier New" w:cs="Courier New"/>
+          <w:sz w:val="20"/>
+          <w:szCs w:val="20"/>
+        </w:rPr>
+        <w:br/>
+      </w:r>
+      <w:r>
+        <w:rPr>
+          <w:rFonts w:ascii="MS Mincho" w:eastAsia="MS Mincho" w:hAnsi="MS Mincho" w:cs="MS Mincho" w:hint="eastAsia"/>
+          <w:sz w:val="20"/>
+          <w:szCs w:val="20"/>
+        </w:rPr>
+        <w:t>✔</w:t>
+      </w:r>
+      <w:r>
+        <w:rPr>
+          <w:rFonts w:ascii="Courier New" w:eastAsia="Times New Roman" w:hAnsi="Courier New" w:cs="Courier New"/>
+          <w:sz w:val="20"/>
+          <w:szCs w:val="20"/>
+        </w:rPr>
+        <w:t xml:space="preserve"> Discovered 3 functions</w:t>
+      </w:r>
+    </w:p>
+    <w:p>
+      <w:pPr>
+        <w:spacing w:before="100" w:beforeAutospacing="1" w:after="100" w:afterAutospacing="1" w:line="240" w:lineRule="auto"/>
+        <w:rPr>
+          <w:rFonts w:ascii="Times New Roman" w:eastAsia="Times New Roman" w:hAnsi="Times New Roman" w:cs="Times New Roman"/>
+          <w:sz w:val="24"/>
+          <w:szCs w:val="24"/>
+        </w:rPr>
+      </w:pPr>
+      <w:r>
+        <w:rPr>
+          <w:rFonts w:ascii="Times New Roman" w:eastAsia="Times New Roman" w:hAnsi="Times New Roman" w:cs="Times New Roman"/>
+          <w:sz w:val="24"/>
+          <w:szCs w:val="24"/>
+        </w:rPr>
+        <w:t>Those 3 should be:</w:t>
+      </w:r>
+    </w:p>
+    <w:p>
+      <w:pPr>
+        <w:tabs>
+          <w:tab w:val="left" w:pos="916"/>
+          <w:tab w:val="left" w:pos="1832"/>
+          <w:tab w:val="left" w:pos="2748"/>
+          <w:tab w:val="left" w:pos="3664"/>
+          <w:tab w:val="left" w:pos="4580"/>
+          <w:tab w:val="left" w:pos="5496"/>
+          <w:tab w:val="left" w:pos="6412"/>
+          <w:tab w:val="left" w:pos="7328"/>
+          <w:tab w:val="left" w:pos="8244"/>
+          <w:tab w:val="left" w:pos="9160"/>
+          <w:tab w:val="left" w:pos="10076"/>
+          <w:tab w:val="left" w:pos="10992"/>
+          <w:tab w:val="left" w:pos="11908"/>
+          <w:tab w:val="left" w:pos="12824"/>
+          <w:tab w:val="left" w:pos="13740"/>
+          <w:tab w:val="left" w:pos="14656"/>
+        </w:tabs>
+        <w:spacing w:after="0" w:line="240" w:lineRule="auto"/>
+        <w:rPr>
+          <w:rFonts w:ascii="Courier New" w:eastAsia="Times New Roman" w:hAnsi="Courier New" w:cs="Courier New"/>
+          <w:sz w:val="20"/>
+          <w:szCs w:val="20"/>
+        </w:rPr>
+      </w:pPr>
+      <w:r>
+        <w:rPr>
+          <w:rFonts w:ascii="Courier New" w:eastAsia="Times New Roman" w:hAnsi="Courier New" w:cs="Courier New"/>
+          <w:sz w:val="20"/>
+          <w:szCs w:val="20"/>
+        </w:rPr>
+        <w:t>clerk-user-created</w:t>
+      </w:r>
+      <w:r>
+        <w:rPr>
+          <w:rFonts w:ascii="Courier New" w:eastAsia="Times New Roman" w:hAnsi="Courier New" w:cs="Courier New"/>
+          <w:sz w:val="20"/>
+          <w:szCs w:val="20"/>
+        </w:rPr>
+        <w:br/>
+        <w:t>clerk-user-updated</w:t>
+      </w:r>
+      <w:r>
+        <w:rPr>
+          <w:rFonts w:ascii="Courier New" w:eastAsia="Times New Roman" w:hAnsi="Courier New" w:cs="Courier New"/>
+          <w:sz w:val="20"/>
+          <w:szCs w:val="20"/>
+        </w:rPr>
+        <w:br/>
+        <w:t>clerk-user-deleted</w:t>
+      </w:r>
+    </w:p>
+    <w:p>
+      <w:pPr>
+        <w:pStyle w:val="NormalWeb"/>
+      </w:pPr>
+    </w:p>
+    <w:p>
+      <w:pPr>
+        <w:rPr>
+          <w:rFonts w:ascii="Cambria" w:hAnsi="Cambria"/>
+        </w:rPr>
+      </w:pPr>
+      <w:r>
+        <w:rPr>
+          <w:rFonts w:ascii="Cambria" w:hAnsi="Cambria"/>
+        </w:rPr>
+        <w:lastRenderedPageBreak/>
+        <w:br/>
+      </w:r>
+      <w:r>
+        <w:rPr>
+          <w:rFonts w:ascii="Cambria" w:hAnsi="Cambria"/>
+        </w:rPr>
+        <w:br/>
+      </w:r>
     </w:p>
     <w:sectPr>
       <w:pgSz w:w="12240" w:h="15840" w:code="1"/>
@@ -29146,6 +30216,11 @@
     <w:basedOn w:val="DefaultParagraphFont"/>
     <w:rsid w:val="00E06097"/>
   </w:style>
+  <w:style w:type="character" w:customStyle="1" w:styleId="u">
+    <w:name w:val="ͼu"/>
+    <w:basedOn w:val="DefaultParagraphFont"/>
+    <w:rsid w:val="00C10EEA"/>
+  </w:style>
 </w:styles>
 </file>
 

</xml_diff>